<commit_message>
German Part 2: top up episode 24; add PDF versions
Co-Authored-By: Claude Sonnet 5.5 <noreply@anthropic.com>
Claude-Session: https://claude.ai/code/session_0122DR5hMtGscXEbtr8Pz4Xq
</commit_message>
<xml_diff>
--- a/문장별_해설/2부_24화_Rad_und_Recht_öffnet_die_Tür_해설.docx
+++ b/문장별_해설/2부_24화_Rad_und_Recht_öffnet_die_Tür_해설.docx
@@ -26,7 +26,7 @@
           <w:color w:val="595959"/>
           <w:sz w:val="20"/>
         </w:rPr>
-        <w:t>대화문 68턴 — 문장별 주요 단어 · 문법 · 표현 · 시제 해설</w:t>
+        <w:t>대화문 83턴 — 문장별 주요 단어 · 문법 · 표현 · 시제 해설</w:t>
       </w:r>
     </w:p>
     <w:p>
@@ -14117,7 +14117,4597 @@
           <w:i w:val="0"/>
           <w:sz w:val="22"/>
         </w:rPr>
-        <w:t>47. Jonas: Am späten Nachmittag sind die Teller leer. Fünfunddreißig Gespräche hat Hanna heute geführt.</w:t>
+        <w:t>47. Dennis: Entschuldigt die Verspätung. Ich komme direkt vom Arbeitsgericht. Hanna hat die Klage heute Morgen eingereicht.</w:t>
+      </w:r>
+    </w:p>
+    <w:p>
+      <w:pPr>
+        <w:keepNext/>
+        <w:ind w:left="340"/>
+      </w:pPr>
+      <w:r>
+        <w:rPr>
+          <w:rFonts w:ascii="Malgun Gothic" w:hAnsi="Malgun Gothic" w:cs="Malgun Gothic" w:eastAsia="Malgun Gothic"/>
+          <w:b w:val="0"/>
+          <w:i/>
+          <w:color w:val="404040"/>
+          <w:sz w:val="20"/>
+        </w:rPr>
+        <w:t>늦어서 미안해요. 노동법원에서 곧장 오는 길이에요. 한나가 오늘 아침 소송을 제기했어요.</w:t>
+      </w:r>
+    </w:p>
+    <w:tbl>
+      <w:tblPr>
+        <w:tblW w:type="auto" w:w="0"/>
+        <w:tblLayout w:type="fixed"/>
+        <w:tblLook w:firstColumn="1" w:firstRow="1" w:lastColumn="0" w:lastRow="0" w:noHBand="0" w:noVBand="1" w:val="04A0"/>
+      </w:tblPr>
+      <w:tblGrid>
+        <w:gridCol w:w="4819"/>
+        <w:gridCol w:w="4819"/>
+      </w:tblGrid>
+      <w:tr>
+        <w:tc>
+          <w:tcPr>
+            <w:tcW w:type="dxa" w:w="1500"/>
+            <w:tcBorders>
+              <w:top w:val="single" w:color="BFBFBF" w:sz="4"/>
+              <w:left w:val="single" w:color="BFBFBF" w:sz="4"/>
+              <w:bottom w:val="single" w:color="BFBFBF" w:sz="4"/>
+              <w:right w:val="single" w:color="BFBFBF" w:sz="4"/>
+            </w:tcBorders>
+            <w:shd w:fill="DEEAF6" w:color="auto" w:val="clear"/>
+          </w:tcPr>
+          <w:p>
+            <w:r>
+              <w:rPr>
+                <w:rFonts w:ascii="Malgun Gothic" w:hAnsi="Malgun Gothic" w:cs="Malgun Gothic" w:eastAsia="Malgun Gothic"/>
+                <w:b/>
+                <w:i w:val="0"/>
+                <w:color w:val="1F3864"/>
+                <w:sz w:val="20"/>
+              </w:rPr>
+              <w:t>주요 단어</w:t>
+            </w:r>
+          </w:p>
+        </w:tc>
+        <w:tc>
+          <w:tcPr>
+            <w:tcW w:type="dxa" w:w="8138"/>
+            <w:tcBorders>
+              <w:top w:val="single" w:color="BFBFBF" w:sz="4"/>
+              <w:left w:val="single" w:color="BFBFBF" w:sz="4"/>
+              <w:bottom w:val="single" w:color="BFBFBF" w:sz="4"/>
+              <w:right w:val="single" w:color="BFBFBF" w:sz="4"/>
+            </w:tcBorders>
+          </w:tcPr>
+          <w:p>
+            <w:pPr>
+              <w:spacing w:after="40"/>
+            </w:pPr>
+            <w:r>
+              <w:rPr>
+                <w:rFonts w:ascii="Arial" w:hAnsi="Arial" w:cs="Arial" w:eastAsia="Malgun Gothic"/>
+                <w:b/>
+                <w:i w:val="0"/>
+                <w:sz w:val="20"/>
+              </w:rPr>
+              <w:t>das Arbeitsgericht, -e</w:t>
+            </w:r>
+            <w:r>
+              <w:rPr>
+                <w:rFonts w:ascii="Malgun Gothic" w:hAnsi="Malgun Gothic" w:cs="Malgun Gothic" w:eastAsia="Malgun Gothic"/>
+                <w:b w:val="0"/>
+                <w:i w:val="0"/>
+                <w:sz w:val="20"/>
+              </w:rPr>
+              <w:t xml:space="preserve">  —  노동법원</w:t>
+            </w:r>
+          </w:p>
+          <w:p>
+            <w:pPr>
+              <w:spacing w:after="40"/>
+            </w:pPr>
+            <w:r>
+              <w:rPr>
+                <w:rFonts w:ascii="Arial" w:hAnsi="Arial" w:cs="Arial" w:eastAsia="Malgun Gothic"/>
+                <w:b/>
+                <w:i w:val="0"/>
+                <w:sz w:val="20"/>
+              </w:rPr>
+              <w:t>einreichen</w:t>
+            </w:r>
+            <w:r>
+              <w:rPr>
+                <w:rFonts w:ascii="Malgun Gothic" w:hAnsi="Malgun Gothic" w:cs="Malgun Gothic" w:eastAsia="Malgun Gothic"/>
+                <w:b w:val="0"/>
+                <w:i w:val="0"/>
+                <w:sz w:val="20"/>
+              </w:rPr>
+              <w:t xml:space="preserve">  —  제출하다</w:t>
+            </w:r>
+          </w:p>
+          <w:p>
+            <w:pPr>
+              <w:spacing w:after="40"/>
+            </w:pPr>
+            <w:r>
+              <w:rPr>
+                <w:rFonts w:ascii="Arial" w:hAnsi="Arial" w:cs="Arial" w:eastAsia="Malgun Gothic"/>
+                <w:b/>
+                <w:i w:val="0"/>
+                <w:sz w:val="20"/>
+              </w:rPr>
+              <w:t>die Verspätung, -en</w:t>
+            </w:r>
+            <w:r>
+              <w:rPr>
+                <w:rFonts w:ascii="Malgun Gothic" w:hAnsi="Malgun Gothic" w:cs="Malgun Gothic" w:eastAsia="Malgun Gothic"/>
+                <w:b w:val="0"/>
+                <w:i w:val="0"/>
+                <w:sz w:val="20"/>
+              </w:rPr>
+              <w:t xml:space="preserve">  —  지각</w:t>
+            </w:r>
+          </w:p>
+        </w:tc>
+      </w:tr>
+      <w:tr>
+        <w:tc>
+          <w:tcPr>
+            <w:tcW w:type="dxa" w:w="1500"/>
+            <w:tcBorders>
+              <w:top w:val="single" w:color="BFBFBF" w:sz="4"/>
+              <w:left w:val="single" w:color="BFBFBF" w:sz="4"/>
+              <w:bottom w:val="single" w:color="BFBFBF" w:sz="4"/>
+              <w:right w:val="single" w:color="BFBFBF" w:sz="4"/>
+            </w:tcBorders>
+            <w:shd w:fill="DEEAF6" w:color="auto" w:val="clear"/>
+          </w:tcPr>
+          <w:p>
+            <w:r>
+              <w:rPr>
+                <w:rFonts w:ascii="Malgun Gothic" w:hAnsi="Malgun Gothic" w:cs="Malgun Gothic" w:eastAsia="Malgun Gothic"/>
+                <w:b/>
+                <w:i w:val="0"/>
+                <w:color w:val="1F3864"/>
+                <w:sz w:val="20"/>
+              </w:rPr>
+              <w:t>문법</w:t>
+            </w:r>
+          </w:p>
+        </w:tc>
+        <w:tc>
+          <w:tcPr>
+            <w:tcW w:type="dxa" w:w="8138"/>
+            <w:tcBorders>
+              <w:top w:val="single" w:color="BFBFBF" w:sz="4"/>
+              <w:left w:val="single" w:color="BFBFBF" w:sz="4"/>
+              <w:bottom w:val="single" w:color="BFBFBF" w:sz="4"/>
+              <w:right w:val="single" w:color="BFBFBF" w:sz="4"/>
+            </w:tcBorders>
+          </w:tcPr>
+          <w:p>
+            <w:pPr>
+              <w:spacing w:after="40"/>
+            </w:pPr>
+            <w:r>
+              <w:rPr>
+                <w:rFonts w:ascii="Malgun Gothic" w:hAnsi="Malgun Gothic" w:cs="Malgun Gothic" w:eastAsia="Malgun Gothic"/>
+                <w:b w:val="0"/>
+                <w:i w:val="0"/>
+                <w:sz w:val="20"/>
+              </w:rPr>
+              <w:t>Entschuldigt die Verspätung은 ihr 명령형입니다. Hanna hat die Klage ... eingereicht는 분리동사 einreichen의 현재완료입니다.</w:t>
+            </w:r>
+          </w:p>
+        </w:tc>
+      </w:tr>
+      <w:tr>
+        <w:tc>
+          <w:tcPr>
+            <w:tcW w:type="dxa" w:w="1500"/>
+            <w:tcBorders>
+              <w:top w:val="single" w:color="BFBFBF" w:sz="4"/>
+              <w:left w:val="single" w:color="BFBFBF" w:sz="4"/>
+              <w:bottom w:val="single" w:color="BFBFBF" w:sz="4"/>
+              <w:right w:val="single" w:color="BFBFBF" w:sz="4"/>
+            </w:tcBorders>
+            <w:shd w:fill="DEEAF6" w:color="auto" w:val="clear"/>
+          </w:tcPr>
+          <w:p>
+            <w:r>
+              <w:rPr>
+                <w:rFonts w:ascii="Malgun Gothic" w:hAnsi="Malgun Gothic" w:cs="Malgun Gothic" w:eastAsia="Malgun Gothic"/>
+                <w:b/>
+                <w:i w:val="0"/>
+                <w:color w:val="1F3864"/>
+                <w:sz w:val="20"/>
+              </w:rPr>
+              <w:t>표현</w:t>
+            </w:r>
+          </w:p>
+        </w:tc>
+        <w:tc>
+          <w:tcPr>
+            <w:tcW w:type="dxa" w:w="8138"/>
+            <w:tcBorders>
+              <w:top w:val="single" w:color="BFBFBF" w:sz="4"/>
+              <w:left w:val="single" w:color="BFBFBF" w:sz="4"/>
+              <w:bottom w:val="single" w:color="BFBFBF" w:sz="4"/>
+              <w:right w:val="single" w:color="BFBFBF" w:sz="4"/>
+            </w:tcBorders>
+          </w:tcPr>
+          <w:p>
+            <w:pPr>
+              <w:spacing w:after="40"/>
+            </w:pPr>
+            <w:r>
+              <w:rPr>
+                <w:rFonts w:ascii="Malgun Gothic" w:hAnsi="Malgun Gothic" w:cs="Malgun Gothic" w:eastAsia="Malgun Gothic"/>
+                <w:b w:val="0"/>
+                <w:i w:val="0"/>
+                <w:sz w:val="20"/>
+              </w:rPr>
+              <w:t>direkt vom Arbeitsgericht에서 vom는 von dem의 축약입니다.</w:t>
+            </w:r>
+          </w:p>
+        </w:tc>
+      </w:tr>
+      <w:tr>
+        <w:tc>
+          <w:tcPr>
+            <w:tcW w:type="dxa" w:w="1500"/>
+            <w:tcBorders>
+              <w:top w:val="single" w:color="BFBFBF" w:sz="4"/>
+              <w:left w:val="single" w:color="BFBFBF" w:sz="4"/>
+              <w:bottom w:val="single" w:color="BFBFBF" w:sz="4"/>
+              <w:right w:val="single" w:color="BFBFBF" w:sz="4"/>
+            </w:tcBorders>
+            <w:shd w:fill="DEEAF6" w:color="auto" w:val="clear"/>
+          </w:tcPr>
+          <w:p>
+            <w:r>
+              <w:rPr>
+                <w:rFonts w:ascii="Malgun Gothic" w:hAnsi="Malgun Gothic" w:cs="Malgun Gothic" w:eastAsia="Malgun Gothic"/>
+                <w:b/>
+                <w:i w:val="0"/>
+                <w:color w:val="1F3864"/>
+                <w:sz w:val="20"/>
+              </w:rPr>
+              <w:t>시제</w:t>
+            </w:r>
+          </w:p>
+        </w:tc>
+        <w:tc>
+          <w:tcPr>
+            <w:tcW w:type="dxa" w:w="8138"/>
+            <w:tcBorders>
+              <w:top w:val="single" w:color="BFBFBF" w:sz="4"/>
+              <w:left w:val="single" w:color="BFBFBF" w:sz="4"/>
+              <w:bottom w:val="single" w:color="BFBFBF" w:sz="4"/>
+              <w:right w:val="single" w:color="BFBFBF" w:sz="4"/>
+            </w:tcBorders>
+          </w:tcPr>
+          <w:p>
+            <w:pPr>
+              <w:spacing w:after="40"/>
+            </w:pPr>
+            <w:r>
+              <w:rPr>
+                <w:rFonts w:ascii="Malgun Gothic" w:hAnsi="Malgun Gothic" w:cs="Malgun Gothic" w:eastAsia="Malgun Gothic"/>
+                <w:b w:val="0"/>
+                <w:i w:val="0"/>
+                <w:sz w:val="20"/>
+              </w:rPr>
+              <w:t>komme은 현재형이고 hat ... eingereicht는 현재완료입니다.</w:t>
+            </w:r>
+          </w:p>
+        </w:tc>
+      </w:tr>
+    </w:tbl>
+    <w:p>
+      <w:pPr>
+        <w:spacing w:after="0"/>
+      </w:pPr>
+    </w:p>
+    <w:p>
+      <w:pPr>
+        <w:keepNext/>
+        <w:spacing w:before="160"/>
+      </w:pPr>
+      <w:r>
+        <w:rPr>
+          <w:rFonts w:ascii="Arial" w:hAnsi="Arial" w:cs="Arial" w:eastAsia="Malgun Gothic"/>
+          <w:b/>
+          <w:i w:val="0"/>
+          <w:sz w:val="22"/>
+        </w:rPr>
+        <w:t>48. Hanna: Statusfeststellungsklage, ja. Wir wollen gerichtlich klären lassen, dass Dennis in Wahrheit Arbeitnehmer war.</w:t>
+      </w:r>
+    </w:p>
+    <w:p>
+      <w:pPr>
+        <w:keepNext/>
+        <w:ind w:left="340"/>
+      </w:pPr>
+      <w:r>
+        <w:rPr>
+          <w:rFonts w:ascii="Malgun Gothic" w:hAnsi="Malgun Gothic" w:cs="Malgun Gothic" w:eastAsia="Malgun Gothic"/>
+          <w:b w:val="0"/>
+          <w:i/>
+          <w:color w:val="404040"/>
+          <w:sz w:val="20"/>
+        </w:rPr>
+        <w:t>네, 지위 확인 소송입니다. 데니스가 실제로는 근로자였다는 점을 법원에서 밝히려는 거예요.</w:t>
+      </w:r>
+    </w:p>
+    <w:tbl>
+      <w:tblPr>
+        <w:tblW w:type="auto" w:w="0"/>
+        <w:tblLayout w:type="fixed"/>
+        <w:tblLook w:firstColumn="1" w:firstRow="1" w:lastColumn="0" w:lastRow="0" w:noHBand="0" w:noVBand="1" w:val="04A0"/>
+      </w:tblPr>
+      <w:tblGrid>
+        <w:gridCol w:w="4819"/>
+        <w:gridCol w:w="4819"/>
+      </w:tblGrid>
+      <w:tr>
+        <w:tc>
+          <w:tcPr>
+            <w:tcW w:type="dxa" w:w="1500"/>
+            <w:tcBorders>
+              <w:top w:val="single" w:color="BFBFBF" w:sz="4"/>
+              <w:left w:val="single" w:color="BFBFBF" w:sz="4"/>
+              <w:bottom w:val="single" w:color="BFBFBF" w:sz="4"/>
+              <w:right w:val="single" w:color="BFBFBF" w:sz="4"/>
+            </w:tcBorders>
+            <w:shd w:fill="DEEAF6" w:color="auto" w:val="clear"/>
+          </w:tcPr>
+          <w:p>
+            <w:r>
+              <w:rPr>
+                <w:rFonts w:ascii="Malgun Gothic" w:hAnsi="Malgun Gothic" w:cs="Malgun Gothic" w:eastAsia="Malgun Gothic"/>
+                <w:b/>
+                <w:i w:val="0"/>
+                <w:color w:val="1F3864"/>
+                <w:sz w:val="20"/>
+              </w:rPr>
+              <w:t>주요 단어</w:t>
+            </w:r>
+          </w:p>
+        </w:tc>
+        <w:tc>
+          <w:tcPr>
+            <w:tcW w:type="dxa" w:w="8138"/>
+            <w:tcBorders>
+              <w:top w:val="single" w:color="BFBFBF" w:sz="4"/>
+              <w:left w:val="single" w:color="BFBFBF" w:sz="4"/>
+              <w:bottom w:val="single" w:color="BFBFBF" w:sz="4"/>
+              <w:right w:val="single" w:color="BFBFBF" w:sz="4"/>
+            </w:tcBorders>
+          </w:tcPr>
+          <w:p>
+            <w:pPr>
+              <w:spacing w:after="40"/>
+            </w:pPr>
+            <w:r>
+              <w:rPr>
+                <w:rFonts w:ascii="Arial" w:hAnsi="Arial" w:cs="Arial" w:eastAsia="Malgun Gothic"/>
+                <w:b/>
+                <w:i w:val="0"/>
+                <w:sz w:val="20"/>
+              </w:rPr>
+              <w:t>die Feststellung, -en</w:t>
+            </w:r>
+            <w:r>
+              <w:rPr>
+                <w:rFonts w:ascii="Malgun Gothic" w:hAnsi="Malgun Gothic" w:cs="Malgun Gothic" w:eastAsia="Malgun Gothic"/>
+                <w:b w:val="0"/>
+                <w:i w:val="0"/>
+                <w:sz w:val="20"/>
+              </w:rPr>
+              <w:t xml:space="preserve">  —  확인</w:t>
+            </w:r>
+          </w:p>
+          <w:p>
+            <w:pPr>
+              <w:spacing w:after="40"/>
+            </w:pPr>
+            <w:r>
+              <w:rPr>
+                <w:rFonts w:ascii="Arial" w:hAnsi="Arial" w:cs="Arial" w:eastAsia="Malgun Gothic"/>
+                <w:b/>
+                <w:i w:val="0"/>
+                <w:sz w:val="20"/>
+              </w:rPr>
+              <w:t>gerichtlich</w:t>
+            </w:r>
+            <w:r>
+              <w:rPr>
+                <w:rFonts w:ascii="Malgun Gothic" w:hAnsi="Malgun Gothic" w:cs="Malgun Gothic" w:eastAsia="Malgun Gothic"/>
+                <w:b w:val="0"/>
+                <w:i w:val="0"/>
+                <w:sz w:val="20"/>
+              </w:rPr>
+              <w:t xml:space="preserve">  —  법원에서</w:t>
+            </w:r>
+          </w:p>
+          <w:p>
+            <w:pPr>
+              <w:spacing w:after="40"/>
+            </w:pPr>
+            <w:r>
+              <w:rPr>
+                <w:rFonts w:ascii="Arial" w:hAnsi="Arial" w:cs="Arial" w:eastAsia="Malgun Gothic"/>
+                <w:b/>
+                <w:i w:val="0"/>
+                <w:sz w:val="20"/>
+              </w:rPr>
+              <w:t>der Arbeitnehmer, -</w:t>
+            </w:r>
+            <w:r>
+              <w:rPr>
+                <w:rFonts w:ascii="Malgun Gothic" w:hAnsi="Malgun Gothic" w:cs="Malgun Gothic" w:eastAsia="Malgun Gothic"/>
+                <w:b w:val="0"/>
+                <w:i w:val="0"/>
+                <w:sz w:val="20"/>
+              </w:rPr>
+              <w:t xml:space="preserve">  —  근로자</w:t>
+            </w:r>
+          </w:p>
+        </w:tc>
+      </w:tr>
+      <w:tr>
+        <w:tc>
+          <w:tcPr>
+            <w:tcW w:type="dxa" w:w="1500"/>
+            <w:tcBorders>
+              <w:top w:val="single" w:color="BFBFBF" w:sz="4"/>
+              <w:left w:val="single" w:color="BFBFBF" w:sz="4"/>
+              <w:bottom w:val="single" w:color="BFBFBF" w:sz="4"/>
+              <w:right w:val="single" w:color="BFBFBF" w:sz="4"/>
+            </w:tcBorders>
+            <w:shd w:fill="DEEAF6" w:color="auto" w:val="clear"/>
+          </w:tcPr>
+          <w:p>
+            <w:r>
+              <w:rPr>
+                <w:rFonts w:ascii="Malgun Gothic" w:hAnsi="Malgun Gothic" w:cs="Malgun Gothic" w:eastAsia="Malgun Gothic"/>
+                <w:b/>
+                <w:i w:val="0"/>
+                <w:color w:val="1F3864"/>
+                <w:sz w:val="20"/>
+              </w:rPr>
+              <w:t>문법</w:t>
+            </w:r>
+          </w:p>
+        </w:tc>
+        <w:tc>
+          <w:tcPr>
+            <w:tcW w:type="dxa" w:w="8138"/>
+            <w:tcBorders>
+              <w:top w:val="single" w:color="BFBFBF" w:sz="4"/>
+              <w:left w:val="single" w:color="BFBFBF" w:sz="4"/>
+              <w:bottom w:val="single" w:color="BFBFBF" w:sz="4"/>
+              <w:right w:val="single" w:color="BFBFBF" w:sz="4"/>
+            </w:tcBorders>
+          </w:tcPr>
+          <w:p>
+            <w:pPr>
+              <w:spacing w:after="40"/>
+            </w:pPr>
+            <w:r>
+              <w:rPr>
+                <w:rFonts w:ascii="Malgun Gothic" w:hAnsi="Malgun Gothic" w:cs="Malgun Gothic" w:eastAsia="Malgun Gothic"/>
+                <w:b w:val="0"/>
+                <w:i w:val="0"/>
+                <w:sz w:val="20"/>
+              </w:rPr>
+              <w:t>Wir wollen ... klären lassen, dass ... war에서 lassen + 부정형이 쓰이고 dass절의 war가 끝에 옵니다.</w:t>
+            </w:r>
+          </w:p>
+        </w:tc>
+      </w:tr>
+      <w:tr>
+        <w:tc>
+          <w:tcPr>
+            <w:tcW w:type="dxa" w:w="1500"/>
+            <w:tcBorders>
+              <w:top w:val="single" w:color="BFBFBF" w:sz="4"/>
+              <w:left w:val="single" w:color="BFBFBF" w:sz="4"/>
+              <w:bottom w:val="single" w:color="BFBFBF" w:sz="4"/>
+              <w:right w:val="single" w:color="BFBFBF" w:sz="4"/>
+            </w:tcBorders>
+            <w:shd w:fill="DEEAF6" w:color="auto" w:val="clear"/>
+          </w:tcPr>
+          <w:p>
+            <w:r>
+              <w:rPr>
+                <w:rFonts w:ascii="Malgun Gothic" w:hAnsi="Malgun Gothic" w:cs="Malgun Gothic" w:eastAsia="Malgun Gothic"/>
+                <w:b/>
+                <w:i w:val="0"/>
+                <w:color w:val="1F3864"/>
+                <w:sz w:val="20"/>
+              </w:rPr>
+              <w:t>표현</w:t>
+            </w:r>
+          </w:p>
+        </w:tc>
+        <w:tc>
+          <w:tcPr>
+            <w:tcW w:type="dxa" w:w="8138"/>
+            <w:tcBorders>
+              <w:top w:val="single" w:color="BFBFBF" w:sz="4"/>
+              <w:left w:val="single" w:color="BFBFBF" w:sz="4"/>
+              <w:bottom w:val="single" w:color="BFBFBF" w:sz="4"/>
+              <w:right w:val="single" w:color="BFBFBF" w:sz="4"/>
+            </w:tcBorders>
+          </w:tcPr>
+          <w:p>
+            <w:pPr>
+              <w:spacing w:after="40"/>
+            </w:pPr>
+            <w:r>
+              <w:rPr>
+                <w:rFonts w:ascii="Malgun Gothic" w:hAnsi="Malgun Gothic" w:cs="Malgun Gothic" w:eastAsia="Malgun Gothic"/>
+                <w:b w:val="0"/>
+                <w:i w:val="0"/>
+                <w:sz w:val="20"/>
+              </w:rPr>
+              <w:t>in Wahrheit은 사실은이라는 표현입니다.</w:t>
+            </w:r>
+          </w:p>
+        </w:tc>
+      </w:tr>
+      <w:tr>
+        <w:tc>
+          <w:tcPr>
+            <w:tcW w:type="dxa" w:w="1500"/>
+            <w:tcBorders>
+              <w:top w:val="single" w:color="BFBFBF" w:sz="4"/>
+              <w:left w:val="single" w:color="BFBFBF" w:sz="4"/>
+              <w:bottom w:val="single" w:color="BFBFBF" w:sz="4"/>
+              <w:right w:val="single" w:color="BFBFBF" w:sz="4"/>
+            </w:tcBorders>
+            <w:shd w:fill="DEEAF6" w:color="auto" w:val="clear"/>
+          </w:tcPr>
+          <w:p>
+            <w:r>
+              <w:rPr>
+                <w:rFonts w:ascii="Malgun Gothic" w:hAnsi="Malgun Gothic" w:cs="Malgun Gothic" w:eastAsia="Malgun Gothic"/>
+                <w:b/>
+                <w:i w:val="0"/>
+                <w:color w:val="1F3864"/>
+                <w:sz w:val="20"/>
+              </w:rPr>
+              <w:t>시제</w:t>
+            </w:r>
+          </w:p>
+        </w:tc>
+        <w:tc>
+          <w:tcPr>
+            <w:tcW w:type="dxa" w:w="8138"/>
+            <w:tcBorders>
+              <w:top w:val="single" w:color="BFBFBF" w:sz="4"/>
+              <w:left w:val="single" w:color="BFBFBF" w:sz="4"/>
+              <w:bottom w:val="single" w:color="BFBFBF" w:sz="4"/>
+              <w:right w:val="single" w:color="BFBFBF" w:sz="4"/>
+            </w:tcBorders>
+          </w:tcPr>
+          <w:p>
+            <w:pPr>
+              <w:spacing w:after="40"/>
+            </w:pPr>
+            <w:r>
+              <w:rPr>
+                <w:rFonts w:ascii="Malgun Gothic" w:hAnsi="Malgun Gothic" w:cs="Malgun Gothic" w:eastAsia="Malgun Gothic"/>
+                <w:b w:val="0"/>
+                <w:i w:val="0"/>
+                <w:sz w:val="20"/>
+              </w:rPr>
+              <w:t>wollen은 현재형이고 war는 과거형입니다.</w:t>
+            </w:r>
+          </w:p>
+        </w:tc>
+      </w:tr>
+    </w:tbl>
+    <w:p>
+      <w:pPr>
+        <w:spacing w:after="0"/>
+      </w:pPr>
+    </w:p>
+    <w:p>
+      <w:pPr>
+        <w:keepNext/>
+        <w:spacing w:before="160"/>
+      </w:pPr>
+      <w:r>
+        <w:rPr>
+          <w:rFonts w:ascii="Arial" w:hAnsi="Arial" w:cs="Arial" w:eastAsia="Malgun Gothic"/>
+          <w:b/>
+          <w:i w:val="0"/>
+          <w:sz w:val="22"/>
+        </w:rPr>
+        <w:t>49. Karim: Und wenn Sie gewinnen? Gilt das nur für Dennis oder für uns alle?</w:t>
+      </w:r>
+    </w:p>
+    <w:p>
+      <w:pPr>
+        <w:keepNext/>
+        <w:ind w:left="340"/>
+      </w:pPr>
+      <w:r>
+        <w:rPr>
+          <w:rFonts w:ascii="Malgun Gothic" w:hAnsi="Malgun Gothic" w:cs="Malgun Gothic" w:eastAsia="Malgun Gothic"/>
+          <w:b w:val="0"/>
+          <w:i/>
+          <w:color w:val="404040"/>
+          <w:sz w:val="20"/>
+        </w:rPr>
+        <w:t>이기면요? 그건 데니스에게만 해당하나요, 아니면 우리 모두에게요?</w:t>
+      </w:r>
+    </w:p>
+    <w:tbl>
+      <w:tblPr>
+        <w:tblW w:type="auto" w:w="0"/>
+        <w:tblLayout w:type="fixed"/>
+        <w:tblLook w:firstColumn="1" w:firstRow="1" w:lastColumn="0" w:lastRow="0" w:noHBand="0" w:noVBand="1" w:val="04A0"/>
+      </w:tblPr>
+      <w:tblGrid>
+        <w:gridCol w:w="4819"/>
+        <w:gridCol w:w="4819"/>
+      </w:tblGrid>
+      <w:tr>
+        <w:tc>
+          <w:tcPr>
+            <w:tcW w:type="dxa" w:w="1500"/>
+            <w:tcBorders>
+              <w:top w:val="single" w:color="BFBFBF" w:sz="4"/>
+              <w:left w:val="single" w:color="BFBFBF" w:sz="4"/>
+              <w:bottom w:val="single" w:color="BFBFBF" w:sz="4"/>
+              <w:right w:val="single" w:color="BFBFBF" w:sz="4"/>
+            </w:tcBorders>
+            <w:shd w:fill="DEEAF6" w:color="auto" w:val="clear"/>
+          </w:tcPr>
+          <w:p>
+            <w:r>
+              <w:rPr>
+                <w:rFonts w:ascii="Malgun Gothic" w:hAnsi="Malgun Gothic" w:cs="Malgun Gothic" w:eastAsia="Malgun Gothic"/>
+                <w:b/>
+                <w:i w:val="0"/>
+                <w:color w:val="1F3864"/>
+                <w:sz w:val="20"/>
+              </w:rPr>
+              <w:t>주요 단어</w:t>
+            </w:r>
+          </w:p>
+        </w:tc>
+        <w:tc>
+          <w:tcPr>
+            <w:tcW w:type="dxa" w:w="8138"/>
+            <w:tcBorders>
+              <w:top w:val="single" w:color="BFBFBF" w:sz="4"/>
+              <w:left w:val="single" w:color="BFBFBF" w:sz="4"/>
+              <w:bottom w:val="single" w:color="BFBFBF" w:sz="4"/>
+              <w:right w:val="single" w:color="BFBFBF" w:sz="4"/>
+            </w:tcBorders>
+          </w:tcPr>
+          <w:p>
+            <w:pPr>
+              <w:spacing w:after="40"/>
+            </w:pPr>
+            <w:r>
+              <w:rPr>
+                <w:rFonts w:ascii="Arial" w:hAnsi="Arial" w:cs="Arial" w:eastAsia="Malgun Gothic"/>
+                <w:b/>
+                <w:i w:val="0"/>
+                <w:sz w:val="20"/>
+              </w:rPr>
+              <w:t>gewinnen</w:t>
+            </w:r>
+            <w:r>
+              <w:rPr>
+                <w:rFonts w:ascii="Malgun Gothic" w:hAnsi="Malgun Gothic" w:cs="Malgun Gothic" w:eastAsia="Malgun Gothic"/>
+                <w:b w:val="0"/>
+                <w:i w:val="0"/>
+                <w:sz w:val="20"/>
+              </w:rPr>
+              <w:t xml:space="preserve">  —  이기다</w:t>
+            </w:r>
+          </w:p>
+          <w:p>
+            <w:pPr>
+              <w:spacing w:after="40"/>
+            </w:pPr>
+            <w:r>
+              <w:rPr>
+                <w:rFonts w:ascii="Arial" w:hAnsi="Arial" w:cs="Arial" w:eastAsia="Malgun Gothic"/>
+                <w:b/>
+                <w:i w:val="0"/>
+                <w:sz w:val="20"/>
+              </w:rPr>
+              <w:t>gelten</w:t>
+            </w:r>
+            <w:r>
+              <w:rPr>
+                <w:rFonts w:ascii="Malgun Gothic" w:hAnsi="Malgun Gothic" w:cs="Malgun Gothic" w:eastAsia="Malgun Gothic"/>
+                <w:b w:val="0"/>
+                <w:i w:val="0"/>
+                <w:sz w:val="20"/>
+              </w:rPr>
+              <w:t xml:space="preserve">  —  적용되다</w:t>
+            </w:r>
+          </w:p>
+          <w:p>
+            <w:pPr>
+              <w:spacing w:after="40"/>
+            </w:pPr>
+            <w:r>
+              <w:rPr>
+                <w:rFonts w:ascii="Arial" w:hAnsi="Arial" w:cs="Arial" w:eastAsia="Malgun Gothic"/>
+                <w:b/>
+                <w:i w:val="0"/>
+                <w:sz w:val="20"/>
+              </w:rPr>
+              <w:t>nur</w:t>
+            </w:r>
+            <w:r>
+              <w:rPr>
+                <w:rFonts w:ascii="Malgun Gothic" w:hAnsi="Malgun Gothic" w:cs="Malgun Gothic" w:eastAsia="Malgun Gothic"/>
+                <w:b w:val="0"/>
+                <w:i w:val="0"/>
+                <w:sz w:val="20"/>
+              </w:rPr>
+              <w:t xml:space="preserve">  —  단지</w:t>
+            </w:r>
+          </w:p>
+        </w:tc>
+      </w:tr>
+      <w:tr>
+        <w:tc>
+          <w:tcPr>
+            <w:tcW w:type="dxa" w:w="1500"/>
+            <w:tcBorders>
+              <w:top w:val="single" w:color="BFBFBF" w:sz="4"/>
+              <w:left w:val="single" w:color="BFBFBF" w:sz="4"/>
+              <w:bottom w:val="single" w:color="BFBFBF" w:sz="4"/>
+              <w:right w:val="single" w:color="BFBFBF" w:sz="4"/>
+            </w:tcBorders>
+            <w:shd w:fill="DEEAF6" w:color="auto" w:val="clear"/>
+          </w:tcPr>
+          <w:p>
+            <w:r>
+              <w:rPr>
+                <w:rFonts w:ascii="Malgun Gothic" w:hAnsi="Malgun Gothic" w:cs="Malgun Gothic" w:eastAsia="Malgun Gothic"/>
+                <w:b/>
+                <w:i w:val="0"/>
+                <w:color w:val="1F3864"/>
+                <w:sz w:val="20"/>
+              </w:rPr>
+              <w:t>문법</w:t>
+            </w:r>
+          </w:p>
+        </w:tc>
+        <w:tc>
+          <w:tcPr>
+            <w:tcW w:type="dxa" w:w="8138"/>
+            <w:tcBorders>
+              <w:top w:val="single" w:color="BFBFBF" w:sz="4"/>
+              <w:left w:val="single" w:color="BFBFBF" w:sz="4"/>
+              <w:bottom w:val="single" w:color="BFBFBF" w:sz="4"/>
+              <w:right w:val="single" w:color="BFBFBF" w:sz="4"/>
+            </w:tcBorders>
+          </w:tcPr>
+          <w:p>
+            <w:pPr>
+              <w:spacing w:after="40"/>
+            </w:pPr>
+            <w:r>
+              <w:rPr>
+                <w:rFonts w:ascii="Malgun Gothic" w:hAnsi="Malgun Gothic" w:cs="Malgun Gothic" w:eastAsia="Malgun Gothic"/>
+                <w:b w:val="0"/>
+                <w:i w:val="0"/>
+                <w:sz w:val="20"/>
+              </w:rPr>
+              <w:t>Und wenn Sie gewinnen?은 생략된 의문문입니다. Gilt das nur für Dennis oder für uns alle?은 동사가 앞에 오는 의문문입니다.</w:t>
+            </w:r>
+          </w:p>
+        </w:tc>
+      </w:tr>
+      <w:tr>
+        <w:tc>
+          <w:tcPr>
+            <w:tcW w:type="dxa" w:w="1500"/>
+            <w:tcBorders>
+              <w:top w:val="single" w:color="BFBFBF" w:sz="4"/>
+              <w:left w:val="single" w:color="BFBFBF" w:sz="4"/>
+              <w:bottom w:val="single" w:color="BFBFBF" w:sz="4"/>
+              <w:right w:val="single" w:color="BFBFBF" w:sz="4"/>
+            </w:tcBorders>
+            <w:shd w:fill="DEEAF6" w:color="auto" w:val="clear"/>
+          </w:tcPr>
+          <w:p>
+            <w:r>
+              <w:rPr>
+                <w:rFonts w:ascii="Malgun Gothic" w:hAnsi="Malgun Gothic" w:cs="Malgun Gothic" w:eastAsia="Malgun Gothic"/>
+                <w:b/>
+                <w:i w:val="0"/>
+                <w:color w:val="1F3864"/>
+                <w:sz w:val="20"/>
+              </w:rPr>
+              <w:t>표현</w:t>
+            </w:r>
+          </w:p>
+        </w:tc>
+        <w:tc>
+          <w:tcPr>
+            <w:tcW w:type="dxa" w:w="8138"/>
+            <w:tcBorders>
+              <w:top w:val="single" w:color="BFBFBF" w:sz="4"/>
+              <w:left w:val="single" w:color="BFBFBF" w:sz="4"/>
+              <w:bottom w:val="single" w:color="BFBFBF" w:sz="4"/>
+              <w:right w:val="single" w:color="BFBFBF" w:sz="4"/>
+            </w:tcBorders>
+          </w:tcPr>
+          <w:p>
+            <w:pPr>
+              <w:spacing w:after="40"/>
+            </w:pPr>
+            <w:r>
+              <w:rPr>
+                <w:rFonts w:ascii="Malgun Gothic" w:hAnsi="Malgun Gothic" w:cs="Malgun Gothic" w:eastAsia="Malgun Gothic"/>
+                <w:b w:val="0"/>
+                <w:i w:val="0"/>
+                <w:sz w:val="20"/>
+              </w:rPr>
+              <w:t>für uns alle은 우리 모두를 위해라는 표현입니다.</w:t>
+            </w:r>
+          </w:p>
+        </w:tc>
+      </w:tr>
+      <w:tr>
+        <w:tc>
+          <w:tcPr>
+            <w:tcW w:type="dxa" w:w="1500"/>
+            <w:tcBorders>
+              <w:top w:val="single" w:color="BFBFBF" w:sz="4"/>
+              <w:left w:val="single" w:color="BFBFBF" w:sz="4"/>
+              <w:bottom w:val="single" w:color="BFBFBF" w:sz="4"/>
+              <w:right w:val="single" w:color="BFBFBF" w:sz="4"/>
+            </w:tcBorders>
+            <w:shd w:fill="DEEAF6" w:color="auto" w:val="clear"/>
+          </w:tcPr>
+          <w:p>
+            <w:r>
+              <w:rPr>
+                <w:rFonts w:ascii="Malgun Gothic" w:hAnsi="Malgun Gothic" w:cs="Malgun Gothic" w:eastAsia="Malgun Gothic"/>
+                <w:b/>
+                <w:i w:val="0"/>
+                <w:color w:val="1F3864"/>
+                <w:sz w:val="20"/>
+              </w:rPr>
+              <w:t>시제</w:t>
+            </w:r>
+          </w:p>
+        </w:tc>
+        <w:tc>
+          <w:tcPr>
+            <w:tcW w:type="dxa" w:w="8138"/>
+            <w:tcBorders>
+              <w:top w:val="single" w:color="BFBFBF" w:sz="4"/>
+              <w:left w:val="single" w:color="BFBFBF" w:sz="4"/>
+              <w:bottom w:val="single" w:color="BFBFBF" w:sz="4"/>
+              <w:right w:val="single" w:color="BFBFBF" w:sz="4"/>
+            </w:tcBorders>
+          </w:tcPr>
+          <w:p>
+            <w:pPr>
+              <w:spacing w:after="40"/>
+            </w:pPr>
+            <w:r>
+              <w:rPr>
+                <w:rFonts w:ascii="Malgun Gothic" w:hAnsi="Malgun Gothic" w:cs="Malgun Gothic" w:eastAsia="Malgun Gothic"/>
+                <w:b w:val="0"/>
+                <w:i w:val="0"/>
+                <w:sz w:val="20"/>
+              </w:rPr>
+              <w:t>gewinnen, Gilt는 현재형입니다.</w:t>
+            </w:r>
+          </w:p>
+        </w:tc>
+      </w:tr>
+    </w:tbl>
+    <w:p>
+      <w:pPr>
+        <w:spacing w:after="0"/>
+      </w:pPr>
+    </w:p>
+    <w:p>
+      <w:pPr>
+        <w:keepNext/>
+        <w:spacing w:before="160"/>
+      </w:pPr>
+      <w:r>
+        <w:rPr>
+          <w:rFonts w:ascii="Arial" w:hAnsi="Arial" w:cs="Arial" w:eastAsia="Malgun Gothic"/>
+          <w:b/>
+          <w:i w:val="0"/>
+          <w:sz w:val="22"/>
+        </w:rPr>
+        <w:t>50. Hanna: Rechtlich zunächst nur für Dennis. Praktisch aber setzt ein Urteil einen Maßstab, an dem sich die anderen orientieren.</w:t>
+      </w:r>
+    </w:p>
+    <w:p>
+      <w:pPr>
+        <w:keepNext/>
+        <w:ind w:left="340"/>
+      </w:pPr>
+      <w:r>
+        <w:rPr>
+          <w:rFonts w:ascii="Malgun Gothic" w:hAnsi="Malgun Gothic" w:cs="Malgun Gothic" w:eastAsia="Malgun Gothic"/>
+          <w:b w:val="0"/>
+          <w:i/>
+          <w:color w:val="404040"/>
+          <w:sz w:val="20"/>
+        </w:rPr>
+        <w:t>법적으로는 우선 데니스에게만 해당합니다. 하지만 실제로는 판결이 다른 사람들이 따를 기준이 됩니다.</w:t>
+      </w:r>
+    </w:p>
+    <w:tbl>
+      <w:tblPr>
+        <w:tblW w:type="auto" w:w="0"/>
+        <w:tblLayout w:type="fixed"/>
+        <w:tblLook w:firstColumn="1" w:firstRow="1" w:lastColumn="0" w:lastRow="0" w:noHBand="0" w:noVBand="1" w:val="04A0"/>
+      </w:tblPr>
+      <w:tblGrid>
+        <w:gridCol w:w="4819"/>
+        <w:gridCol w:w="4819"/>
+      </w:tblGrid>
+      <w:tr>
+        <w:tc>
+          <w:tcPr>
+            <w:tcW w:type="dxa" w:w="1500"/>
+            <w:tcBorders>
+              <w:top w:val="single" w:color="BFBFBF" w:sz="4"/>
+              <w:left w:val="single" w:color="BFBFBF" w:sz="4"/>
+              <w:bottom w:val="single" w:color="BFBFBF" w:sz="4"/>
+              <w:right w:val="single" w:color="BFBFBF" w:sz="4"/>
+            </w:tcBorders>
+            <w:shd w:fill="DEEAF6" w:color="auto" w:val="clear"/>
+          </w:tcPr>
+          <w:p>
+            <w:r>
+              <w:rPr>
+                <w:rFonts w:ascii="Malgun Gothic" w:hAnsi="Malgun Gothic" w:cs="Malgun Gothic" w:eastAsia="Malgun Gothic"/>
+                <w:b/>
+                <w:i w:val="0"/>
+                <w:color w:val="1F3864"/>
+                <w:sz w:val="20"/>
+              </w:rPr>
+              <w:t>주요 단어</w:t>
+            </w:r>
+          </w:p>
+        </w:tc>
+        <w:tc>
+          <w:tcPr>
+            <w:tcW w:type="dxa" w:w="8138"/>
+            <w:tcBorders>
+              <w:top w:val="single" w:color="BFBFBF" w:sz="4"/>
+              <w:left w:val="single" w:color="BFBFBF" w:sz="4"/>
+              <w:bottom w:val="single" w:color="BFBFBF" w:sz="4"/>
+              <w:right w:val="single" w:color="BFBFBF" w:sz="4"/>
+            </w:tcBorders>
+          </w:tcPr>
+          <w:p>
+            <w:pPr>
+              <w:spacing w:after="40"/>
+            </w:pPr>
+            <w:r>
+              <w:rPr>
+                <w:rFonts w:ascii="Arial" w:hAnsi="Arial" w:cs="Arial" w:eastAsia="Malgun Gothic"/>
+                <w:b/>
+                <w:i w:val="0"/>
+                <w:sz w:val="20"/>
+              </w:rPr>
+              <w:t>der Maßstab, -stäbe</w:t>
+            </w:r>
+            <w:r>
+              <w:rPr>
+                <w:rFonts w:ascii="Malgun Gothic" w:hAnsi="Malgun Gothic" w:cs="Malgun Gothic" w:eastAsia="Malgun Gothic"/>
+                <w:b w:val="0"/>
+                <w:i w:val="0"/>
+                <w:sz w:val="20"/>
+              </w:rPr>
+              <w:t xml:space="preserve">  —  기준</w:t>
+            </w:r>
+          </w:p>
+          <w:p>
+            <w:pPr>
+              <w:spacing w:after="40"/>
+            </w:pPr>
+            <w:r>
+              <w:rPr>
+                <w:rFonts w:ascii="Arial" w:hAnsi="Arial" w:cs="Arial" w:eastAsia="Malgun Gothic"/>
+                <w:b/>
+                <w:i w:val="0"/>
+                <w:sz w:val="20"/>
+              </w:rPr>
+              <w:t>sich orientieren an</w:t>
+            </w:r>
+            <w:r>
+              <w:rPr>
+                <w:rFonts w:ascii="Malgun Gothic" w:hAnsi="Malgun Gothic" w:cs="Malgun Gothic" w:eastAsia="Malgun Gothic"/>
+                <w:b w:val="0"/>
+                <w:i w:val="0"/>
+                <w:sz w:val="20"/>
+              </w:rPr>
+              <w:t xml:space="preserve">  —  ~를 기준으로 삼다</w:t>
+            </w:r>
+          </w:p>
+          <w:p>
+            <w:pPr>
+              <w:spacing w:after="40"/>
+            </w:pPr>
+            <w:r>
+              <w:rPr>
+                <w:rFonts w:ascii="Arial" w:hAnsi="Arial" w:cs="Arial" w:eastAsia="Malgun Gothic"/>
+                <w:b/>
+                <w:i w:val="0"/>
+                <w:sz w:val="20"/>
+              </w:rPr>
+              <w:t>zunächst</w:t>
+            </w:r>
+            <w:r>
+              <w:rPr>
+                <w:rFonts w:ascii="Malgun Gothic" w:hAnsi="Malgun Gothic" w:cs="Malgun Gothic" w:eastAsia="Malgun Gothic"/>
+                <w:b w:val="0"/>
+                <w:i w:val="0"/>
+                <w:sz w:val="20"/>
+              </w:rPr>
+              <w:t xml:space="preserve">  —  우선</w:t>
+            </w:r>
+          </w:p>
+        </w:tc>
+      </w:tr>
+      <w:tr>
+        <w:tc>
+          <w:tcPr>
+            <w:tcW w:type="dxa" w:w="1500"/>
+            <w:tcBorders>
+              <w:top w:val="single" w:color="BFBFBF" w:sz="4"/>
+              <w:left w:val="single" w:color="BFBFBF" w:sz="4"/>
+              <w:bottom w:val="single" w:color="BFBFBF" w:sz="4"/>
+              <w:right w:val="single" w:color="BFBFBF" w:sz="4"/>
+            </w:tcBorders>
+            <w:shd w:fill="DEEAF6" w:color="auto" w:val="clear"/>
+          </w:tcPr>
+          <w:p>
+            <w:r>
+              <w:rPr>
+                <w:rFonts w:ascii="Malgun Gothic" w:hAnsi="Malgun Gothic" w:cs="Malgun Gothic" w:eastAsia="Malgun Gothic"/>
+                <w:b/>
+                <w:i w:val="0"/>
+                <w:color w:val="1F3864"/>
+                <w:sz w:val="20"/>
+              </w:rPr>
+              <w:t>문법</w:t>
+            </w:r>
+          </w:p>
+        </w:tc>
+        <w:tc>
+          <w:tcPr>
+            <w:tcW w:type="dxa" w:w="8138"/>
+            <w:tcBorders>
+              <w:top w:val="single" w:color="BFBFBF" w:sz="4"/>
+              <w:left w:val="single" w:color="BFBFBF" w:sz="4"/>
+              <w:bottom w:val="single" w:color="BFBFBF" w:sz="4"/>
+              <w:right w:val="single" w:color="BFBFBF" w:sz="4"/>
+            </w:tcBorders>
+          </w:tcPr>
+          <w:p>
+            <w:pPr>
+              <w:spacing w:after="40"/>
+            </w:pPr>
+            <w:r>
+              <w:rPr>
+                <w:rFonts w:ascii="Malgun Gothic" w:hAnsi="Malgun Gothic" w:cs="Malgun Gothic" w:eastAsia="Malgun Gothic"/>
+                <w:b w:val="0"/>
+                <w:i w:val="0"/>
+                <w:sz w:val="20"/>
+              </w:rPr>
+              <w:t>einen Maßstab, an dem sich die anderen orientieren에서 an dem은 관계대명사이며 orientieren이 끝에 옵니다.</w:t>
+            </w:r>
+          </w:p>
+        </w:tc>
+      </w:tr>
+      <w:tr>
+        <w:tc>
+          <w:tcPr>
+            <w:tcW w:type="dxa" w:w="1500"/>
+            <w:tcBorders>
+              <w:top w:val="single" w:color="BFBFBF" w:sz="4"/>
+              <w:left w:val="single" w:color="BFBFBF" w:sz="4"/>
+              <w:bottom w:val="single" w:color="BFBFBF" w:sz="4"/>
+              <w:right w:val="single" w:color="BFBFBF" w:sz="4"/>
+            </w:tcBorders>
+            <w:shd w:fill="DEEAF6" w:color="auto" w:val="clear"/>
+          </w:tcPr>
+          <w:p>
+            <w:r>
+              <w:rPr>
+                <w:rFonts w:ascii="Malgun Gothic" w:hAnsi="Malgun Gothic" w:cs="Malgun Gothic" w:eastAsia="Malgun Gothic"/>
+                <w:b/>
+                <w:i w:val="0"/>
+                <w:color w:val="1F3864"/>
+                <w:sz w:val="20"/>
+              </w:rPr>
+              <w:t>표현</w:t>
+            </w:r>
+          </w:p>
+        </w:tc>
+        <w:tc>
+          <w:tcPr>
+            <w:tcW w:type="dxa" w:w="8138"/>
+            <w:tcBorders>
+              <w:top w:val="single" w:color="BFBFBF" w:sz="4"/>
+              <w:left w:val="single" w:color="BFBFBF" w:sz="4"/>
+              <w:bottom w:val="single" w:color="BFBFBF" w:sz="4"/>
+              <w:right w:val="single" w:color="BFBFBF" w:sz="4"/>
+            </w:tcBorders>
+          </w:tcPr>
+          <w:p>
+            <w:pPr>
+              <w:spacing w:after="40"/>
+            </w:pPr>
+            <w:r>
+              <w:rPr>
+                <w:rFonts w:ascii="Malgun Gothic" w:hAnsi="Malgun Gothic" w:cs="Malgun Gothic" w:eastAsia="Malgun Gothic"/>
+                <w:b w:val="0"/>
+                <w:i w:val="0"/>
+                <w:sz w:val="20"/>
+              </w:rPr>
+              <w:t>Rechtlich와 Praktisch는 대비되는 부사입니다.</w:t>
+            </w:r>
+          </w:p>
+        </w:tc>
+      </w:tr>
+      <w:tr>
+        <w:tc>
+          <w:tcPr>
+            <w:tcW w:type="dxa" w:w="1500"/>
+            <w:tcBorders>
+              <w:top w:val="single" w:color="BFBFBF" w:sz="4"/>
+              <w:left w:val="single" w:color="BFBFBF" w:sz="4"/>
+              <w:bottom w:val="single" w:color="BFBFBF" w:sz="4"/>
+              <w:right w:val="single" w:color="BFBFBF" w:sz="4"/>
+            </w:tcBorders>
+            <w:shd w:fill="DEEAF6" w:color="auto" w:val="clear"/>
+          </w:tcPr>
+          <w:p>
+            <w:r>
+              <w:rPr>
+                <w:rFonts w:ascii="Malgun Gothic" w:hAnsi="Malgun Gothic" w:cs="Malgun Gothic" w:eastAsia="Malgun Gothic"/>
+                <w:b/>
+                <w:i w:val="0"/>
+                <w:color w:val="1F3864"/>
+                <w:sz w:val="20"/>
+              </w:rPr>
+              <w:t>시제</w:t>
+            </w:r>
+          </w:p>
+        </w:tc>
+        <w:tc>
+          <w:tcPr>
+            <w:tcW w:type="dxa" w:w="8138"/>
+            <w:tcBorders>
+              <w:top w:val="single" w:color="BFBFBF" w:sz="4"/>
+              <w:left w:val="single" w:color="BFBFBF" w:sz="4"/>
+              <w:bottom w:val="single" w:color="BFBFBF" w:sz="4"/>
+              <w:right w:val="single" w:color="BFBFBF" w:sz="4"/>
+            </w:tcBorders>
+          </w:tcPr>
+          <w:p>
+            <w:pPr>
+              <w:spacing w:after="40"/>
+            </w:pPr>
+            <w:r>
+              <w:rPr>
+                <w:rFonts w:ascii="Malgun Gothic" w:hAnsi="Malgun Gothic" w:cs="Malgun Gothic" w:eastAsia="Malgun Gothic"/>
+                <w:b w:val="0"/>
+                <w:i w:val="0"/>
+                <w:sz w:val="20"/>
+              </w:rPr>
+              <w:t>setzt, orientieren은 현재형입니다.</w:t>
+            </w:r>
+          </w:p>
+        </w:tc>
+      </w:tr>
+    </w:tbl>
+    <w:p>
+      <w:pPr>
+        <w:spacing w:after="0"/>
+      </w:pPr>
+    </w:p>
+    <w:p>
+      <w:pPr>
+        <w:keepNext/>
+        <w:spacing w:before="160"/>
+      </w:pPr>
+      <w:r>
+        <w:rPr>
+          <w:rFonts w:ascii="Arial" w:hAnsi="Arial" w:cs="Arial" w:eastAsia="Malgun Gothic"/>
+          <w:b/>
+          <w:i w:val="0"/>
+          <w:sz w:val="22"/>
+        </w:rPr>
+        <w:t>51. Dennis: Ich bin der Erste in Berlin, der das versucht, hat Hanna gesagt. Das macht mir gleichzeitig Angst und Stolz.</w:t>
+      </w:r>
+    </w:p>
+    <w:p>
+      <w:pPr>
+        <w:keepNext/>
+        <w:ind w:left="340"/>
+      </w:pPr>
+      <w:r>
+        <w:rPr>
+          <w:rFonts w:ascii="Malgun Gothic" w:hAnsi="Malgun Gothic" w:cs="Malgun Gothic" w:eastAsia="Malgun Gothic"/>
+          <w:b w:val="0"/>
+          <w:i/>
+          <w:color w:val="404040"/>
+          <w:sz w:val="20"/>
+        </w:rPr>
+        <w:t>베를린에서 이걸 시도하는 첫 사람이라고 한나가 말했어요. 두려우면서도 자랑스러워요.</w:t>
+      </w:r>
+    </w:p>
+    <w:tbl>
+      <w:tblPr>
+        <w:tblW w:type="auto" w:w="0"/>
+        <w:tblLayout w:type="fixed"/>
+        <w:tblLook w:firstColumn="1" w:firstRow="1" w:lastColumn="0" w:lastRow="0" w:noHBand="0" w:noVBand="1" w:val="04A0"/>
+      </w:tblPr>
+      <w:tblGrid>
+        <w:gridCol w:w="4819"/>
+        <w:gridCol w:w="4819"/>
+      </w:tblGrid>
+      <w:tr>
+        <w:tc>
+          <w:tcPr>
+            <w:tcW w:type="dxa" w:w="1500"/>
+            <w:tcBorders>
+              <w:top w:val="single" w:color="BFBFBF" w:sz="4"/>
+              <w:left w:val="single" w:color="BFBFBF" w:sz="4"/>
+              <w:bottom w:val="single" w:color="BFBFBF" w:sz="4"/>
+              <w:right w:val="single" w:color="BFBFBF" w:sz="4"/>
+            </w:tcBorders>
+            <w:shd w:fill="DEEAF6" w:color="auto" w:val="clear"/>
+          </w:tcPr>
+          <w:p>
+            <w:r>
+              <w:rPr>
+                <w:rFonts w:ascii="Malgun Gothic" w:hAnsi="Malgun Gothic" w:cs="Malgun Gothic" w:eastAsia="Malgun Gothic"/>
+                <w:b/>
+                <w:i w:val="0"/>
+                <w:color w:val="1F3864"/>
+                <w:sz w:val="20"/>
+              </w:rPr>
+              <w:t>주요 단어</w:t>
+            </w:r>
+          </w:p>
+        </w:tc>
+        <w:tc>
+          <w:tcPr>
+            <w:tcW w:type="dxa" w:w="8138"/>
+            <w:tcBorders>
+              <w:top w:val="single" w:color="BFBFBF" w:sz="4"/>
+              <w:left w:val="single" w:color="BFBFBF" w:sz="4"/>
+              <w:bottom w:val="single" w:color="BFBFBF" w:sz="4"/>
+              <w:right w:val="single" w:color="BFBFBF" w:sz="4"/>
+            </w:tcBorders>
+          </w:tcPr>
+          <w:p>
+            <w:pPr>
+              <w:spacing w:after="40"/>
+            </w:pPr>
+            <w:r>
+              <w:rPr>
+                <w:rFonts w:ascii="Arial" w:hAnsi="Arial" w:cs="Arial" w:eastAsia="Malgun Gothic"/>
+                <w:b/>
+                <w:i w:val="0"/>
+                <w:sz w:val="20"/>
+              </w:rPr>
+              <w:t>der Stolz (단수)</w:t>
+            </w:r>
+            <w:r>
+              <w:rPr>
+                <w:rFonts w:ascii="Malgun Gothic" w:hAnsi="Malgun Gothic" w:cs="Malgun Gothic" w:eastAsia="Malgun Gothic"/>
+                <w:b w:val="0"/>
+                <w:i w:val="0"/>
+                <w:sz w:val="20"/>
+              </w:rPr>
+              <w:t xml:space="preserve">  —  자부심</w:t>
+            </w:r>
+          </w:p>
+          <w:p>
+            <w:pPr>
+              <w:spacing w:after="40"/>
+            </w:pPr>
+            <w:r>
+              <w:rPr>
+                <w:rFonts w:ascii="Arial" w:hAnsi="Arial" w:cs="Arial" w:eastAsia="Malgun Gothic"/>
+                <w:b/>
+                <w:i w:val="0"/>
+                <w:sz w:val="20"/>
+              </w:rPr>
+              <w:t>versuchen</w:t>
+            </w:r>
+            <w:r>
+              <w:rPr>
+                <w:rFonts w:ascii="Malgun Gothic" w:hAnsi="Malgun Gothic" w:cs="Malgun Gothic" w:eastAsia="Malgun Gothic"/>
+                <w:b w:val="0"/>
+                <w:i w:val="0"/>
+                <w:sz w:val="20"/>
+              </w:rPr>
+              <w:t xml:space="preserve">  —  시도하다</w:t>
+            </w:r>
+          </w:p>
+          <w:p>
+            <w:pPr>
+              <w:spacing w:after="40"/>
+            </w:pPr>
+            <w:r>
+              <w:rPr>
+                <w:rFonts w:ascii="Arial" w:hAnsi="Arial" w:cs="Arial" w:eastAsia="Malgun Gothic"/>
+                <w:b/>
+                <w:i w:val="0"/>
+                <w:sz w:val="20"/>
+              </w:rPr>
+              <w:t>gleichzeitig</w:t>
+            </w:r>
+            <w:r>
+              <w:rPr>
+                <w:rFonts w:ascii="Malgun Gothic" w:hAnsi="Malgun Gothic" w:cs="Malgun Gothic" w:eastAsia="Malgun Gothic"/>
+                <w:b w:val="0"/>
+                <w:i w:val="0"/>
+                <w:sz w:val="20"/>
+              </w:rPr>
+              <w:t xml:space="preserve">  —  동시에</w:t>
+            </w:r>
+          </w:p>
+        </w:tc>
+      </w:tr>
+      <w:tr>
+        <w:tc>
+          <w:tcPr>
+            <w:tcW w:type="dxa" w:w="1500"/>
+            <w:tcBorders>
+              <w:top w:val="single" w:color="BFBFBF" w:sz="4"/>
+              <w:left w:val="single" w:color="BFBFBF" w:sz="4"/>
+              <w:bottom w:val="single" w:color="BFBFBF" w:sz="4"/>
+              <w:right w:val="single" w:color="BFBFBF" w:sz="4"/>
+            </w:tcBorders>
+            <w:shd w:fill="DEEAF6" w:color="auto" w:val="clear"/>
+          </w:tcPr>
+          <w:p>
+            <w:r>
+              <w:rPr>
+                <w:rFonts w:ascii="Malgun Gothic" w:hAnsi="Malgun Gothic" w:cs="Malgun Gothic" w:eastAsia="Malgun Gothic"/>
+                <w:b/>
+                <w:i w:val="0"/>
+                <w:color w:val="1F3864"/>
+                <w:sz w:val="20"/>
+              </w:rPr>
+              <w:t>문법</w:t>
+            </w:r>
+          </w:p>
+        </w:tc>
+        <w:tc>
+          <w:tcPr>
+            <w:tcW w:type="dxa" w:w="8138"/>
+            <w:tcBorders>
+              <w:top w:val="single" w:color="BFBFBF" w:sz="4"/>
+              <w:left w:val="single" w:color="BFBFBF" w:sz="4"/>
+              <w:bottom w:val="single" w:color="BFBFBF" w:sz="4"/>
+              <w:right w:val="single" w:color="BFBFBF" w:sz="4"/>
+            </w:tcBorders>
+          </w:tcPr>
+          <w:p>
+            <w:pPr>
+              <w:spacing w:after="40"/>
+            </w:pPr>
+            <w:r>
+              <w:rPr>
+                <w:rFonts w:ascii="Malgun Gothic" w:hAnsi="Malgun Gothic" w:cs="Malgun Gothic" w:eastAsia="Malgun Gothic"/>
+                <w:b w:val="0"/>
+                <w:i w:val="0"/>
+                <w:sz w:val="20"/>
+              </w:rPr>
+              <w:t>der Erste in Berlin, der das versucht에서 der는 관계대명사이며 versucht가 끝에 옵니다. Das macht mir Angst에서 mir는 3격입니다.</w:t>
+            </w:r>
+          </w:p>
+        </w:tc>
+      </w:tr>
+      <w:tr>
+        <w:tc>
+          <w:tcPr>
+            <w:tcW w:type="dxa" w:w="1500"/>
+            <w:tcBorders>
+              <w:top w:val="single" w:color="BFBFBF" w:sz="4"/>
+              <w:left w:val="single" w:color="BFBFBF" w:sz="4"/>
+              <w:bottom w:val="single" w:color="BFBFBF" w:sz="4"/>
+              <w:right w:val="single" w:color="BFBFBF" w:sz="4"/>
+            </w:tcBorders>
+            <w:shd w:fill="DEEAF6" w:color="auto" w:val="clear"/>
+          </w:tcPr>
+          <w:p>
+            <w:r>
+              <w:rPr>
+                <w:rFonts w:ascii="Malgun Gothic" w:hAnsi="Malgun Gothic" w:cs="Malgun Gothic" w:eastAsia="Malgun Gothic"/>
+                <w:b/>
+                <w:i w:val="0"/>
+                <w:color w:val="1F3864"/>
+                <w:sz w:val="20"/>
+              </w:rPr>
+              <w:t>표현</w:t>
+            </w:r>
+          </w:p>
+        </w:tc>
+        <w:tc>
+          <w:tcPr>
+            <w:tcW w:type="dxa" w:w="8138"/>
+            <w:tcBorders>
+              <w:top w:val="single" w:color="BFBFBF" w:sz="4"/>
+              <w:left w:val="single" w:color="BFBFBF" w:sz="4"/>
+              <w:bottom w:val="single" w:color="BFBFBF" w:sz="4"/>
+              <w:right w:val="single" w:color="BFBFBF" w:sz="4"/>
+            </w:tcBorders>
+          </w:tcPr>
+          <w:p>
+            <w:pPr>
+              <w:spacing w:after="40"/>
+            </w:pPr>
+            <w:r>
+              <w:rPr>
+                <w:rFonts w:ascii="Malgun Gothic" w:hAnsi="Malgun Gothic" w:cs="Malgun Gothic" w:eastAsia="Malgun Gothic"/>
+                <w:b w:val="0"/>
+                <w:i w:val="0"/>
+                <w:sz w:val="20"/>
+              </w:rPr>
+              <w:t>Angst machen은 두렵게 한다는 표현입니다.</w:t>
+            </w:r>
+          </w:p>
+        </w:tc>
+      </w:tr>
+      <w:tr>
+        <w:tc>
+          <w:tcPr>
+            <w:tcW w:type="dxa" w:w="1500"/>
+            <w:tcBorders>
+              <w:top w:val="single" w:color="BFBFBF" w:sz="4"/>
+              <w:left w:val="single" w:color="BFBFBF" w:sz="4"/>
+              <w:bottom w:val="single" w:color="BFBFBF" w:sz="4"/>
+              <w:right w:val="single" w:color="BFBFBF" w:sz="4"/>
+            </w:tcBorders>
+            <w:shd w:fill="DEEAF6" w:color="auto" w:val="clear"/>
+          </w:tcPr>
+          <w:p>
+            <w:r>
+              <w:rPr>
+                <w:rFonts w:ascii="Malgun Gothic" w:hAnsi="Malgun Gothic" w:cs="Malgun Gothic" w:eastAsia="Malgun Gothic"/>
+                <w:b/>
+                <w:i w:val="0"/>
+                <w:color w:val="1F3864"/>
+                <w:sz w:val="20"/>
+              </w:rPr>
+              <w:t>시제</w:t>
+            </w:r>
+          </w:p>
+        </w:tc>
+        <w:tc>
+          <w:tcPr>
+            <w:tcW w:type="dxa" w:w="8138"/>
+            <w:tcBorders>
+              <w:top w:val="single" w:color="BFBFBF" w:sz="4"/>
+              <w:left w:val="single" w:color="BFBFBF" w:sz="4"/>
+              <w:bottom w:val="single" w:color="BFBFBF" w:sz="4"/>
+              <w:right w:val="single" w:color="BFBFBF" w:sz="4"/>
+            </w:tcBorders>
+          </w:tcPr>
+          <w:p>
+            <w:pPr>
+              <w:spacing w:after="40"/>
+            </w:pPr>
+            <w:r>
+              <w:rPr>
+                <w:rFonts w:ascii="Malgun Gothic" w:hAnsi="Malgun Gothic" w:cs="Malgun Gothic" w:eastAsia="Malgun Gothic"/>
+                <w:b w:val="0"/>
+                <w:i w:val="0"/>
+                <w:sz w:val="20"/>
+              </w:rPr>
+              <w:t>bin, macht는 현재형이고 hat ... gesagt는 현재완료입니다.</w:t>
+            </w:r>
+          </w:p>
+        </w:tc>
+      </w:tr>
+    </w:tbl>
+    <w:p>
+      <w:pPr>
+        <w:spacing w:after="0"/>
+      </w:pPr>
+    </w:p>
+    <w:p>
+      <w:pPr>
+        <w:keepNext/>
+        <w:spacing w:before="160"/>
+      </w:pPr>
+      <w:r>
+        <w:rPr>
+          <w:rFonts w:ascii="Arial" w:hAnsi="Arial" w:cs="Arial" w:eastAsia="Malgun Gothic"/>
+          <w:b/>
+          <w:i w:val="0"/>
+          <w:sz w:val="22"/>
+        </w:rPr>
+        <w:t>52. Jonas: Ich lege Dennis die Hand auf die Schulter. Vor drei Monaten war er ein Name auf einer Sperrliste, heute ist er ein Kläger.</w:t>
+      </w:r>
+    </w:p>
+    <w:p>
+      <w:pPr>
+        <w:keepNext/>
+        <w:ind w:left="340"/>
+      </w:pPr>
+      <w:r>
+        <w:rPr>
+          <w:rFonts w:ascii="Malgun Gothic" w:hAnsi="Malgun Gothic" w:cs="Malgun Gothic" w:eastAsia="Malgun Gothic"/>
+          <w:b w:val="0"/>
+          <w:i/>
+          <w:color w:val="404040"/>
+          <w:sz w:val="20"/>
+        </w:rPr>
+        <w:t>나는 데니스의 어깨에 손을 얹는다. 석 달 전만 해도 그는 차단 명단의 이름 하나였는데, 지금은 원고다.</w:t>
+      </w:r>
+    </w:p>
+    <w:tbl>
+      <w:tblPr>
+        <w:tblW w:type="auto" w:w="0"/>
+        <w:tblLayout w:type="fixed"/>
+        <w:tblLook w:firstColumn="1" w:firstRow="1" w:lastColumn="0" w:lastRow="0" w:noHBand="0" w:noVBand="1" w:val="04A0"/>
+      </w:tblPr>
+      <w:tblGrid>
+        <w:gridCol w:w="4819"/>
+        <w:gridCol w:w="4819"/>
+      </w:tblGrid>
+      <w:tr>
+        <w:tc>
+          <w:tcPr>
+            <w:tcW w:type="dxa" w:w="1500"/>
+            <w:tcBorders>
+              <w:top w:val="single" w:color="BFBFBF" w:sz="4"/>
+              <w:left w:val="single" w:color="BFBFBF" w:sz="4"/>
+              <w:bottom w:val="single" w:color="BFBFBF" w:sz="4"/>
+              <w:right w:val="single" w:color="BFBFBF" w:sz="4"/>
+            </w:tcBorders>
+            <w:shd w:fill="DEEAF6" w:color="auto" w:val="clear"/>
+          </w:tcPr>
+          <w:p>
+            <w:r>
+              <w:rPr>
+                <w:rFonts w:ascii="Malgun Gothic" w:hAnsi="Malgun Gothic" w:cs="Malgun Gothic" w:eastAsia="Malgun Gothic"/>
+                <w:b/>
+                <w:i w:val="0"/>
+                <w:color w:val="1F3864"/>
+                <w:sz w:val="20"/>
+              </w:rPr>
+              <w:t>주요 단어</w:t>
+            </w:r>
+          </w:p>
+        </w:tc>
+        <w:tc>
+          <w:tcPr>
+            <w:tcW w:type="dxa" w:w="8138"/>
+            <w:tcBorders>
+              <w:top w:val="single" w:color="BFBFBF" w:sz="4"/>
+              <w:left w:val="single" w:color="BFBFBF" w:sz="4"/>
+              <w:bottom w:val="single" w:color="BFBFBF" w:sz="4"/>
+              <w:right w:val="single" w:color="BFBFBF" w:sz="4"/>
+            </w:tcBorders>
+          </w:tcPr>
+          <w:p>
+            <w:pPr>
+              <w:spacing w:after="40"/>
+            </w:pPr>
+            <w:r>
+              <w:rPr>
+                <w:rFonts w:ascii="Arial" w:hAnsi="Arial" w:cs="Arial" w:eastAsia="Malgun Gothic"/>
+                <w:b/>
+                <w:i w:val="0"/>
+                <w:sz w:val="20"/>
+              </w:rPr>
+              <w:t>die Schulter, -n</w:t>
+            </w:r>
+            <w:r>
+              <w:rPr>
+                <w:rFonts w:ascii="Malgun Gothic" w:hAnsi="Malgun Gothic" w:cs="Malgun Gothic" w:eastAsia="Malgun Gothic"/>
+                <w:b w:val="0"/>
+                <w:i w:val="0"/>
+                <w:sz w:val="20"/>
+              </w:rPr>
+              <w:t xml:space="preserve">  —  어깨</w:t>
+            </w:r>
+          </w:p>
+          <w:p>
+            <w:pPr>
+              <w:spacing w:after="40"/>
+            </w:pPr>
+            <w:r>
+              <w:rPr>
+                <w:rFonts w:ascii="Arial" w:hAnsi="Arial" w:cs="Arial" w:eastAsia="Malgun Gothic"/>
+                <w:b/>
+                <w:i w:val="0"/>
+                <w:sz w:val="20"/>
+              </w:rPr>
+              <w:t>die Sperrliste, -n</w:t>
+            </w:r>
+            <w:r>
+              <w:rPr>
+                <w:rFonts w:ascii="Malgun Gothic" w:hAnsi="Malgun Gothic" w:cs="Malgun Gothic" w:eastAsia="Malgun Gothic"/>
+                <w:b w:val="0"/>
+                <w:i w:val="0"/>
+                <w:sz w:val="20"/>
+              </w:rPr>
+              <w:t xml:space="preserve">  —  차단 명단</w:t>
+            </w:r>
+          </w:p>
+          <w:p>
+            <w:pPr>
+              <w:spacing w:after="40"/>
+            </w:pPr>
+            <w:r>
+              <w:rPr>
+                <w:rFonts w:ascii="Arial" w:hAnsi="Arial" w:cs="Arial" w:eastAsia="Malgun Gothic"/>
+                <w:b/>
+                <w:i w:val="0"/>
+                <w:sz w:val="20"/>
+              </w:rPr>
+              <w:t>der Kläger, -</w:t>
+            </w:r>
+            <w:r>
+              <w:rPr>
+                <w:rFonts w:ascii="Malgun Gothic" w:hAnsi="Malgun Gothic" w:cs="Malgun Gothic" w:eastAsia="Malgun Gothic"/>
+                <w:b w:val="0"/>
+                <w:i w:val="0"/>
+                <w:sz w:val="20"/>
+              </w:rPr>
+              <w:t xml:space="preserve">  —  원고</w:t>
+            </w:r>
+          </w:p>
+        </w:tc>
+      </w:tr>
+      <w:tr>
+        <w:tc>
+          <w:tcPr>
+            <w:tcW w:type="dxa" w:w="1500"/>
+            <w:tcBorders>
+              <w:top w:val="single" w:color="BFBFBF" w:sz="4"/>
+              <w:left w:val="single" w:color="BFBFBF" w:sz="4"/>
+              <w:bottom w:val="single" w:color="BFBFBF" w:sz="4"/>
+              <w:right w:val="single" w:color="BFBFBF" w:sz="4"/>
+            </w:tcBorders>
+            <w:shd w:fill="DEEAF6" w:color="auto" w:val="clear"/>
+          </w:tcPr>
+          <w:p>
+            <w:r>
+              <w:rPr>
+                <w:rFonts w:ascii="Malgun Gothic" w:hAnsi="Malgun Gothic" w:cs="Malgun Gothic" w:eastAsia="Malgun Gothic"/>
+                <w:b/>
+                <w:i w:val="0"/>
+                <w:color w:val="1F3864"/>
+                <w:sz w:val="20"/>
+              </w:rPr>
+              <w:t>문법</w:t>
+            </w:r>
+          </w:p>
+        </w:tc>
+        <w:tc>
+          <w:tcPr>
+            <w:tcW w:type="dxa" w:w="8138"/>
+            <w:tcBorders>
+              <w:top w:val="single" w:color="BFBFBF" w:sz="4"/>
+              <w:left w:val="single" w:color="BFBFBF" w:sz="4"/>
+              <w:bottom w:val="single" w:color="BFBFBF" w:sz="4"/>
+              <w:right w:val="single" w:color="BFBFBF" w:sz="4"/>
+            </w:tcBorders>
+          </w:tcPr>
+          <w:p>
+            <w:pPr>
+              <w:spacing w:after="40"/>
+            </w:pPr>
+            <w:r>
+              <w:rPr>
+                <w:rFonts w:ascii="Malgun Gothic" w:hAnsi="Malgun Gothic" w:cs="Malgun Gothic" w:eastAsia="Malgun Gothic"/>
+                <w:b w:val="0"/>
+                <w:i w:val="0"/>
+                <w:sz w:val="20"/>
+              </w:rPr>
+              <w:t>Ich lege Dennis die Hand auf die Schulter에서 Dennis는 3격이고 auf + 4격은 방향입니다. vor drei Monaten은 vor + 3격입니다.</w:t>
+            </w:r>
+          </w:p>
+        </w:tc>
+      </w:tr>
+      <w:tr>
+        <w:tc>
+          <w:tcPr>
+            <w:tcW w:type="dxa" w:w="1500"/>
+            <w:tcBorders>
+              <w:top w:val="single" w:color="BFBFBF" w:sz="4"/>
+              <w:left w:val="single" w:color="BFBFBF" w:sz="4"/>
+              <w:bottom w:val="single" w:color="BFBFBF" w:sz="4"/>
+              <w:right w:val="single" w:color="BFBFBF" w:sz="4"/>
+            </w:tcBorders>
+            <w:shd w:fill="DEEAF6" w:color="auto" w:val="clear"/>
+          </w:tcPr>
+          <w:p>
+            <w:r>
+              <w:rPr>
+                <w:rFonts w:ascii="Malgun Gothic" w:hAnsi="Malgun Gothic" w:cs="Malgun Gothic" w:eastAsia="Malgun Gothic"/>
+                <w:b/>
+                <w:i w:val="0"/>
+                <w:color w:val="1F3864"/>
+                <w:sz w:val="20"/>
+              </w:rPr>
+              <w:t>표현</w:t>
+            </w:r>
+          </w:p>
+        </w:tc>
+        <w:tc>
+          <w:tcPr>
+            <w:tcW w:type="dxa" w:w="8138"/>
+            <w:tcBorders>
+              <w:top w:val="single" w:color="BFBFBF" w:sz="4"/>
+              <w:left w:val="single" w:color="BFBFBF" w:sz="4"/>
+              <w:bottom w:val="single" w:color="BFBFBF" w:sz="4"/>
+              <w:right w:val="single" w:color="BFBFBF" w:sz="4"/>
+            </w:tcBorders>
+          </w:tcPr>
+          <w:p>
+            <w:pPr>
+              <w:spacing w:after="40"/>
+            </w:pPr>
+            <w:r>
+              <w:rPr>
+                <w:rFonts w:ascii="Malgun Gothic" w:hAnsi="Malgun Gothic" w:cs="Malgun Gothic" w:eastAsia="Malgun Gothic"/>
+                <w:b w:val="0"/>
+                <w:i w:val="0"/>
+                <w:sz w:val="20"/>
+              </w:rPr>
+              <w:t>ein Name auf einer Sperrliste는 auf + 3격입니다.</w:t>
+            </w:r>
+          </w:p>
+        </w:tc>
+      </w:tr>
+      <w:tr>
+        <w:tc>
+          <w:tcPr>
+            <w:tcW w:type="dxa" w:w="1500"/>
+            <w:tcBorders>
+              <w:top w:val="single" w:color="BFBFBF" w:sz="4"/>
+              <w:left w:val="single" w:color="BFBFBF" w:sz="4"/>
+              <w:bottom w:val="single" w:color="BFBFBF" w:sz="4"/>
+              <w:right w:val="single" w:color="BFBFBF" w:sz="4"/>
+            </w:tcBorders>
+            <w:shd w:fill="DEEAF6" w:color="auto" w:val="clear"/>
+          </w:tcPr>
+          <w:p>
+            <w:r>
+              <w:rPr>
+                <w:rFonts w:ascii="Malgun Gothic" w:hAnsi="Malgun Gothic" w:cs="Malgun Gothic" w:eastAsia="Malgun Gothic"/>
+                <w:b/>
+                <w:i w:val="0"/>
+                <w:color w:val="1F3864"/>
+                <w:sz w:val="20"/>
+              </w:rPr>
+              <w:t>시제</w:t>
+            </w:r>
+          </w:p>
+        </w:tc>
+        <w:tc>
+          <w:tcPr>
+            <w:tcW w:type="dxa" w:w="8138"/>
+            <w:tcBorders>
+              <w:top w:val="single" w:color="BFBFBF" w:sz="4"/>
+              <w:left w:val="single" w:color="BFBFBF" w:sz="4"/>
+              <w:bottom w:val="single" w:color="BFBFBF" w:sz="4"/>
+              <w:right w:val="single" w:color="BFBFBF" w:sz="4"/>
+            </w:tcBorders>
+          </w:tcPr>
+          <w:p>
+            <w:pPr>
+              <w:spacing w:after="40"/>
+            </w:pPr>
+            <w:r>
+              <w:rPr>
+                <w:rFonts w:ascii="Malgun Gothic" w:hAnsi="Malgun Gothic" w:cs="Malgun Gothic" w:eastAsia="Malgun Gothic"/>
+                <w:b w:val="0"/>
+                <w:i w:val="0"/>
+                <w:sz w:val="20"/>
+              </w:rPr>
+              <w:t>lege, ist는 현재형이고 war는 과거형입니다.</w:t>
+            </w:r>
+          </w:p>
+        </w:tc>
+      </w:tr>
+    </w:tbl>
+    <w:p>
+      <w:pPr>
+        <w:spacing w:after="0"/>
+      </w:pPr>
+    </w:p>
+    <w:p>
+      <w:pPr>
+        <w:keepNext/>
+        <w:spacing w:before="160"/>
+      </w:pPr>
+      <w:r>
+        <w:rPr>
+          <w:rFonts w:ascii="Arial" w:hAnsi="Arial" w:cs="Arial" w:eastAsia="Malgun Gothic"/>
+          <w:b/>
+          <w:i w:val="0"/>
+          <w:sz w:val="22"/>
+        </w:rPr>
+        <w:t>53. Dennis: Mein Vater hat angerufen. Er hat gesagt: „Ich habe nie verstanden, was du machst. Jetzt habe ich es im Radio gehört."</w:t>
+      </w:r>
+    </w:p>
+    <w:p>
+      <w:pPr>
+        <w:keepNext/>
+        <w:ind w:left="340"/>
+      </w:pPr>
+      <w:r>
+        <w:rPr>
+          <w:rFonts w:ascii="Malgun Gothic" w:hAnsi="Malgun Gothic" w:cs="Malgun Gothic" w:eastAsia="Malgun Gothic"/>
+          <w:b w:val="0"/>
+          <w:i/>
+          <w:color w:val="404040"/>
+          <w:sz w:val="20"/>
+        </w:rPr>
+        <w:t>아버지가 전화하셨어요. 이렇게 말씀하셨어요. 네가 뭘 하는지 이해한 적이 없었는데 이제 라디오에서 들었다고요.</w:t>
+      </w:r>
+    </w:p>
+    <w:tbl>
+      <w:tblPr>
+        <w:tblW w:type="auto" w:w="0"/>
+        <w:tblLayout w:type="fixed"/>
+        <w:tblLook w:firstColumn="1" w:firstRow="1" w:lastColumn="0" w:lastRow="0" w:noHBand="0" w:noVBand="1" w:val="04A0"/>
+      </w:tblPr>
+      <w:tblGrid>
+        <w:gridCol w:w="4819"/>
+        <w:gridCol w:w="4819"/>
+      </w:tblGrid>
+      <w:tr>
+        <w:tc>
+          <w:tcPr>
+            <w:tcW w:type="dxa" w:w="1500"/>
+            <w:tcBorders>
+              <w:top w:val="single" w:color="BFBFBF" w:sz="4"/>
+              <w:left w:val="single" w:color="BFBFBF" w:sz="4"/>
+              <w:bottom w:val="single" w:color="BFBFBF" w:sz="4"/>
+              <w:right w:val="single" w:color="BFBFBF" w:sz="4"/>
+            </w:tcBorders>
+            <w:shd w:fill="DEEAF6" w:color="auto" w:val="clear"/>
+          </w:tcPr>
+          <w:p>
+            <w:r>
+              <w:rPr>
+                <w:rFonts w:ascii="Malgun Gothic" w:hAnsi="Malgun Gothic" w:cs="Malgun Gothic" w:eastAsia="Malgun Gothic"/>
+                <w:b/>
+                <w:i w:val="0"/>
+                <w:color w:val="1F3864"/>
+                <w:sz w:val="20"/>
+              </w:rPr>
+              <w:t>주요 단어</w:t>
+            </w:r>
+          </w:p>
+        </w:tc>
+        <w:tc>
+          <w:tcPr>
+            <w:tcW w:type="dxa" w:w="8138"/>
+            <w:tcBorders>
+              <w:top w:val="single" w:color="BFBFBF" w:sz="4"/>
+              <w:left w:val="single" w:color="BFBFBF" w:sz="4"/>
+              <w:bottom w:val="single" w:color="BFBFBF" w:sz="4"/>
+              <w:right w:val="single" w:color="BFBFBF" w:sz="4"/>
+            </w:tcBorders>
+          </w:tcPr>
+          <w:p>
+            <w:pPr>
+              <w:spacing w:after="40"/>
+            </w:pPr>
+            <w:r>
+              <w:rPr>
+                <w:rFonts w:ascii="Arial" w:hAnsi="Arial" w:cs="Arial" w:eastAsia="Malgun Gothic"/>
+                <w:b/>
+                <w:i w:val="0"/>
+                <w:sz w:val="20"/>
+              </w:rPr>
+              <w:t>das Radio, -s</w:t>
+            </w:r>
+            <w:r>
+              <w:rPr>
+                <w:rFonts w:ascii="Malgun Gothic" w:hAnsi="Malgun Gothic" w:cs="Malgun Gothic" w:eastAsia="Malgun Gothic"/>
+                <w:b w:val="0"/>
+                <w:i w:val="0"/>
+                <w:sz w:val="20"/>
+              </w:rPr>
+              <w:t xml:space="preserve">  —  라디오</w:t>
+            </w:r>
+          </w:p>
+          <w:p>
+            <w:pPr>
+              <w:spacing w:after="40"/>
+            </w:pPr>
+            <w:r>
+              <w:rPr>
+                <w:rFonts w:ascii="Arial" w:hAnsi="Arial" w:cs="Arial" w:eastAsia="Malgun Gothic"/>
+                <w:b/>
+                <w:i w:val="0"/>
+                <w:sz w:val="20"/>
+              </w:rPr>
+              <w:t>anrufen</w:t>
+            </w:r>
+            <w:r>
+              <w:rPr>
+                <w:rFonts w:ascii="Malgun Gothic" w:hAnsi="Malgun Gothic" w:cs="Malgun Gothic" w:eastAsia="Malgun Gothic"/>
+                <w:b w:val="0"/>
+                <w:i w:val="0"/>
+                <w:sz w:val="20"/>
+              </w:rPr>
+              <w:t xml:space="preserve">  —  전화하다</w:t>
+            </w:r>
+          </w:p>
+          <w:p>
+            <w:pPr>
+              <w:spacing w:after="40"/>
+            </w:pPr>
+            <w:r>
+              <w:rPr>
+                <w:rFonts w:ascii="Arial" w:hAnsi="Arial" w:cs="Arial" w:eastAsia="Malgun Gothic"/>
+                <w:b/>
+                <w:i w:val="0"/>
+                <w:sz w:val="20"/>
+              </w:rPr>
+              <w:t>verstehen</w:t>
+            </w:r>
+            <w:r>
+              <w:rPr>
+                <w:rFonts w:ascii="Malgun Gothic" w:hAnsi="Malgun Gothic" w:cs="Malgun Gothic" w:eastAsia="Malgun Gothic"/>
+                <w:b w:val="0"/>
+                <w:i w:val="0"/>
+                <w:sz w:val="20"/>
+              </w:rPr>
+              <w:t xml:space="preserve">  —  이해하다</w:t>
+            </w:r>
+          </w:p>
+        </w:tc>
+      </w:tr>
+      <w:tr>
+        <w:tc>
+          <w:tcPr>
+            <w:tcW w:type="dxa" w:w="1500"/>
+            <w:tcBorders>
+              <w:top w:val="single" w:color="BFBFBF" w:sz="4"/>
+              <w:left w:val="single" w:color="BFBFBF" w:sz="4"/>
+              <w:bottom w:val="single" w:color="BFBFBF" w:sz="4"/>
+              <w:right w:val="single" w:color="BFBFBF" w:sz="4"/>
+            </w:tcBorders>
+            <w:shd w:fill="DEEAF6" w:color="auto" w:val="clear"/>
+          </w:tcPr>
+          <w:p>
+            <w:r>
+              <w:rPr>
+                <w:rFonts w:ascii="Malgun Gothic" w:hAnsi="Malgun Gothic" w:cs="Malgun Gothic" w:eastAsia="Malgun Gothic"/>
+                <w:b/>
+                <w:i w:val="0"/>
+                <w:color w:val="1F3864"/>
+                <w:sz w:val="20"/>
+              </w:rPr>
+              <w:t>문법</w:t>
+            </w:r>
+          </w:p>
+        </w:tc>
+        <w:tc>
+          <w:tcPr>
+            <w:tcW w:type="dxa" w:w="8138"/>
+            <w:tcBorders>
+              <w:top w:val="single" w:color="BFBFBF" w:sz="4"/>
+              <w:left w:val="single" w:color="BFBFBF" w:sz="4"/>
+              <w:bottom w:val="single" w:color="BFBFBF" w:sz="4"/>
+              <w:right w:val="single" w:color="BFBFBF" w:sz="4"/>
+            </w:tcBorders>
+          </w:tcPr>
+          <w:p>
+            <w:pPr>
+              <w:spacing w:after="40"/>
+            </w:pPr>
+            <w:r>
+              <w:rPr>
+                <w:rFonts w:ascii="Malgun Gothic" w:hAnsi="Malgun Gothic" w:cs="Malgun Gothic" w:eastAsia="Malgun Gothic"/>
+                <w:b w:val="0"/>
+                <w:i w:val="0"/>
+                <w:sz w:val="20"/>
+              </w:rPr>
+              <w:t>Er hat angerufen과 Er hat gesagt는 현재완료입니다. was du machst는 간접 의문절이며 machst가 끝에 옵니다.</w:t>
+            </w:r>
+          </w:p>
+        </w:tc>
+      </w:tr>
+      <w:tr>
+        <w:tc>
+          <w:tcPr>
+            <w:tcW w:type="dxa" w:w="1500"/>
+            <w:tcBorders>
+              <w:top w:val="single" w:color="BFBFBF" w:sz="4"/>
+              <w:left w:val="single" w:color="BFBFBF" w:sz="4"/>
+              <w:bottom w:val="single" w:color="BFBFBF" w:sz="4"/>
+              <w:right w:val="single" w:color="BFBFBF" w:sz="4"/>
+            </w:tcBorders>
+            <w:shd w:fill="DEEAF6" w:color="auto" w:val="clear"/>
+          </w:tcPr>
+          <w:p>
+            <w:r>
+              <w:rPr>
+                <w:rFonts w:ascii="Malgun Gothic" w:hAnsi="Malgun Gothic" w:cs="Malgun Gothic" w:eastAsia="Malgun Gothic"/>
+                <w:b/>
+                <w:i w:val="0"/>
+                <w:color w:val="1F3864"/>
+                <w:sz w:val="20"/>
+              </w:rPr>
+              <w:t>표현</w:t>
+            </w:r>
+          </w:p>
+        </w:tc>
+        <w:tc>
+          <w:tcPr>
+            <w:tcW w:type="dxa" w:w="8138"/>
+            <w:tcBorders>
+              <w:top w:val="single" w:color="BFBFBF" w:sz="4"/>
+              <w:left w:val="single" w:color="BFBFBF" w:sz="4"/>
+              <w:bottom w:val="single" w:color="BFBFBF" w:sz="4"/>
+              <w:right w:val="single" w:color="BFBFBF" w:sz="4"/>
+            </w:tcBorders>
+          </w:tcPr>
+          <w:p>
+            <w:pPr>
+              <w:spacing w:after="40"/>
+            </w:pPr>
+            <w:r>
+              <w:rPr>
+                <w:rFonts w:ascii="Malgun Gothic" w:hAnsi="Malgun Gothic" w:cs="Malgun Gothic" w:eastAsia="Malgun Gothic"/>
+                <w:b w:val="0"/>
+                <w:i w:val="0"/>
+                <w:sz w:val="20"/>
+              </w:rPr>
+              <w:t>im Radio hören은 라디오에서 듣는다는 표현입니다.</w:t>
+            </w:r>
+          </w:p>
+        </w:tc>
+      </w:tr>
+      <w:tr>
+        <w:tc>
+          <w:tcPr>
+            <w:tcW w:type="dxa" w:w="1500"/>
+            <w:tcBorders>
+              <w:top w:val="single" w:color="BFBFBF" w:sz="4"/>
+              <w:left w:val="single" w:color="BFBFBF" w:sz="4"/>
+              <w:bottom w:val="single" w:color="BFBFBF" w:sz="4"/>
+              <w:right w:val="single" w:color="BFBFBF" w:sz="4"/>
+            </w:tcBorders>
+            <w:shd w:fill="DEEAF6" w:color="auto" w:val="clear"/>
+          </w:tcPr>
+          <w:p>
+            <w:r>
+              <w:rPr>
+                <w:rFonts w:ascii="Malgun Gothic" w:hAnsi="Malgun Gothic" w:cs="Malgun Gothic" w:eastAsia="Malgun Gothic"/>
+                <w:b/>
+                <w:i w:val="0"/>
+                <w:color w:val="1F3864"/>
+                <w:sz w:val="20"/>
+              </w:rPr>
+              <w:t>시제</w:t>
+            </w:r>
+          </w:p>
+        </w:tc>
+        <w:tc>
+          <w:tcPr>
+            <w:tcW w:type="dxa" w:w="8138"/>
+            <w:tcBorders>
+              <w:top w:val="single" w:color="BFBFBF" w:sz="4"/>
+              <w:left w:val="single" w:color="BFBFBF" w:sz="4"/>
+              <w:bottom w:val="single" w:color="BFBFBF" w:sz="4"/>
+              <w:right w:val="single" w:color="BFBFBF" w:sz="4"/>
+            </w:tcBorders>
+          </w:tcPr>
+          <w:p>
+            <w:pPr>
+              <w:spacing w:after="40"/>
+            </w:pPr>
+            <w:r>
+              <w:rPr>
+                <w:rFonts w:ascii="Malgun Gothic" w:hAnsi="Malgun Gothic" w:cs="Malgun Gothic" w:eastAsia="Malgun Gothic"/>
+                <w:b w:val="0"/>
+                <w:i w:val="0"/>
+                <w:sz w:val="20"/>
+              </w:rPr>
+              <w:t>hat angerufen, hat gesagt, habe ... verstanden, habe ... gehört는 현재완료입니다.</w:t>
+            </w:r>
+          </w:p>
+        </w:tc>
+      </w:tr>
+    </w:tbl>
+    <w:p>
+      <w:pPr>
+        <w:spacing w:after="0"/>
+      </w:pPr>
+    </w:p>
+    <w:p>
+      <w:pPr>
+        <w:keepNext/>
+        <w:spacing w:before="160"/>
+      </w:pPr>
+      <w:r>
+        <w:rPr>
+          <w:rFonts w:ascii="Arial" w:hAnsi="Arial" w:cs="Arial" w:eastAsia="Malgun Gothic"/>
+          <w:b/>
+          <w:i w:val="0"/>
+          <w:sz w:val="22"/>
+        </w:rPr>
+        <w:t>54. Elif: Im Radio? Es war schon im Radio? Wir sind seit zwei Wochen hier, und da berichten sie schon?</w:t>
+      </w:r>
+    </w:p>
+    <w:p>
+      <w:pPr>
+        <w:keepNext/>
+        <w:ind w:left="340"/>
+      </w:pPr>
+      <w:r>
+        <w:rPr>
+          <w:rFonts w:ascii="Malgun Gothic" w:hAnsi="Malgun Gothic" w:cs="Malgun Gothic" w:eastAsia="Malgun Gothic"/>
+          <w:b w:val="0"/>
+          <w:i/>
+          <w:color w:val="404040"/>
+          <w:sz w:val="20"/>
+        </w:rPr>
+        <w:t>라디오에서요? 벌써 라디오에 나왔어요? 우리가 여기 시작한 지 이 주인데 벌써 보도한다고요?</w:t>
+      </w:r>
+    </w:p>
+    <w:tbl>
+      <w:tblPr>
+        <w:tblW w:type="auto" w:w="0"/>
+        <w:tblLayout w:type="fixed"/>
+        <w:tblLook w:firstColumn="1" w:firstRow="1" w:lastColumn="0" w:lastRow="0" w:noHBand="0" w:noVBand="1" w:val="04A0"/>
+      </w:tblPr>
+      <w:tblGrid>
+        <w:gridCol w:w="4819"/>
+        <w:gridCol w:w="4819"/>
+      </w:tblGrid>
+      <w:tr>
+        <w:tc>
+          <w:tcPr>
+            <w:tcW w:type="dxa" w:w="1500"/>
+            <w:tcBorders>
+              <w:top w:val="single" w:color="BFBFBF" w:sz="4"/>
+              <w:left w:val="single" w:color="BFBFBF" w:sz="4"/>
+              <w:bottom w:val="single" w:color="BFBFBF" w:sz="4"/>
+              <w:right w:val="single" w:color="BFBFBF" w:sz="4"/>
+            </w:tcBorders>
+            <w:shd w:fill="DEEAF6" w:color="auto" w:val="clear"/>
+          </w:tcPr>
+          <w:p>
+            <w:r>
+              <w:rPr>
+                <w:rFonts w:ascii="Malgun Gothic" w:hAnsi="Malgun Gothic" w:cs="Malgun Gothic" w:eastAsia="Malgun Gothic"/>
+                <w:b/>
+                <w:i w:val="0"/>
+                <w:color w:val="1F3864"/>
+                <w:sz w:val="20"/>
+              </w:rPr>
+              <w:t>주요 단어</w:t>
+            </w:r>
+          </w:p>
+        </w:tc>
+        <w:tc>
+          <w:tcPr>
+            <w:tcW w:type="dxa" w:w="8138"/>
+            <w:tcBorders>
+              <w:top w:val="single" w:color="BFBFBF" w:sz="4"/>
+              <w:left w:val="single" w:color="BFBFBF" w:sz="4"/>
+              <w:bottom w:val="single" w:color="BFBFBF" w:sz="4"/>
+              <w:right w:val="single" w:color="BFBFBF" w:sz="4"/>
+            </w:tcBorders>
+          </w:tcPr>
+          <w:p>
+            <w:pPr>
+              <w:spacing w:after="40"/>
+            </w:pPr>
+            <w:r>
+              <w:rPr>
+                <w:rFonts w:ascii="Arial" w:hAnsi="Arial" w:cs="Arial" w:eastAsia="Malgun Gothic"/>
+                <w:b/>
+                <w:i w:val="0"/>
+                <w:sz w:val="20"/>
+              </w:rPr>
+              <w:t>berichten</w:t>
+            </w:r>
+            <w:r>
+              <w:rPr>
+                <w:rFonts w:ascii="Malgun Gothic" w:hAnsi="Malgun Gothic" w:cs="Malgun Gothic" w:eastAsia="Malgun Gothic"/>
+                <w:b w:val="0"/>
+                <w:i w:val="0"/>
+                <w:sz w:val="20"/>
+              </w:rPr>
+              <w:t xml:space="preserve">  —  보도하다</w:t>
+            </w:r>
+          </w:p>
+          <w:p>
+            <w:pPr>
+              <w:spacing w:after="40"/>
+            </w:pPr>
+            <w:r>
+              <w:rPr>
+                <w:rFonts w:ascii="Arial" w:hAnsi="Arial" w:cs="Arial" w:eastAsia="Malgun Gothic"/>
+                <w:b/>
+                <w:i w:val="0"/>
+                <w:sz w:val="20"/>
+              </w:rPr>
+              <w:t>das Radio, -s</w:t>
+            </w:r>
+            <w:r>
+              <w:rPr>
+                <w:rFonts w:ascii="Malgun Gothic" w:hAnsi="Malgun Gothic" w:cs="Malgun Gothic" w:eastAsia="Malgun Gothic"/>
+                <w:b w:val="0"/>
+                <w:i w:val="0"/>
+                <w:sz w:val="20"/>
+              </w:rPr>
+              <w:t xml:space="preserve">  —  라디오</w:t>
+            </w:r>
+          </w:p>
+          <w:p>
+            <w:pPr>
+              <w:spacing w:after="40"/>
+            </w:pPr>
+            <w:r>
+              <w:rPr>
+                <w:rFonts w:ascii="Arial" w:hAnsi="Arial" w:cs="Arial" w:eastAsia="Malgun Gothic"/>
+                <w:b/>
+                <w:i w:val="0"/>
+                <w:sz w:val="20"/>
+              </w:rPr>
+              <w:t>seit zwei Wochen</w:t>
+            </w:r>
+            <w:r>
+              <w:rPr>
+                <w:rFonts w:ascii="Malgun Gothic" w:hAnsi="Malgun Gothic" w:cs="Malgun Gothic" w:eastAsia="Malgun Gothic"/>
+                <w:b w:val="0"/>
+                <w:i w:val="0"/>
+                <w:sz w:val="20"/>
+              </w:rPr>
+              <w:t xml:space="preserve">  —  이 주 전부터</w:t>
+            </w:r>
+          </w:p>
+        </w:tc>
+      </w:tr>
+      <w:tr>
+        <w:tc>
+          <w:tcPr>
+            <w:tcW w:type="dxa" w:w="1500"/>
+            <w:tcBorders>
+              <w:top w:val="single" w:color="BFBFBF" w:sz="4"/>
+              <w:left w:val="single" w:color="BFBFBF" w:sz="4"/>
+              <w:bottom w:val="single" w:color="BFBFBF" w:sz="4"/>
+              <w:right w:val="single" w:color="BFBFBF" w:sz="4"/>
+            </w:tcBorders>
+            <w:shd w:fill="DEEAF6" w:color="auto" w:val="clear"/>
+          </w:tcPr>
+          <w:p>
+            <w:r>
+              <w:rPr>
+                <w:rFonts w:ascii="Malgun Gothic" w:hAnsi="Malgun Gothic" w:cs="Malgun Gothic" w:eastAsia="Malgun Gothic"/>
+                <w:b/>
+                <w:i w:val="0"/>
+                <w:color w:val="1F3864"/>
+                <w:sz w:val="20"/>
+              </w:rPr>
+              <w:t>문법</w:t>
+            </w:r>
+          </w:p>
+        </w:tc>
+        <w:tc>
+          <w:tcPr>
+            <w:tcW w:type="dxa" w:w="8138"/>
+            <w:tcBorders>
+              <w:top w:val="single" w:color="BFBFBF" w:sz="4"/>
+              <w:left w:val="single" w:color="BFBFBF" w:sz="4"/>
+              <w:bottom w:val="single" w:color="BFBFBF" w:sz="4"/>
+              <w:right w:val="single" w:color="BFBFBF" w:sz="4"/>
+            </w:tcBorders>
+          </w:tcPr>
+          <w:p>
+            <w:pPr>
+              <w:spacing w:after="40"/>
+            </w:pPr>
+            <w:r>
+              <w:rPr>
+                <w:rFonts w:ascii="Malgun Gothic" w:hAnsi="Malgun Gothic" w:cs="Malgun Gothic" w:eastAsia="Malgun Gothic"/>
+                <w:b w:val="0"/>
+                <w:i w:val="0"/>
+                <w:sz w:val="20"/>
+              </w:rPr>
+              <w:t>Es war schon im Radio?는 어조로 의문을 나타내는 과거형 문장입니다. und da berichten sie schon?에서 da는 그때 거기서라는 부사입니다.</w:t>
+            </w:r>
+          </w:p>
+        </w:tc>
+      </w:tr>
+      <w:tr>
+        <w:tc>
+          <w:tcPr>
+            <w:tcW w:type="dxa" w:w="1500"/>
+            <w:tcBorders>
+              <w:top w:val="single" w:color="BFBFBF" w:sz="4"/>
+              <w:left w:val="single" w:color="BFBFBF" w:sz="4"/>
+              <w:bottom w:val="single" w:color="BFBFBF" w:sz="4"/>
+              <w:right w:val="single" w:color="BFBFBF" w:sz="4"/>
+            </w:tcBorders>
+            <w:shd w:fill="DEEAF6" w:color="auto" w:val="clear"/>
+          </w:tcPr>
+          <w:p>
+            <w:r>
+              <w:rPr>
+                <w:rFonts w:ascii="Malgun Gothic" w:hAnsi="Malgun Gothic" w:cs="Malgun Gothic" w:eastAsia="Malgun Gothic"/>
+                <w:b/>
+                <w:i w:val="0"/>
+                <w:color w:val="1F3864"/>
+                <w:sz w:val="20"/>
+              </w:rPr>
+              <w:t>표현</w:t>
+            </w:r>
+          </w:p>
+        </w:tc>
+        <w:tc>
+          <w:tcPr>
+            <w:tcW w:type="dxa" w:w="8138"/>
+            <w:tcBorders>
+              <w:top w:val="single" w:color="BFBFBF" w:sz="4"/>
+              <w:left w:val="single" w:color="BFBFBF" w:sz="4"/>
+              <w:bottom w:val="single" w:color="BFBFBF" w:sz="4"/>
+              <w:right w:val="single" w:color="BFBFBF" w:sz="4"/>
+            </w:tcBorders>
+          </w:tcPr>
+          <w:p>
+            <w:pPr>
+              <w:spacing w:after="40"/>
+            </w:pPr>
+            <w:r>
+              <w:rPr>
+                <w:rFonts w:ascii="Malgun Gothic" w:hAnsi="Malgun Gothic" w:cs="Malgun Gothic" w:eastAsia="Malgun Gothic"/>
+                <w:b w:val="0"/>
+                <w:i w:val="0"/>
+                <w:sz w:val="20"/>
+              </w:rPr>
+              <w:t>seit zwei Wochen은 seit + 3격 복수입니다.</w:t>
+            </w:r>
+          </w:p>
+        </w:tc>
+      </w:tr>
+      <w:tr>
+        <w:tc>
+          <w:tcPr>
+            <w:tcW w:type="dxa" w:w="1500"/>
+            <w:tcBorders>
+              <w:top w:val="single" w:color="BFBFBF" w:sz="4"/>
+              <w:left w:val="single" w:color="BFBFBF" w:sz="4"/>
+              <w:bottom w:val="single" w:color="BFBFBF" w:sz="4"/>
+              <w:right w:val="single" w:color="BFBFBF" w:sz="4"/>
+            </w:tcBorders>
+            <w:shd w:fill="DEEAF6" w:color="auto" w:val="clear"/>
+          </w:tcPr>
+          <w:p>
+            <w:r>
+              <w:rPr>
+                <w:rFonts w:ascii="Malgun Gothic" w:hAnsi="Malgun Gothic" w:cs="Malgun Gothic" w:eastAsia="Malgun Gothic"/>
+                <w:b/>
+                <w:i w:val="0"/>
+                <w:color w:val="1F3864"/>
+                <w:sz w:val="20"/>
+              </w:rPr>
+              <w:t>시제</w:t>
+            </w:r>
+          </w:p>
+        </w:tc>
+        <w:tc>
+          <w:tcPr>
+            <w:tcW w:type="dxa" w:w="8138"/>
+            <w:tcBorders>
+              <w:top w:val="single" w:color="BFBFBF" w:sz="4"/>
+              <w:left w:val="single" w:color="BFBFBF" w:sz="4"/>
+              <w:bottom w:val="single" w:color="BFBFBF" w:sz="4"/>
+              <w:right w:val="single" w:color="BFBFBF" w:sz="4"/>
+            </w:tcBorders>
+          </w:tcPr>
+          <w:p>
+            <w:pPr>
+              <w:spacing w:after="40"/>
+            </w:pPr>
+            <w:r>
+              <w:rPr>
+                <w:rFonts w:ascii="Malgun Gothic" w:hAnsi="Malgun Gothic" w:cs="Malgun Gothic" w:eastAsia="Malgun Gothic"/>
+                <w:b w:val="0"/>
+                <w:i w:val="0"/>
+                <w:sz w:val="20"/>
+              </w:rPr>
+              <w:t>war는 과거형이고 sind, berichten은 현재형입니다.</w:t>
+            </w:r>
+          </w:p>
+        </w:tc>
+      </w:tr>
+    </w:tbl>
+    <w:p>
+      <w:pPr>
+        <w:spacing w:after="0"/>
+      </w:pPr>
+    </w:p>
+    <w:p>
+      <w:pPr>
+        <w:keepNext/>
+        <w:spacing w:before="160"/>
+      </w:pPr>
+      <w:r>
+        <w:rPr>
+          <w:rFonts w:ascii="Arial" w:hAnsi="Arial" w:cs="Arial" w:eastAsia="Malgun Gothic"/>
+          <w:b/>
+          <w:i w:val="0"/>
+          <w:sz w:val="22"/>
+        </w:rPr>
+        <w:t>55. Matthias: Lokalradio, kurzer Beitrag. Eine Journalistin namens Albrecht hat bei SchnellRad nachgefragt. Man hat ihr gesagt, es gebe keine Probleme.</w:t>
+      </w:r>
+    </w:p>
+    <w:p>
+      <w:pPr>
+        <w:keepNext/>
+        <w:ind w:left="340"/>
+      </w:pPr>
+      <w:r>
+        <w:rPr>
+          <w:rFonts w:ascii="Malgun Gothic" w:hAnsi="Malgun Gothic" w:cs="Malgun Gothic" w:eastAsia="Malgun Gothic"/>
+          <w:b w:val="0"/>
+          <w:i/>
+          <w:color w:val="404040"/>
+          <w:sz w:val="20"/>
+        </w:rPr>
+        <w:t>지역 라디오의 짧은 꼭지였습니다. 알브레히트라는 기자가 슈넬라트에 문의했는데, 문제는 없다는 답을 들었다고 합니다.</w:t>
+      </w:r>
+    </w:p>
+    <w:tbl>
+      <w:tblPr>
+        <w:tblW w:type="auto" w:w="0"/>
+        <w:tblLayout w:type="fixed"/>
+        <w:tblLook w:firstColumn="1" w:firstRow="1" w:lastColumn="0" w:lastRow="0" w:noHBand="0" w:noVBand="1" w:val="04A0"/>
+      </w:tblPr>
+      <w:tblGrid>
+        <w:gridCol w:w="4819"/>
+        <w:gridCol w:w="4819"/>
+      </w:tblGrid>
+      <w:tr>
+        <w:tc>
+          <w:tcPr>
+            <w:tcW w:type="dxa" w:w="1500"/>
+            <w:tcBorders>
+              <w:top w:val="single" w:color="BFBFBF" w:sz="4"/>
+              <w:left w:val="single" w:color="BFBFBF" w:sz="4"/>
+              <w:bottom w:val="single" w:color="BFBFBF" w:sz="4"/>
+              <w:right w:val="single" w:color="BFBFBF" w:sz="4"/>
+            </w:tcBorders>
+            <w:shd w:fill="DEEAF6" w:color="auto" w:val="clear"/>
+          </w:tcPr>
+          <w:p>
+            <w:r>
+              <w:rPr>
+                <w:rFonts w:ascii="Malgun Gothic" w:hAnsi="Malgun Gothic" w:cs="Malgun Gothic" w:eastAsia="Malgun Gothic"/>
+                <w:b/>
+                <w:i w:val="0"/>
+                <w:color w:val="1F3864"/>
+                <w:sz w:val="20"/>
+              </w:rPr>
+              <w:t>주요 단어</w:t>
+            </w:r>
+          </w:p>
+        </w:tc>
+        <w:tc>
+          <w:tcPr>
+            <w:tcW w:type="dxa" w:w="8138"/>
+            <w:tcBorders>
+              <w:top w:val="single" w:color="BFBFBF" w:sz="4"/>
+              <w:left w:val="single" w:color="BFBFBF" w:sz="4"/>
+              <w:bottom w:val="single" w:color="BFBFBF" w:sz="4"/>
+              <w:right w:val="single" w:color="BFBFBF" w:sz="4"/>
+            </w:tcBorders>
+          </w:tcPr>
+          <w:p>
+            <w:pPr>
+              <w:spacing w:after="40"/>
+            </w:pPr>
+            <w:r>
+              <w:rPr>
+                <w:rFonts w:ascii="Arial" w:hAnsi="Arial" w:cs="Arial" w:eastAsia="Malgun Gothic"/>
+                <w:b/>
+                <w:i w:val="0"/>
+                <w:sz w:val="20"/>
+              </w:rPr>
+              <w:t>die Journalistin, -nen</w:t>
+            </w:r>
+            <w:r>
+              <w:rPr>
+                <w:rFonts w:ascii="Malgun Gothic" w:hAnsi="Malgun Gothic" w:cs="Malgun Gothic" w:eastAsia="Malgun Gothic"/>
+                <w:b w:val="0"/>
+                <w:i w:val="0"/>
+                <w:sz w:val="20"/>
+              </w:rPr>
+              <w:t xml:space="preserve">  —  여성 기자</w:t>
+            </w:r>
+          </w:p>
+          <w:p>
+            <w:pPr>
+              <w:spacing w:after="40"/>
+            </w:pPr>
+            <w:r>
+              <w:rPr>
+                <w:rFonts w:ascii="Arial" w:hAnsi="Arial" w:cs="Arial" w:eastAsia="Malgun Gothic"/>
+                <w:b/>
+                <w:i w:val="0"/>
+                <w:sz w:val="20"/>
+              </w:rPr>
+              <w:t>nachfragen</w:t>
+            </w:r>
+            <w:r>
+              <w:rPr>
+                <w:rFonts w:ascii="Malgun Gothic" w:hAnsi="Malgun Gothic" w:cs="Malgun Gothic" w:eastAsia="Malgun Gothic"/>
+                <w:b w:val="0"/>
+                <w:i w:val="0"/>
+                <w:sz w:val="20"/>
+              </w:rPr>
+              <w:t xml:space="preserve">  —  문의하다</w:t>
+            </w:r>
+          </w:p>
+          <w:p>
+            <w:pPr>
+              <w:spacing w:after="40"/>
+            </w:pPr>
+            <w:r>
+              <w:rPr>
+                <w:rFonts w:ascii="Arial" w:hAnsi="Arial" w:cs="Arial" w:eastAsia="Malgun Gothic"/>
+                <w:b/>
+                <w:i w:val="0"/>
+                <w:sz w:val="20"/>
+              </w:rPr>
+              <w:t>das Problem, -e</w:t>
+            </w:r>
+            <w:r>
+              <w:rPr>
+                <w:rFonts w:ascii="Malgun Gothic" w:hAnsi="Malgun Gothic" w:cs="Malgun Gothic" w:eastAsia="Malgun Gothic"/>
+                <w:b w:val="0"/>
+                <w:i w:val="0"/>
+                <w:sz w:val="20"/>
+              </w:rPr>
+              <w:t xml:space="preserve">  —  문제</w:t>
+            </w:r>
+          </w:p>
+        </w:tc>
+      </w:tr>
+      <w:tr>
+        <w:tc>
+          <w:tcPr>
+            <w:tcW w:type="dxa" w:w="1500"/>
+            <w:tcBorders>
+              <w:top w:val="single" w:color="BFBFBF" w:sz="4"/>
+              <w:left w:val="single" w:color="BFBFBF" w:sz="4"/>
+              <w:bottom w:val="single" w:color="BFBFBF" w:sz="4"/>
+              <w:right w:val="single" w:color="BFBFBF" w:sz="4"/>
+            </w:tcBorders>
+            <w:shd w:fill="DEEAF6" w:color="auto" w:val="clear"/>
+          </w:tcPr>
+          <w:p>
+            <w:r>
+              <w:rPr>
+                <w:rFonts w:ascii="Malgun Gothic" w:hAnsi="Malgun Gothic" w:cs="Malgun Gothic" w:eastAsia="Malgun Gothic"/>
+                <w:b/>
+                <w:i w:val="0"/>
+                <w:color w:val="1F3864"/>
+                <w:sz w:val="20"/>
+              </w:rPr>
+              <w:t>문법</w:t>
+            </w:r>
+          </w:p>
+        </w:tc>
+        <w:tc>
+          <w:tcPr>
+            <w:tcW w:type="dxa" w:w="8138"/>
+            <w:tcBorders>
+              <w:top w:val="single" w:color="BFBFBF" w:sz="4"/>
+              <w:left w:val="single" w:color="BFBFBF" w:sz="4"/>
+              <w:bottom w:val="single" w:color="BFBFBF" w:sz="4"/>
+              <w:right w:val="single" w:color="BFBFBF" w:sz="4"/>
+            </w:tcBorders>
+          </w:tcPr>
+          <w:p>
+            <w:pPr>
+              <w:spacing w:after="40"/>
+            </w:pPr>
+            <w:r>
+              <w:rPr>
+                <w:rFonts w:ascii="Malgun Gothic" w:hAnsi="Malgun Gothic" w:cs="Malgun Gothic" w:eastAsia="Malgun Gothic"/>
+                <w:b w:val="0"/>
+                <w:i w:val="0"/>
+                <w:sz w:val="20"/>
+              </w:rPr>
+              <w:t>Man hat ihr gesagt, es gebe keine Probleme에서 gebe는 접속법 I로 간접화법입니다. namens는 ~라는 이름의라는 전치사입니다.</w:t>
+            </w:r>
+          </w:p>
+        </w:tc>
+      </w:tr>
+      <w:tr>
+        <w:tc>
+          <w:tcPr>
+            <w:tcW w:type="dxa" w:w="1500"/>
+            <w:tcBorders>
+              <w:top w:val="single" w:color="BFBFBF" w:sz="4"/>
+              <w:left w:val="single" w:color="BFBFBF" w:sz="4"/>
+              <w:bottom w:val="single" w:color="BFBFBF" w:sz="4"/>
+              <w:right w:val="single" w:color="BFBFBF" w:sz="4"/>
+            </w:tcBorders>
+            <w:shd w:fill="DEEAF6" w:color="auto" w:val="clear"/>
+          </w:tcPr>
+          <w:p>
+            <w:r>
+              <w:rPr>
+                <w:rFonts w:ascii="Malgun Gothic" w:hAnsi="Malgun Gothic" w:cs="Malgun Gothic" w:eastAsia="Malgun Gothic"/>
+                <w:b/>
+                <w:i w:val="0"/>
+                <w:color w:val="1F3864"/>
+                <w:sz w:val="20"/>
+              </w:rPr>
+              <w:t>표현</w:t>
+            </w:r>
+          </w:p>
+        </w:tc>
+        <w:tc>
+          <w:tcPr>
+            <w:tcW w:type="dxa" w:w="8138"/>
+            <w:tcBorders>
+              <w:top w:val="single" w:color="BFBFBF" w:sz="4"/>
+              <w:left w:val="single" w:color="BFBFBF" w:sz="4"/>
+              <w:bottom w:val="single" w:color="BFBFBF" w:sz="4"/>
+              <w:right w:val="single" w:color="BFBFBF" w:sz="4"/>
+            </w:tcBorders>
+          </w:tcPr>
+          <w:p>
+            <w:pPr>
+              <w:spacing w:after="40"/>
+            </w:pPr>
+            <w:r>
+              <w:rPr>
+                <w:rFonts w:ascii="Malgun Gothic" w:hAnsi="Malgun Gothic" w:cs="Malgun Gothic" w:eastAsia="Malgun Gothic"/>
+                <w:b w:val="0"/>
+                <w:i w:val="0"/>
+                <w:sz w:val="20"/>
+              </w:rPr>
+              <w:t>bei jemandem nachfragen은 ~에게 문의한다는 표현입니다.</w:t>
+            </w:r>
+          </w:p>
+        </w:tc>
+      </w:tr>
+      <w:tr>
+        <w:tc>
+          <w:tcPr>
+            <w:tcW w:type="dxa" w:w="1500"/>
+            <w:tcBorders>
+              <w:top w:val="single" w:color="BFBFBF" w:sz="4"/>
+              <w:left w:val="single" w:color="BFBFBF" w:sz="4"/>
+              <w:bottom w:val="single" w:color="BFBFBF" w:sz="4"/>
+              <w:right w:val="single" w:color="BFBFBF" w:sz="4"/>
+            </w:tcBorders>
+            <w:shd w:fill="DEEAF6" w:color="auto" w:val="clear"/>
+          </w:tcPr>
+          <w:p>
+            <w:r>
+              <w:rPr>
+                <w:rFonts w:ascii="Malgun Gothic" w:hAnsi="Malgun Gothic" w:cs="Malgun Gothic" w:eastAsia="Malgun Gothic"/>
+                <w:b/>
+                <w:i w:val="0"/>
+                <w:color w:val="1F3864"/>
+                <w:sz w:val="20"/>
+              </w:rPr>
+              <w:t>시제</w:t>
+            </w:r>
+          </w:p>
+        </w:tc>
+        <w:tc>
+          <w:tcPr>
+            <w:tcW w:type="dxa" w:w="8138"/>
+            <w:tcBorders>
+              <w:top w:val="single" w:color="BFBFBF" w:sz="4"/>
+              <w:left w:val="single" w:color="BFBFBF" w:sz="4"/>
+              <w:bottom w:val="single" w:color="BFBFBF" w:sz="4"/>
+              <w:right w:val="single" w:color="BFBFBF" w:sz="4"/>
+            </w:tcBorders>
+          </w:tcPr>
+          <w:p>
+            <w:pPr>
+              <w:spacing w:after="40"/>
+            </w:pPr>
+            <w:r>
+              <w:rPr>
+                <w:rFonts w:ascii="Malgun Gothic" w:hAnsi="Malgun Gothic" w:cs="Malgun Gothic" w:eastAsia="Malgun Gothic"/>
+                <w:b w:val="0"/>
+                <w:i w:val="0"/>
+                <w:sz w:val="20"/>
+              </w:rPr>
+              <w:t>hat ... nachgefragt, hat ... gesagt는 현재완료이고 gebe는 접속법 I입니다.</w:t>
+            </w:r>
+          </w:p>
+        </w:tc>
+      </w:tr>
+    </w:tbl>
+    <w:p>
+      <w:pPr>
+        <w:spacing w:after="0"/>
+      </w:pPr>
+    </w:p>
+    <w:p>
+      <w:pPr>
+        <w:keepNext/>
+        <w:spacing w:before="160"/>
+      </w:pPr>
+      <w:r>
+        <w:rPr>
+          <w:rFonts w:ascii="Arial" w:hAnsi="Arial" w:cs="Arial" w:eastAsia="Malgun Gothic"/>
+          <w:b/>
+          <w:i w:val="0"/>
+          <w:sz w:val="22"/>
+        </w:rPr>
+        <w:t>56. Hanna: Dann wird sie wiederkommen. Journalisten kommen immer wieder, wenn die erste Antwort zu glatt war.</w:t>
+      </w:r>
+    </w:p>
+    <w:p>
+      <w:pPr>
+        <w:keepNext/>
+        <w:ind w:left="340"/>
+      </w:pPr>
+      <w:r>
+        <w:rPr>
+          <w:rFonts w:ascii="Malgun Gothic" w:hAnsi="Malgun Gothic" w:cs="Malgun Gothic" w:eastAsia="Malgun Gothic"/>
+          <w:b w:val="0"/>
+          <w:i/>
+          <w:color w:val="404040"/>
+          <w:sz w:val="20"/>
+        </w:rPr>
+        <w:t>그러면 다시 올 겁니다. 첫 답변이 너무 매끄러웠다면 기자는 늘 다시 와요.</w:t>
+      </w:r>
+    </w:p>
+    <w:tbl>
+      <w:tblPr>
+        <w:tblW w:type="auto" w:w="0"/>
+        <w:tblLayout w:type="fixed"/>
+        <w:tblLook w:firstColumn="1" w:firstRow="1" w:lastColumn="0" w:lastRow="0" w:noHBand="0" w:noVBand="1" w:val="04A0"/>
+      </w:tblPr>
+      <w:tblGrid>
+        <w:gridCol w:w="4819"/>
+        <w:gridCol w:w="4819"/>
+      </w:tblGrid>
+      <w:tr>
+        <w:tc>
+          <w:tcPr>
+            <w:tcW w:type="dxa" w:w="1500"/>
+            <w:tcBorders>
+              <w:top w:val="single" w:color="BFBFBF" w:sz="4"/>
+              <w:left w:val="single" w:color="BFBFBF" w:sz="4"/>
+              <w:bottom w:val="single" w:color="BFBFBF" w:sz="4"/>
+              <w:right w:val="single" w:color="BFBFBF" w:sz="4"/>
+            </w:tcBorders>
+            <w:shd w:fill="DEEAF6" w:color="auto" w:val="clear"/>
+          </w:tcPr>
+          <w:p>
+            <w:r>
+              <w:rPr>
+                <w:rFonts w:ascii="Malgun Gothic" w:hAnsi="Malgun Gothic" w:cs="Malgun Gothic" w:eastAsia="Malgun Gothic"/>
+                <w:b/>
+                <w:i w:val="0"/>
+                <w:color w:val="1F3864"/>
+                <w:sz w:val="20"/>
+              </w:rPr>
+              <w:t>주요 단어</w:t>
+            </w:r>
+          </w:p>
+        </w:tc>
+        <w:tc>
+          <w:tcPr>
+            <w:tcW w:type="dxa" w:w="8138"/>
+            <w:tcBorders>
+              <w:top w:val="single" w:color="BFBFBF" w:sz="4"/>
+              <w:left w:val="single" w:color="BFBFBF" w:sz="4"/>
+              <w:bottom w:val="single" w:color="BFBFBF" w:sz="4"/>
+              <w:right w:val="single" w:color="BFBFBF" w:sz="4"/>
+            </w:tcBorders>
+          </w:tcPr>
+          <w:p>
+            <w:pPr>
+              <w:spacing w:after="40"/>
+            </w:pPr>
+            <w:r>
+              <w:rPr>
+                <w:rFonts w:ascii="Arial" w:hAnsi="Arial" w:cs="Arial" w:eastAsia="Malgun Gothic"/>
+                <w:b/>
+                <w:i w:val="0"/>
+                <w:sz w:val="20"/>
+              </w:rPr>
+              <w:t>glatt</w:t>
+            </w:r>
+            <w:r>
+              <w:rPr>
+                <w:rFonts w:ascii="Malgun Gothic" w:hAnsi="Malgun Gothic" w:cs="Malgun Gothic" w:eastAsia="Malgun Gothic"/>
+                <w:b w:val="0"/>
+                <w:i w:val="0"/>
+                <w:sz w:val="20"/>
+              </w:rPr>
+              <w:t xml:space="preserve">  —  매끄러운</w:t>
+            </w:r>
+          </w:p>
+          <w:p>
+            <w:pPr>
+              <w:spacing w:after="40"/>
+            </w:pPr>
+            <w:r>
+              <w:rPr>
+                <w:rFonts w:ascii="Arial" w:hAnsi="Arial" w:cs="Arial" w:eastAsia="Malgun Gothic"/>
+                <w:b/>
+                <w:i w:val="0"/>
+                <w:sz w:val="20"/>
+              </w:rPr>
+              <w:t>wiederkommen</w:t>
+            </w:r>
+            <w:r>
+              <w:rPr>
+                <w:rFonts w:ascii="Malgun Gothic" w:hAnsi="Malgun Gothic" w:cs="Malgun Gothic" w:eastAsia="Malgun Gothic"/>
+                <w:b w:val="0"/>
+                <w:i w:val="0"/>
+                <w:sz w:val="20"/>
+              </w:rPr>
+              <w:t xml:space="preserve">  —  다시 오다</w:t>
+            </w:r>
+          </w:p>
+          <w:p>
+            <w:pPr>
+              <w:spacing w:after="40"/>
+            </w:pPr>
+            <w:r>
+              <w:rPr>
+                <w:rFonts w:ascii="Arial" w:hAnsi="Arial" w:cs="Arial" w:eastAsia="Malgun Gothic"/>
+                <w:b/>
+                <w:i w:val="0"/>
+                <w:sz w:val="20"/>
+              </w:rPr>
+              <w:t>die Antwort, -en</w:t>
+            </w:r>
+            <w:r>
+              <w:rPr>
+                <w:rFonts w:ascii="Malgun Gothic" w:hAnsi="Malgun Gothic" w:cs="Malgun Gothic" w:eastAsia="Malgun Gothic"/>
+                <w:b w:val="0"/>
+                <w:i w:val="0"/>
+                <w:sz w:val="20"/>
+              </w:rPr>
+              <w:t xml:space="preserve">  —  답</w:t>
+            </w:r>
+          </w:p>
+        </w:tc>
+      </w:tr>
+      <w:tr>
+        <w:tc>
+          <w:tcPr>
+            <w:tcW w:type="dxa" w:w="1500"/>
+            <w:tcBorders>
+              <w:top w:val="single" w:color="BFBFBF" w:sz="4"/>
+              <w:left w:val="single" w:color="BFBFBF" w:sz="4"/>
+              <w:bottom w:val="single" w:color="BFBFBF" w:sz="4"/>
+              <w:right w:val="single" w:color="BFBFBF" w:sz="4"/>
+            </w:tcBorders>
+            <w:shd w:fill="DEEAF6" w:color="auto" w:val="clear"/>
+          </w:tcPr>
+          <w:p>
+            <w:r>
+              <w:rPr>
+                <w:rFonts w:ascii="Malgun Gothic" w:hAnsi="Malgun Gothic" w:cs="Malgun Gothic" w:eastAsia="Malgun Gothic"/>
+                <w:b/>
+                <w:i w:val="0"/>
+                <w:color w:val="1F3864"/>
+                <w:sz w:val="20"/>
+              </w:rPr>
+              <w:t>문법</w:t>
+            </w:r>
+          </w:p>
+        </w:tc>
+        <w:tc>
+          <w:tcPr>
+            <w:tcW w:type="dxa" w:w="8138"/>
+            <w:tcBorders>
+              <w:top w:val="single" w:color="BFBFBF" w:sz="4"/>
+              <w:left w:val="single" w:color="BFBFBF" w:sz="4"/>
+              <w:bottom w:val="single" w:color="BFBFBF" w:sz="4"/>
+              <w:right w:val="single" w:color="BFBFBF" w:sz="4"/>
+            </w:tcBorders>
+          </w:tcPr>
+          <w:p>
+            <w:pPr>
+              <w:spacing w:after="40"/>
+            </w:pPr>
+            <w:r>
+              <w:rPr>
+                <w:rFonts w:ascii="Malgun Gothic" w:hAnsi="Malgun Gothic" w:cs="Malgun Gothic" w:eastAsia="Malgun Gothic"/>
+                <w:b w:val="0"/>
+                <w:i w:val="0"/>
+                <w:sz w:val="20"/>
+              </w:rPr>
+              <w:t>Dann wird sie wiederkommen은 미래형입니다. wenn die erste Antwort zu glatt war에서 war가 끝에 옵니다.</w:t>
+            </w:r>
+          </w:p>
+        </w:tc>
+      </w:tr>
+      <w:tr>
+        <w:tc>
+          <w:tcPr>
+            <w:tcW w:type="dxa" w:w="1500"/>
+            <w:tcBorders>
+              <w:top w:val="single" w:color="BFBFBF" w:sz="4"/>
+              <w:left w:val="single" w:color="BFBFBF" w:sz="4"/>
+              <w:bottom w:val="single" w:color="BFBFBF" w:sz="4"/>
+              <w:right w:val="single" w:color="BFBFBF" w:sz="4"/>
+            </w:tcBorders>
+            <w:shd w:fill="DEEAF6" w:color="auto" w:val="clear"/>
+          </w:tcPr>
+          <w:p>
+            <w:r>
+              <w:rPr>
+                <w:rFonts w:ascii="Malgun Gothic" w:hAnsi="Malgun Gothic" w:cs="Malgun Gothic" w:eastAsia="Malgun Gothic"/>
+                <w:b/>
+                <w:i w:val="0"/>
+                <w:color w:val="1F3864"/>
+                <w:sz w:val="20"/>
+              </w:rPr>
+              <w:t>표현</w:t>
+            </w:r>
+          </w:p>
+        </w:tc>
+        <w:tc>
+          <w:tcPr>
+            <w:tcW w:type="dxa" w:w="8138"/>
+            <w:tcBorders>
+              <w:top w:val="single" w:color="BFBFBF" w:sz="4"/>
+              <w:left w:val="single" w:color="BFBFBF" w:sz="4"/>
+              <w:bottom w:val="single" w:color="BFBFBF" w:sz="4"/>
+              <w:right w:val="single" w:color="BFBFBF" w:sz="4"/>
+            </w:tcBorders>
+          </w:tcPr>
+          <w:p>
+            <w:pPr>
+              <w:spacing w:after="40"/>
+            </w:pPr>
+            <w:r>
+              <w:rPr>
+                <w:rFonts w:ascii="Malgun Gothic" w:hAnsi="Malgun Gothic" w:cs="Malgun Gothic" w:eastAsia="Malgun Gothic"/>
+                <w:b w:val="0"/>
+                <w:i w:val="0"/>
+                <w:sz w:val="20"/>
+              </w:rPr>
+              <w:t>immer wieder는 거듭이라는 부사입니다.</w:t>
+            </w:r>
+          </w:p>
+        </w:tc>
+      </w:tr>
+      <w:tr>
+        <w:tc>
+          <w:tcPr>
+            <w:tcW w:type="dxa" w:w="1500"/>
+            <w:tcBorders>
+              <w:top w:val="single" w:color="BFBFBF" w:sz="4"/>
+              <w:left w:val="single" w:color="BFBFBF" w:sz="4"/>
+              <w:bottom w:val="single" w:color="BFBFBF" w:sz="4"/>
+              <w:right w:val="single" w:color="BFBFBF" w:sz="4"/>
+            </w:tcBorders>
+            <w:shd w:fill="DEEAF6" w:color="auto" w:val="clear"/>
+          </w:tcPr>
+          <w:p>
+            <w:r>
+              <w:rPr>
+                <w:rFonts w:ascii="Malgun Gothic" w:hAnsi="Malgun Gothic" w:cs="Malgun Gothic" w:eastAsia="Malgun Gothic"/>
+                <w:b/>
+                <w:i w:val="0"/>
+                <w:color w:val="1F3864"/>
+                <w:sz w:val="20"/>
+              </w:rPr>
+              <w:t>시제</w:t>
+            </w:r>
+          </w:p>
+        </w:tc>
+        <w:tc>
+          <w:tcPr>
+            <w:tcW w:type="dxa" w:w="8138"/>
+            <w:tcBorders>
+              <w:top w:val="single" w:color="BFBFBF" w:sz="4"/>
+              <w:left w:val="single" w:color="BFBFBF" w:sz="4"/>
+              <w:bottom w:val="single" w:color="BFBFBF" w:sz="4"/>
+              <w:right w:val="single" w:color="BFBFBF" w:sz="4"/>
+            </w:tcBorders>
+          </w:tcPr>
+          <w:p>
+            <w:pPr>
+              <w:spacing w:after="40"/>
+            </w:pPr>
+            <w:r>
+              <w:rPr>
+                <w:rFonts w:ascii="Malgun Gothic" w:hAnsi="Malgun Gothic" w:cs="Malgun Gothic" w:eastAsia="Malgun Gothic"/>
+                <w:b w:val="0"/>
+                <w:i w:val="0"/>
+                <w:sz w:val="20"/>
+              </w:rPr>
+              <w:t>wird ... wiederkommen은 미래형이고 kommen은 현재형, war는 과거형입니다.</w:t>
+            </w:r>
+          </w:p>
+        </w:tc>
+      </w:tr>
+    </w:tbl>
+    <w:p>
+      <w:pPr>
+        <w:spacing w:after="0"/>
+      </w:pPr>
+    </w:p>
+    <w:p>
+      <w:pPr>
+        <w:keepNext/>
+        <w:spacing w:before="160"/>
+      </w:pPr>
+      <w:r>
+        <w:rPr>
+          <w:rFonts w:ascii="Arial" w:hAnsi="Arial" w:cs="Arial" w:eastAsia="Malgun Gothic"/>
+          <w:b/>
+          <w:i w:val="0"/>
+          <w:sz w:val="22"/>
+        </w:rPr>
+        <w:t>57. Sophie: Sollen wir ihr dann etwas sagen? Oder besser nichts, bis wir wissen, wer sie ist?</w:t>
+      </w:r>
+    </w:p>
+    <w:p>
+      <w:pPr>
+        <w:keepNext/>
+        <w:ind w:left="340"/>
+      </w:pPr>
+      <w:r>
+        <w:rPr>
+          <w:rFonts w:ascii="Malgun Gothic" w:hAnsi="Malgun Gothic" w:cs="Malgun Gothic" w:eastAsia="Malgun Gothic"/>
+          <w:b w:val="0"/>
+          <w:i/>
+          <w:color w:val="404040"/>
+          <w:sz w:val="20"/>
+        </w:rPr>
+        <w:t>그럼 그 기자에게 뭔가 말해야 할까요? 아니면 누구인지 알 때까지 아무 말도 안 하는 게 나을까요?</w:t>
+      </w:r>
+    </w:p>
+    <w:tbl>
+      <w:tblPr>
+        <w:tblW w:type="auto" w:w="0"/>
+        <w:tblLayout w:type="fixed"/>
+        <w:tblLook w:firstColumn="1" w:firstRow="1" w:lastColumn="0" w:lastRow="0" w:noHBand="0" w:noVBand="1" w:val="04A0"/>
+      </w:tblPr>
+      <w:tblGrid>
+        <w:gridCol w:w="4819"/>
+        <w:gridCol w:w="4819"/>
+      </w:tblGrid>
+      <w:tr>
+        <w:tc>
+          <w:tcPr>
+            <w:tcW w:type="dxa" w:w="1500"/>
+            <w:tcBorders>
+              <w:top w:val="single" w:color="BFBFBF" w:sz="4"/>
+              <w:left w:val="single" w:color="BFBFBF" w:sz="4"/>
+              <w:bottom w:val="single" w:color="BFBFBF" w:sz="4"/>
+              <w:right w:val="single" w:color="BFBFBF" w:sz="4"/>
+            </w:tcBorders>
+            <w:shd w:fill="DEEAF6" w:color="auto" w:val="clear"/>
+          </w:tcPr>
+          <w:p>
+            <w:r>
+              <w:rPr>
+                <w:rFonts w:ascii="Malgun Gothic" w:hAnsi="Malgun Gothic" w:cs="Malgun Gothic" w:eastAsia="Malgun Gothic"/>
+                <w:b/>
+                <w:i w:val="0"/>
+                <w:color w:val="1F3864"/>
+                <w:sz w:val="20"/>
+              </w:rPr>
+              <w:t>주요 단어</w:t>
+            </w:r>
+          </w:p>
+        </w:tc>
+        <w:tc>
+          <w:tcPr>
+            <w:tcW w:type="dxa" w:w="8138"/>
+            <w:tcBorders>
+              <w:top w:val="single" w:color="BFBFBF" w:sz="4"/>
+              <w:left w:val="single" w:color="BFBFBF" w:sz="4"/>
+              <w:bottom w:val="single" w:color="BFBFBF" w:sz="4"/>
+              <w:right w:val="single" w:color="BFBFBF" w:sz="4"/>
+            </w:tcBorders>
+          </w:tcPr>
+          <w:p>
+            <w:pPr>
+              <w:spacing w:after="40"/>
+            </w:pPr>
+            <w:r>
+              <w:rPr>
+                <w:rFonts w:ascii="Arial" w:hAnsi="Arial" w:cs="Arial" w:eastAsia="Malgun Gothic"/>
+                <w:b/>
+                <w:i w:val="0"/>
+                <w:sz w:val="20"/>
+              </w:rPr>
+              <w:t>besser</w:t>
+            </w:r>
+            <w:r>
+              <w:rPr>
+                <w:rFonts w:ascii="Malgun Gothic" w:hAnsi="Malgun Gothic" w:cs="Malgun Gothic" w:eastAsia="Malgun Gothic"/>
+                <w:b w:val="0"/>
+                <w:i w:val="0"/>
+                <w:sz w:val="20"/>
+              </w:rPr>
+              <w:t xml:space="preserve">  —  더 나은</w:t>
+            </w:r>
+          </w:p>
+          <w:p>
+            <w:pPr>
+              <w:spacing w:after="40"/>
+            </w:pPr>
+            <w:r>
+              <w:rPr>
+                <w:rFonts w:ascii="Arial" w:hAnsi="Arial" w:cs="Arial" w:eastAsia="Malgun Gothic"/>
+                <w:b/>
+                <w:i w:val="0"/>
+                <w:sz w:val="20"/>
+              </w:rPr>
+              <w:t>wissen</w:t>
+            </w:r>
+            <w:r>
+              <w:rPr>
+                <w:rFonts w:ascii="Malgun Gothic" w:hAnsi="Malgun Gothic" w:cs="Malgun Gothic" w:eastAsia="Malgun Gothic"/>
+                <w:b w:val="0"/>
+                <w:i w:val="0"/>
+                <w:sz w:val="20"/>
+              </w:rPr>
+              <w:t xml:space="preserve">  —  알다</w:t>
+            </w:r>
+          </w:p>
+          <w:p>
+            <w:pPr>
+              <w:spacing w:after="40"/>
+            </w:pPr>
+            <w:r>
+              <w:rPr>
+                <w:rFonts w:ascii="Arial" w:hAnsi="Arial" w:cs="Arial" w:eastAsia="Malgun Gothic"/>
+                <w:b/>
+                <w:i w:val="0"/>
+                <w:sz w:val="20"/>
+              </w:rPr>
+              <w:t>sagen</w:t>
+            </w:r>
+            <w:r>
+              <w:rPr>
+                <w:rFonts w:ascii="Malgun Gothic" w:hAnsi="Malgun Gothic" w:cs="Malgun Gothic" w:eastAsia="Malgun Gothic"/>
+                <w:b w:val="0"/>
+                <w:i w:val="0"/>
+                <w:sz w:val="20"/>
+              </w:rPr>
+              <w:t xml:space="preserve">  —  말하다</w:t>
+            </w:r>
+          </w:p>
+        </w:tc>
+      </w:tr>
+      <w:tr>
+        <w:tc>
+          <w:tcPr>
+            <w:tcW w:type="dxa" w:w="1500"/>
+            <w:tcBorders>
+              <w:top w:val="single" w:color="BFBFBF" w:sz="4"/>
+              <w:left w:val="single" w:color="BFBFBF" w:sz="4"/>
+              <w:bottom w:val="single" w:color="BFBFBF" w:sz="4"/>
+              <w:right w:val="single" w:color="BFBFBF" w:sz="4"/>
+            </w:tcBorders>
+            <w:shd w:fill="DEEAF6" w:color="auto" w:val="clear"/>
+          </w:tcPr>
+          <w:p>
+            <w:r>
+              <w:rPr>
+                <w:rFonts w:ascii="Malgun Gothic" w:hAnsi="Malgun Gothic" w:cs="Malgun Gothic" w:eastAsia="Malgun Gothic"/>
+                <w:b/>
+                <w:i w:val="0"/>
+                <w:color w:val="1F3864"/>
+                <w:sz w:val="20"/>
+              </w:rPr>
+              <w:t>문법</w:t>
+            </w:r>
+          </w:p>
+        </w:tc>
+        <w:tc>
+          <w:tcPr>
+            <w:tcW w:type="dxa" w:w="8138"/>
+            <w:tcBorders>
+              <w:top w:val="single" w:color="BFBFBF" w:sz="4"/>
+              <w:left w:val="single" w:color="BFBFBF" w:sz="4"/>
+              <w:bottom w:val="single" w:color="BFBFBF" w:sz="4"/>
+              <w:right w:val="single" w:color="BFBFBF" w:sz="4"/>
+            </w:tcBorders>
+          </w:tcPr>
+          <w:p>
+            <w:pPr>
+              <w:spacing w:after="40"/>
+            </w:pPr>
+            <w:r>
+              <w:rPr>
+                <w:rFonts w:ascii="Malgun Gothic" w:hAnsi="Malgun Gothic" w:cs="Malgun Gothic" w:eastAsia="Malgun Gothic"/>
+                <w:b w:val="0"/>
+                <w:i w:val="0"/>
+                <w:sz w:val="20"/>
+              </w:rPr>
+              <w:t>Sollen wir ihr ... sagen?은 의무와 의견을 묻는 의문문입니다. bis wir wissen, wer sie ist에서 두 종속절의 동사가 끝에 옵니다.</w:t>
+            </w:r>
+          </w:p>
+        </w:tc>
+      </w:tr>
+      <w:tr>
+        <w:tc>
+          <w:tcPr>
+            <w:tcW w:type="dxa" w:w="1500"/>
+            <w:tcBorders>
+              <w:top w:val="single" w:color="BFBFBF" w:sz="4"/>
+              <w:left w:val="single" w:color="BFBFBF" w:sz="4"/>
+              <w:bottom w:val="single" w:color="BFBFBF" w:sz="4"/>
+              <w:right w:val="single" w:color="BFBFBF" w:sz="4"/>
+            </w:tcBorders>
+            <w:shd w:fill="DEEAF6" w:color="auto" w:val="clear"/>
+          </w:tcPr>
+          <w:p>
+            <w:r>
+              <w:rPr>
+                <w:rFonts w:ascii="Malgun Gothic" w:hAnsi="Malgun Gothic" w:cs="Malgun Gothic" w:eastAsia="Malgun Gothic"/>
+                <w:b/>
+                <w:i w:val="0"/>
+                <w:color w:val="1F3864"/>
+                <w:sz w:val="20"/>
+              </w:rPr>
+              <w:t>표현</w:t>
+            </w:r>
+          </w:p>
+        </w:tc>
+        <w:tc>
+          <w:tcPr>
+            <w:tcW w:type="dxa" w:w="8138"/>
+            <w:tcBorders>
+              <w:top w:val="single" w:color="BFBFBF" w:sz="4"/>
+              <w:left w:val="single" w:color="BFBFBF" w:sz="4"/>
+              <w:bottom w:val="single" w:color="BFBFBF" w:sz="4"/>
+              <w:right w:val="single" w:color="BFBFBF" w:sz="4"/>
+            </w:tcBorders>
+          </w:tcPr>
+          <w:p>
+            <w:pPr>
+              <w:spacing w:after="40"/>
+            </w:pPr>
+            <w:r>
+              <w:rPr>
+                <w:rFonts w:ascii="Malgun Gothic" w:hAnsi="Malgun Gothic" w:cs="Malgun Gothic" w:eastAsia="Malgun Gothic"/>
+                <w:b w:val="0"/>
+                <w:i w:val="0"/>
+                <w:sz w:val="20"/>
+              </w:rPr>
+              <w:t>Oder besser nichts는 생략문입니다.</w:t>
+            </w:r>
+          </w:p>
+        </w:tc>
+      </w:tr>
+      <w:tr>
+        <w:tc>
+          <w:tcPr>
+            <w:tcW w:type="dxa" w:w="1500"/>
+            <w:tcBorders>
+              <w:top w:val="single" w:color="BFBFBF" w:sz="4"/>
+              <w:left w:val="single" w:color="BFBFBF" w:sz="4"/>
+              <w:bottom w:val="single" w:color="BFBFBF" w:sz="4"/>
+              <w:right w:val="single" w:color="BFBFBF" w:sz="4"/>
+            </w:tcBorders>
+            <w:shd w:fill="DEEAF6" w:color="auto" w:val="clear"/>
+          </w:tcPr>
+          <w:p>
+            <w:r>
+              <w:rPr>
+                <w:rFonts w:ascii="Malgun Gothic" w:hAnsi="Malgun Gothic" w:cs="Malgun Gothic" w:eastAsia="Malgun Gothic"/>
+                <w:b/>
+                <w:i w:val="0"/>
+                <w:color w:val="1F3864"/>
+                <w:sz w:val="20"/>
+              </w:rPr>
+              <w:t>시제</w:t>
+            </w:r>
+          </w:p>
+        </w:tc>
+        <w:tc>
+          <w:tcPr>
+            <w:tcW w:type="dxa" w:w="8138"/>
+            <w:tcBorders>
+              <w:top w:val="single" w:color="BFBFBF" w:sz="4"/>
+              <w:left w:val="single" w:color="BFBFBF" w:sz="4"/>
+              <w:bottom w:val="single" w:color="BFBFBF" w:sz="4"/>
+              <w:right w:val="single" w:color="BFBFBF" w:sz="4"/>
+            </w:tcBorders>
+          </w:tcPr>
+          <w:p>
+            <w:pPr>
+              <w:spacing w:after="40"/>
+            </w:pPr>
+            <w:r>
+              <w:rPr>
+                <w:rFonts w:ascii="Malgun Gothic" w:hAnsi="Malgun Gothic" w:cs="Malgun Gothic" w:eastAsia="Malgun Gothic"/>
+                <w:b w:val="0"/>
+                <w:i w:val="0"/>
+                <w:sz w:val="20"/>
+              </w:rPr>
+              <w:t>Sollen, wissen, ist는 현재형입니다.</w:t>
+            </w:r>
+          </w:p>
+        </w:tc>
+      </w:tr>
+    </w:tbl>
+    <w:p>
+      <w:pPr>
+        <w:spacing w:after="0"/>
+      </w:pPr>
+    </w:p>
+    <w:p>
+      <w:pPr>
+        <w:keepNext/>
+        <w:spacing w:before="160"/>
+      </w:pPr>
+      <w:r>
+        <w:rPr>
+          <w:rFonts w:ascii="Arial" w:hAnsi="Arial" w:cs="Arial" w:eastAsia="Malgun Gothic"/>
+          <w:b/>
+          <w:i w:val="0"/>
+          <w:sz w:val="22"/>
+        </w:rPr>
+        <w:t>58. Hanna: Wir sagen die Wahrheit, und zwar so, dass sie niemanden gefährdet: Wir sind eine offene Initiative und freuen uns über Interesse.</w:t>
+      </w:r>
+    </w:p>
+    <w:p>
+      <w:pPr>
+        <w:keepNext/>
+        <w:ind w:left="340"/>
+      </w:pPr>
+      <w:r>
+        <w:rPr>
+          <w:rFonts w:ascii="Malgun Gothic" w:hAnsi="Malgun Gothic" w:cs="Malgun Gothic" w:eastAsia="Malgun Gothic"/>
+          <w:b w:val="0"/>
+          <w:i/>
+          <w:color w:val="404040"/>
+          <w:sz w:val="20"/>
+        </w:rPr>
+        <w:t>사실을 말하되 누구도 위태롭게 하지 않는 방식으로 합니다. 우리는 열린 모임이고 관심을 환영한다고요.</w:t>
+      </w:r>
+    </w:p>
+    <w:tbl>
+      <w:tblPr>
+        <w:tblW w:type="auto" w:w="0"/>
+        <w:tblLayout w:type="fixed"/>
+        <w:tblLook w:firstColumn="1" w:firstRow="1" w:lastColumn="0" w:lastRow="0" w:noHBand="0" w:noVBand="1" w:val="04A0"/>
+      </w:tblPr>
+      <w:tblGrid>
+        <w:gridCol w:w="4819"/>
+        <w:gridCol w:w="4819"/>
+      </w:tblGrid>
+      <w:tr>
+        <w:tc>
+          <w:tcPr>
+            <w:tcW w:type="dxa" w:w="1500"/>
+            <w:tcBorders>
+              <w:top w:val="single" w:color="BFBFBF" w:sz="4"/>
+              <w:left w:val="single" w:color="BFBFBF" w:sz="4"/>
+              <w:bottom w:val="single" w:color="BFBFBF" w:sz="4"/>
+              <w:right w:val="single" w:color="BFBFBF" w:sz="4"/>
+            </w:tcBorders>
+            <w:shd w:fill="DEEAF6" w:color="auto" w:val="clear"/>
+          </w:tcPr>
+          <w:p>
+            <w:r>
+              <w:rPr>
+                <w:rFonts w:ascii="Malgun Gothic" w:hAnsi="Malgun Gothic" w:cs="Malgun Gothic" w:eastAsia="Malgun Gothic"/>
+                <w:b/>
+                <w:i w:val="0"/>
+                <w:color w:val="1F3864"/>
+                <w:sz w:val="20"/>
+              </w:rPr>
+              <w:t>주요 단어</w:t>
+            </w:r>
+          </w:p>
+        </w:tc>
+        <w:tc>
+          <w:tcPr>
+            <w:tcW w:type="dxa" w:w="8138"/>
+            <w:tcBorders>
+              <w:top w:val="single" w:color="BFBFBF" w:sz="4"/>
+              <w:left w:val="single" w:color="BFBFBF" w:sz="4"/>
+              <w:bottom w:val="single" w:color="BFBFBF" w:sz="4"/>
+              <w:right w:val="single" w:color="BFBFBF" w:sz="4"/>
+            </w:tcBorders>
+          </w:tcPr>
+          <w:p>
+            <w:pPr>
+              <w:spacing w:after="40"/>
+            </w:pPr>
+            <w:r>
+              <w:rPr>
+                <w:rFonts w:ascii="Arial" w:hAnsi="Arial" w:cs="Arial" w:eastAsia="Malgun Gothic"/>
+                <w:b/>
+                <w:i w:val="0"/>
+                <w:sz w:val="20"/>
+              </w:rPr>
+              <w:t>gefährden</w:t>
+            </w:r>
+            <w:r>
+              <w:rPr>
+                <w:rFonts w:ascii="Malgun Gothic" w:hAnsi="Malgun Gothic" w:cs="Malgun Gothic" w:eastAsia="Malgun Gothic"/>
+                <w:b w:val="0"/>
+                <w:i w:val="0"/>
+                <w:sz w:val="20"/>
+              </w:rPr>
+              <w:t xml:space="preserve">  —  위태롭게 하다</w:t>
+            </w:r>
+          </w:p>
+          <w:p>
+            <w:pPr>
+              <w:spacing w:after="40"/>
+            </w:pPr>
+            <w:r>
+              <w:rPr>
+                <w:rFonts w:ascii="Arial" w:hAnsi="Arial" w:cs="Arial" w:eastAsia="Malgun Gothic"/>
+                <w:b/>
+                <w:i w:val="0"/>
+                <w:sz w:val="20"/>
+              </w:rPr>
+              <w:t>sich freuen über</w:t>
+            </w:r>
+            <w:r>
+              <w:rPr>
+                <w:rFonts w:ascii="Malgun Gothic" w:hAnsi="Malgun Gothic" w:cs="Malgun Gothic" w:eastAsia="Malgun Gothic"/>
+                <w:b w:val="0"/>
+                <w:i w:val="0"/>
+                <w:sz w:val="20"/>
+              </w:rPr>
+              <w:t xml:space="preserve">  —  ~를 반기다</w:t>
+            </w:r>
+          </w:p>
+          <w:p>
+            <w:pPr>
+              <w:spacing w:after="40"/>
+            </w:pPr>
+            <w:r>
+              <w:rPr>
+                <w:rFonts w:ascii="Arial" w:hAnsi="Arial" w:cs="Arial" w:eastAsia="Malgun Gothic"/>
+                <w:b/>
+                <w:i w:val="0"/>
+                <w:sz w:val="20"/>
+              </w:rPr>
+              <w:t>das Interesse, -n</w:t>
+            </w:r>
+            <w:r>
+              <w:rPr>
+                <w:rFonts w:ascii="Malgun Gothic" w:hAnsi="Malgun Gothic" w:cs="Malgun Gothic" w:eastAsia="Malgun Gothic"/>
+                <w:b w:val="0"/>
+                <w:i w:val="0"/>
+                <w:sz w:val="20"/>
+              </w:rPr>
+              <w:t xml:space="preserve">  —  관심</w:t>
+            </w:r>
+          </w:p>
+        </w:tc>
+      </w:tr>
+      <w:tr>
+        <w:tc>
+          <w:tcPr>
+            <w:tcW w:type="dxa" w:w="1500"/>
+            <w:tcBorders>
+              <w:top w:val="single" w:color="BFBFBF" w:sz="4"/>
+              <w:left w:val="single" w:color="BFBFBF" w:sz="4"/>
+              <w:bottom w:val="single" w:color="BFBFBF" w:sz="4"/>
+              <w:right w:val="single" w:color="BFBFBF" w:sz="4"/>
+            </w:tcBorders>
+            <w:shd w:fill="DEEAF6" w:color="auto" w:val="clear"/>
+          </w:tcPr>
+          <w:p>
+            <w:r>
+              <w:rPr>
+                <w:rFonts w:ascii="Malgun Gothic" w:hAnsi="Malgun Gothic" w:cs="Malgun Gothic" w:eastAsia="Malgun Gothic"/>
+                <w:b/>
+                <w:i w:val="0"/>
+                <w:color w:val="1F3864"/>
+                <w:sz w:val="20"/>
+              </w:rPr>
+              <w:t>문법</w:t>
+            </w:r>
+          </w:p>
+        </w:tc>
+        <w:tc>
+          <w:tcPr>
+            <w:tcW w:type="dxa" w:w="8138"/>
+            <w:tcBorders>
+              <w:top w:val="single" w:color="BFBFBF" w:sz="4"/>
+              <w:left w:val="single" w:color="BFBFBF" w:sz="4"/>
+              <w:bottom w:val="single" w:color="BFBFBF" w:sz="4"/>
+              <w:right w:val="single" w:color="BFBFBF" w:sz="4"/>
+            </w:tcBorders>
+          </w:tcPr>
+          <w:p>
+            <w:pPr>
+              <w:spacing w:after="40"/>
+            </w:pPr>
+            <w:r>
+              <w:rPr>
+                <w:rFonts w:ascii="Malgun Gothic" w:hAnsi="Malgun Gothic" w:cs="Malgun Gothic" w:eastAsia="Malgun Gothic"/>
+                <w:b w:val="0"/>
+                <w:i w:val="0"/>
+                <w:sz w:val="20"/>
+              </w:rPr>
+              <w:t>so, dass sie niemanden gefährdet에서 dass절의 gefährdet가 끝에 옵니다. freuen uns über Interesse는 sich freuen über + 4격입니다.</w:t>
+            </w:r>
+          </w:p>
+        </w:tc>
+      </w:tr>
+      <w:tr>
+        <w:tc>
+          <w:tcPr>
+            <w:tcW w:type="dxa" w:w="1500"/>
+            <w:tcBorders>
+              <w:top w:val="single" w:color="BFBFBF" w:sz="4"/>
+              <w:left w:val="single" w:color="BFBFBF" w:sz="4"/>
+              <w:bottom w:val="single" w:color="BFBFBF" w:sz="4"/>
+              <w:right w:val="single" w:color="BFBFBF" w:sz="4"/>
+            </w:tcBorders>
+            <w:shd w:fill="DEEAF6" w:color="auto" w:val="clear"/>
+          </w:tcPr>
+          <w:p>
+            <w:r>
+              <w:rPr>
+                <w:rFonts w:ascii="Malgun Gothic" w:hAnsi="Malgun Gothic" w:cs="Malgun Gothic" w:eastAsia="Malgun Gothic"/>
+                <w:b/>
+                <w:i w:val="0"/>
+                <w:color w:val="1F3864"/>
+                <w:sz w:val="20"/>
+              </w:rPr>
+              <w:t>표현</w:t>
+            </w:r>
+          </w:p>
+        </w:tc>
+        <w:tc>
+          <w:tcPr>
+            <w:tcW w:type="dxa" w:w="8138"/>
+            <w:tcBorders>
+              <w:top w:val="single" w:color="BFBFBF" w:sz="4"/>
+              <w:left w:val="single" w:color="BFBFBF" w:sz="4"/>
+              <w:bottom w:val="single" w:color="BFBFBF" w:sz="4"/>
+              <w:right w:val="single" w:color="BFBFBF" w:sz="4"/>
+            </w:tcBorders>
+          </w:tcPr>
+          <w:p>
+            <w:pPr>
+              <w:spacing w:after="40"/>
+            </w:pPr>
+            <w:r>
+              <w:rPr>
+                <w:rFonts w:ascii="Malgun Gothic" w:hAnsi="Malgun Gothic" w:cs="Malgun Gothic" w:eastAsia="Malgun Gothic"/>
+                <w:b w:val="0"/>
+                <w:i w:val="0"/>
+                <w:sz w:val="20"/>
+              </w:rPr>
+              <w:t>und zwar는 더 정확히 말하면이라는 접속 표현입니다.</w:t>
+            </w:r>
+          </w:p>
+        </w:tc>
+      </w:tr>
+      <w:tr>
+        <w:tc>
+          <w:tcPr>
+            <w:tcW w:type="dxa" w:w="1500"/>
+            <w:tcBorders>
+              <w:top w:val="single" w:color="BFBFBF" w:sz="4"/>
+              <w:left w:val="single" w:color="BFBFBF" w:sz="4"/>
+              <w:bottom w:val="single" w:color="BFBFBF" w:sz="4"/>
+              <w:right w:val="single" w:color="BFBFBF" w:sz="4"/>
+            </w:tcBorders>
+            <w:shd w:fill="DEEAF6" w:color="auto" w:val="clear"/>
+          </w:tcPr>
+          <w:p>
+            <w:r>
+              <w:rPr>
+                <w:rFonts w:ascii="Malgun Gothic" w:hAnsi="Malgun Gothic" w:cs="Malgun Gothic" w:eastAsia="Malgun Gothic"/>
+                <w:b/>
+                <w:i w:val="0"/>
+                <w:color w:val="1F3864"/>
+                <w:sz w:val="20"/>
+              </w:rPr>
+              <w:t>시제</w:t>
+            </w:r>
+          </w:p>
+        </w:tc>
+        <w:tc>
+          <w:tcPr>
+            <w:tcW w:type="dxa" w:w="8138"/>
+            <w:tcBorders>
+              <w:top w:val="single" w:color="BFBFBF" w:sz="4"/>
+              <w:left w:val="single" w:color="BFBFBF" w:sz="4"/>
+              <w:bottom w:val="single" w:color="BFBFBF" w:sz="4"/>
+              <w:right w:val="single" w:color="BFBFBF" w:sz="4"/>
+            </w:tcBorders>
+          </w:tcPr>
+          <w:p>
+            <w:pPr>
+              <w:spacing w:after="40"/>
+            </w:pPr>
+            <w:r>
+              <w:rPr>
+                <w:rFonts w:ascii="Malgun Gothic" w:hAnsi="Malgun Gothic" w:cs="Malgun Gothic" w:eastAsia="Malgun Gothic"/>
+                <w:b w:val="0"/>
+                <w:i w:val="0"/>
+                <w:sz w:val="20"/>
+              </w:rPr>
+              <w:t>sagen, sind, freuen은 현재형이고 gefährdet는 현재형입니다.</w:t>
+            </w:r>
+          </w:p>
+        </w:tc>
+      </w:tr>
+    </w:tbl>
+    <w:p>
+      <w:pPr>
+        <w:spacing w:after="0"/>
+      </w:pPr>
+    </w:p>
+    <w:p>
+      <w:pPr>
+        <w:keepNext/>
+        <w:spacing w:before="160"/>
+      </w:pPr>
+      <w:r>
+        <w:rPr>
+          <w:rFonts w:ascii="Arial" w:hAnsi="Arial" w:cs="Arial" w:eastAsia="Malgun Gothic"/>
+          <w:b/>
+          <w:i w:val="0"/>
+          <w:sz w:val="22"/>
+        </w:rPr>
+        <w:t>59. Jonas: Und wir geben keine Namen heraus. Weder Dennis' noch Piotrs noch Svetlanas. Das ist unsere erste Regel.</w:t>
+      </w:r>
+    </w:p>
+    <w:p>
+      <w:pPr>
+        <w:keepNext/>
+        <w:ind w:left="340"/>
+      </w:pPr>
+      <w:r>
+        <w:rPr>
+          <w:rFonts w:ascii="Malgun Gothic" w:hAnsi="Malgun Gothic" w:cs="Malgun Gothic" w:eastAsia="Malgun Gothic"/>
+          <w:b w:val="0"/>
+          <w:i/>
+          <w:color w:val="404040"/>
+          <w:sz w:val="20"/>
+        </w:rPr>
+        <w:t>그리고 이름은 공개하지 않습니다. 데니스도 피오트르도 스베틀라나도요. 그게 우리의 첫 번째 규칙입니다.</w:t>
+      </w:r>
+    </w:p>
+    <w:tbl>
+      <w:tblPr>
+        <w:tblW w:type="auto" w:w="0"/>
+        <w:tblLayout w:type="fixed"/>
+        <w:tblLook w:firstColumn="1" w:firstRow="1" w:lastColumn="0" w:lastRow="0" w:noHBand="0" w:noVBand="1" w:val="04A0"/>
+      </w:tblPr>
+      <w:tblGrid>
+        <w:gridCol w:w="4819"/>
+        <w:gridCol w:w="4819"/>
+      </w:tblGrid>
+      <w:tr>
+        <w:tc>
+          <w:tcPr>
+            <w:tcW w:type="dxa" w:w="1500"/>
+            <w:tcBorders>
+              <w:top w:val="single" w:color="BFBFBF" w:sz="4"/>
+              <w:left w:val="single" w:color="BFBFBF" w:sz="4"/>
+              <w:bottom w:val="single" w:color="BFBFBF" w:sz="4"/>
+              <w:right w:val="single" w:color="BFBFBF" w:sz="4"/>
+            </w:tcBorders>
+            <w:shd w:fill="DEEAF6" w:color="auto" w:val="clear"/>
+          </w:tcPr>
+          <w:p>
+            <w:r>
+              <w:rPr>
+                <w:rFonts w:ascii="Malgun Gothic" w:hAnsi="Malgun Gothic" w:cs="Malgun Gothic" w:eastAsia="Malgun Gothic"/>
+                <w:b/>
+                <w:i w:val="0"/>
+                <w:color w:val="1F3864"/>
+                <w:sz w:val="20"/>
+              </w:rPr>
+              <w:t>주요 단어</w:t>
+            </w:r>
+          </w:p>
+        </w:tc>
+        <w:tc>
+          <w:tcPr>
+            <w:tcW w:type="dxa" w:w="8138"/>
+            <w:tcBorders>
+              <w:top w:val="single" w:color="BFBFBF" w:sz="4"/>
+              <w:left w:val="single" w:color="BFBFBF" w:sz="4"/>
+              <w:bottom w:val="single" w:color="BFBFBF" w:sz="4"/>
+              <w:right w:val="single" w:color="BFBFBF" w:sz="4"/>
+            </w:tcBorders>
+          </w:tcPr>
+          <w:p>
+            <w:pPr>
+              <w:spacing w:after="40"/>
+            </w:pPr>
+            <w:r>
+              <w:rPr>
+                <w:rFonts w:ascii="Arial" w:hAnsi="Arial" w:cs="Arial" w:eastAsia="Malgun Gothic"/>
+                <w:b/>
+                <w:i w:val="0"/>
+                <w:sz w:val="20"/>
+              </w:rPr>
+              <w:t>herausgeben</w:t>
+            </w:r>
+            <w:r>
+              <w:rPr>
+                <w:rFonts w:ascii="Malgun Gothic" w:hAnsi="Malgun Gothic" w:cs="Malgun Gothic" w:eastAsia="Malgun Gothic"/>
+                <w:b w:val="0"/>
+                <w:i w:val="0"/>
+                <w:sz w:val="20"/>
+              </w:rPr>
+              <w:t xml:space="preserve">  —  공개하다</w:t>
+            </w:r>
+          </w:p>
+          <w:p>
+            <w:pPr>
+              <w:spacing w:after="40"/>
+            </w:pPr>
+            <w:r>
+              <w:rPr>
+                <w:rFonts w:ascii="Arial" w:hAnsi="Arial" w:cs="Arial" w:eastAsia="Malgun Gothic"/>
+                <w:b/>
+                <w:i w:val="0"/>
+                <w:sz w:val="20"/>
+              </w:rPr>
+              <w:t>weder ... noch</w:t>
+            </w:r>
+            <w:r>
+              <w:rPr>
+                <w:rFonts w:ascii="Malgun Gothic" w:hAnsi="Malgun Gothic" w:cs="Malgun Gothic" w:eastAsia="Malgun Gothic"/>
+                <w:b w:val="0"/>
+                <w:i w:val="0"/>
+                <w:sz w:val="20"/>
+              </w:rPr>
+              <w:t xml:space="preserve">  —  ~도 ~도 아니다</w:t>
+            </w:r>
+          </w:p>
+          <w:p>
+            <w:pPr>
+              <w:spacing w:after="40"/>
+            </w:pPr>
+            <w:r>
+              <w:rPr>
+                <w:rFonts w:ascii="Arial" w:hAnsi="Arial" w:cs="Arial" w:eastAsia="Malgun Gothic"/>
+                <w:b/>
+                <w:i w:val="0"/>
+                <w:sz w:val="20"/>
+              </w:rPr>
+              <w:t>die Regel, -n</w:t>
+            </w:r>
+            <w:r>
+              <w:rPr>
+                <w:rFonts w:ascii="Malgun Gothic" w:hAnsi="Malgun Gothic" w:cs="Malgun Gothic" w:eastAsia="Malgun Gothic"/>
+                <w:b w:val="0"/>
+                <w:i w:val="0"/>
+                <w:sz w:val="20"/>
+              </w:rPr>
+              <w:t xml:space="preserve">  —  규칙</w:t>
+            </w:r>
+          </w:p>
+        </w:tc>
+      </w:tr>
+      <w:tr>
+        <w:tc>
+          <w:tcPr>
+            <w:tcW w:type="dxa" w:w="1500"/>
+            <w:tcBorders>
+              <w:top w:val="single" w:color="BFBFBF" w:sz="4"/>
+              <w:left w:val="single" w:color="BFBFBF" w:sz="4"/>
+              <w:bottom w:val="single" w:color="BFBFBF" w:sz="4"/>
+              <w:right w:val="single" w:color="BFBFBF" w:sz="4"/>
+            </w:tcBorders>
+            <w:shd w:fill="DEEAF6" w:color="auto" w:val="clear"/>
+          </w:tcPr>
+          <w:p>
+            <w:r>
+              <w:rPr>
+                <w:rFonts w:ascii="Malgun Gothic" w:hAnsi="Malgun Gothic" w:cs="Malgun Gothic" w:eastAsia="Malgun Gothic"/>
+                <w:b/>
+                <w:i w:val="0"/>
+                <w:color w:val="1F3864"/>
+                <w:sz w:val="20"/>
+              </w:rPr>
+              <w:t>문법</w:t>
+            </w:r>
+          </w:p>
+        </w:tc>
+        <w:tc>
+          <w:tcPr>
+            <w:tcW w:type="dxa" w:w="8138"/>
+            <w:tcBorders>
+              <w:top w:val="single" w:color="BFBFBF" w:sz="4"/>
+              <w:left w:val="single" w:color="BFBFBF" w:sz="4"/>
+              <w:bottom w:val="single" w:color="BFBFBF" w:sz="4"/>
+              <w:right w:val="single" w:color="BFBFBF" w:sz="4"/>
+            </w:tcBorders>
+          </w:tcPr>
+          <w:p>
+            <w:pPr>
+              <w:spacing w:after="40"/>
+            </w:pPr>
+            <w:r>
+              <w:rPr>
+                <w:rFonts w:ascii="Malgun Gothic" w:hAnsi="Malgun Gothic" w:cs="Malgun Gothic" w:eastAsia="Malgun Gothic"/>
+                <w:b w:val="0"/>
+                <w:i w:val="0"/>
+                <w:sz w:val="20"/>
+              </w:rPr>
+              <w:t>weder Dennis' noch Piotrs noch Svetlanas에서 weder ... noch는 둘 이상을 부정합니다. -s로 끝나는 이름의 소유격은 아포스트로피만 붙입니다.</w:t>
+            </w:r>
+          </w:p>
+        </w:tc>
+      </w:tr>
+      <w:tr>
+        <w:tc>
+          <w:tcPr>
+            <w:tcW w:type="dxa" w:w="1500"/>
+            <w:tcBorders>
+              <w:top w:val="single" w:color="BFBFBF" w:sz="4"/>
+              <w:left w:val="single" w:color="BFBFBF" w:sz="4"/>
+              <w:bottom w:val="single" w:color="BFBFBF" w:sz="4"/>
+              <w:right w:val="single" w:color="BFBFBF" w:sz="4"/>
+            </w:tcBorders>
+            <w:shd w:fill="DEEAF6" w:color="auto" w:val="clear"/>
+          </w:tcPr>
+          <w:p>
+            <w:r>
+              <w:rPr>
+                <w:rFonts w:ascii="Malgun Gothic" w:hAnsi="Malgun Gothic" w:cs="Malgun Gothic" w:eastAsia="Malgun Gothic"/>
+                <w:b/>
+                <w:i w:val="0"/>
+                <w:color w:val="1F3864"/>
+                <w:sz w:val="20"/>
+              </w:rPr>
+              <w:t>표현</w:t>
+            </w:r>
+          </w:p>
+        </w:tc>
+        <w:tc>
+          <w:tcPr>
+            <w:tcW w:type="dxa" w:w="8138"/>
+            <w:tcBorders>
+              <w:top w:val="single" w:color="BFBFBF" w:sz="4"/>
+              <w:left w:val="single" w:color="BFBFBF" w:sz="4"/>
+              <w:bottom w:val="single" w:color="BFBFBF" w:sz="4"/>
+              <w:right w:val="single" w:color="BFBFBF" w:sz="4"/>
+            </w:tcBorders>
+          </w:tcPr>
+          <w:p>
+            <w:pPr>
+              <w:spacing w:after="40"/>
+            </w:pPr>
+            <w:r>
+              <w:rPr>
+                <w:rFonts w:ascii="Malgun Gothic" w:hAnsi="Malgun Gothic" w:cs="Malgun Gothic" w:eastAsia="Malgun Gothic"/>
+                <w:b w:val="0"/>
+                <w:i w:val="0"/>
+                <w:sz w:val="20"/>
+              </w:rPr>
+              <w:t>keine Namen은 kein + 복수 4격입니다.</w:t>
+            </w:r>
+          </w:p>
+        </w:tc>
+      </w:tr>
+      <w:tr>
+        <w:tc>
+          <w:tcPr>
+            <w:tcW w:type="dxa" w:w="1500"/>
+            <w:tcBorders>
+              <w:top w:val="single" w:color="BFBFBF" w:sz="4"/>
+              <w:left w:val="single" w:color="BFBFBF" w:sz="4"/>
+              <w:bottom w:val="single" w:color="BFBFBF" w:sz="4"/>
+              <w:right w:val="single" w:color="BFBFBF" w:sz="4"/>
+            </w:tcBorders>
+            <w:shd w:fill="DEEAF6" w:color="auto" w:val="clear"/>
+          </w:tcPr>
+          <w:p>
+            <w:r>
+              <w:rPr>
+                <w:rFonts w:ascii="Malgun Gothic" w:hAnsi="Malgun Gothic" w:cs="Malgun Gothic" w:eastAsia="Malgun Gothic"/>
+                <w:b/>
+                <w:i w:val="0"/>
+                <w:color w:val="1F3864"/>
+                <w:sz w:val="20"/>
+              </w:rPr>
+              <w:t>시제</w:t>
+            </w:r>
+          </w:p>
+        </w:tc>
+        <w:tc>
+          <w:tcPr>
+            <w:tcW w:type="dxa" w:w="8138"/>
+            <w:tcBorders>
+              <w:top w:val="single" w:color="BFBFBF" w:sz="4"/>
+              <w:left w:val="single" w:color="BFBFBF" w:sz="4"/>
+              <w:bottom w:val="single" w:color="BFBFBF" w:sz="4"/>
+              <w:right w:val="single" w:color="BFBFBF" w:sz="4"/>
+            </w:tcBorders>
+          </w:tcPr>
+          <w:p>
+            <w:pPr>
+              <w:spacing w:after="40"/>
+            </w:pPr>
+            <w:r>
+              <w:rPr>
+                <w:rFonts w:ascii="Malgun Gothic" w:hAnsi="Malgun Gothic" w:cs="Malgun Gothic" w:eastAsia="Malgun Gothic"/>
+                <w:b w:val="0"/>
+                <w:i w:val="0"/>
+                <w:sz w:val="20"/>
+              </w:rPr>
+              <w:t>geben ... heraus, ist는 현재형입니다.</w:t>
+            </w:r>
+          </w:p>
+        </w:tc>
+      </w:tr>
+    </w:tbl>
+    <w:p>
+      <w:pPr>
+        <w:spacing w:after="0"/>
+      </w:pPr>
+    </w:p>
+    <w:p>
+      <w:pPr>
+        <w:keepNext/>
+        <w:spacing w:before="160"/>
+      </w:pPr>
+      <w:r>
+        <w:rPr>
+          <w:rFonts w:ascii="Arial" w:hAnsi="Arial" w:cs="Arial" w:eastAsia="Malgun Gothic"/>
+          <w:b/>
+          <w:i w:val="0"/>
+          <w:sz w:val="22"/>
+        </w:rPr>
+        <w:t>60. Svetlana: Meinen Namen können Sie gern nennen. Ich habe nichts zu verbergen, außer meiner Angst.</w:t>
+      </w:r>
+    </w:p>
+    <w:p>
+      <w:pPr>
+        <w:keepNext/>
+        <w:ind w:left="340"/>
+      </w:pPr>
+      <w:r>
+        <w:rPr>
+          <w:rFonts w:ascii="Malgun Gothic" w:hAnsi="Malgun Gothic" w:cs="Malgun Gothic" w:eastAsia="Malgun Gothic"/>
+          <w:b w:val="0"/>
+          <w:i/>
+          <w:color w:val="404040"/>
+          <w:sz w:val="20"/>
+        </w:rPr>
+        <w:t>제 이름은 말씀하셔도 좋아요. 숨길 건 두려움밖에 없어요.</w:t>
+      </w:r>
+    </w:p>
+    <w:tbl>
+      <w:tblPr>
+        <w:tblW w:type="auto" w:w="0"/>
+        <w:tblLayout w:type="fixed"/>
+        <w:tblLook w:firstColumn="1" w:firstRow="1" w:lastColumn="0" w:lastRow="0" w:noHBand="0" w:noVBand="1" w:val="04A0"/>
+      </w:tblPr>
+      <w:tblGrid>
+        <w:gridCol w:w="4819"/>
+        <w:gridCol w:w="4819"/>
+      </w:tblGrid>
+      <w:tr>
+        <w:tc>
+          <w:tcPr>
+            <w:tcW w:type="dxa" w:w="1500"/>
+            <w:tcBorders>
+              <w:top w:val="single" w:color="BFBFBF" w:sz="4"/>
+              <w:left w:val="single" w:color="BFBFBF" w:sz="4"/>
+              <w:bottom w:val="single" w:color="BFBFBF" w:sz="4"/>
+              <w:right w:val="single" w:color="BFBFBF" w:sz="4"/>
+            </w:tcBorders>
+            <w:shd w:fill="DEEAF6" w:color="auto" w:val="clear"/>
+          </w:tcPr>
+          <w:p>
+            <w:r>
+              <w:rPr>
+                <w:rFonts w:ascii="Malgun Gothic" w:hAnsi="Malgun Gothic" w:cs="Malgun Gothic" w:eastAsia="Malgun Gothic"/>
+                <w:b/>
+                <w:i w:val="0"/>
+                <w:color w:val="1F3864"/>
+                <w:sz w:val="20"/>
+              </w:rPr>
+              <w:t>주요 단어</w:t>
+            </w:r>
+          </w:p>
+        </w:tc>
+        <w:tc>
+          <w:tcPr>
+            <w:tcW w:type="dxa" w:w="8138"/>
+            <w:tcBorders>
+              <w:top w:val="single" w:color="BFBFBF" w:sz="4"/>
+              <w:left w:val="single" w:color="BFBFBF" w:sz="4"/>
+              <w:bottom w:val="single" w:color="BFBFBF" w:sz="4"/>
+              <w:right w:val="single" w:color="BFBFBF" w:sz="4"/>
+            </w:tcBorders>
+          </w:tcPr>
+          <w:p>
+            <w:pPr>
+              <w:spacing w:after="40"/>
+            </w:pPr>
+            <w:r>
+              <w:rPr>
+                <w:rFonts w:ascii="Arial" w:hAnsi="Arial" w:cs="Arial" w:eastAsia="Malgun Gothic"/>
+                <w:b/>
+                <w:i w:val="0"/>
+                <w:sz w:val="20"/>
+              </w:rPr>
+              <w:t>nennen</w:t>
+            </w:r>
+            <w:r>
+              <w:rPr>
+                <w:rFonts w:ascii="Malgun Gothic" w:hAnsi="Malgun Gothic" w:cs="Malgun Gothic" w:eastAsia="Malgun Gothic"/>
+                <w:b w:val="0"/>
+                <w:i w:val="0"/>
+                <w:sz w:val="20"/>
+              </w:rPr>
+              <w:t xml:space="preserve">  —  말하다</w:t>
+            </w:r>
+          </w:p>
+          <w:p>
+            <w:pPr>
+              <w:spacing w:after="40"/>
+            </w:pPr>
+            <w:r>
+              <w:rPr>
+                <w:rFonts w:ascii="Arial" w:hAnsi="Arial" w:cs="Arial" w:eastAsia="Malgun Gothic"/>
+                <w:b/>
+                <w:i w:val="0"/>
+                <w:sz w:val="20"/>
+              </w:rPr>
+              <w:t>verbergen</w:t>
+            </w:r>
+            <w:r>
+              <w:rPr>
+                <w:rFonts w:ascii="Malgun Gothic" w:hAnsi="Malgun Gothic" w:cs="Malgun Gothic" w:eastAsia="Malgun Gothic"/>
+                <w:b w:val="0"/>
+                <w:i w:val="0"/>
+                <w:sz w:val="20"/>
+              </w:rPr>
+              <w:t xml:space="preserve">  —  숨기다</w:t>
+            </w:r>
+          </w:p>
+          <w:p>
+            <w:pPr>
+              <w:spacing w:after="40"/>
+            </w:pPr>
+            <w:r>
+              <w:rPr>
+                <w:rFonts w:ascii="Arial" w:hAnsi="Arial" w:cs="Arial" w:eastAsia="Malgun Gothic"/>
+                <w:b/>
+                <w:i w:val="0"/>
+                <w:sz w:val="20"/>
+              </w:rPr>
+              <w:t>außer</w:t>
+            </w:r>
+            <w:r>
+              <w:rPr>
+                <w:rFonts w:ascii="Malgun Gothic" w:hAnsi="Malgun Gothic" w:cs="Malgun Gothic" w:eastAsia="Malgun Gothic"/>
+                <w:b w:val="0"/>
+                <w:i w:val="0"/>
+                <w:sz w:val="20"/>
+              </w:rPr>
+              <w:t xml:space="preserve">  —  ~을 제외하고</w:t>
+            </w:r>
+          </w:p>
+        </w:tc>
+      </w:tr>
+      <w:tr>
+        <w:tc>
+          <w:tcPr>
+            <w:tcW w:type="dxa" w:w="1500"/>
+            <w:tcBorders>
+              <w:top w:val="single" w:color="BFBFBF" w:sz="4"/>
+              <w:left w:val="single" w:color="BFBFBF" w:sz="4"/>
+              <w:bottom w:val="single" w:color="BFBFBF" w:sz="4"/>
+              <w:right w:val="single" w:color="BFBFBF" w:sz="4"/>
+            </w:tcBorders>
+            <w:shd w:fill="DEEAF6" w:color="auto" w:val="clear"/>
+          </w:tcPr>
+          <w:p>
+            <w:r>
+              <w:rPr>
+                <w:rFonts w:ascii="Malgun Gothic" w:hAnsi="Malgun Gothic" w:cs="Malgun Gothic" w:eastAsia="Malgun Gothic"/>
+                <w:b/>
+                <w:i w:val="0"/>
+                <w:color w:val="1F3864"/>
+                <w:sz w:val="20"/>
+              </w:rPr>
+              <w:t>문법</w:t>
+            </w:r>
+          </w:p>
+        </w:tc>
+        <w:tc>
+          <w:tcPr>
+            <w:tcW w:type="dxa" w:w="8138"/>
+            <w:tcBorders>
+              <w:top w:val="single" w:color="BFBFBF" w:sz="4"/>
+              <w:left w:val="single" w:color="BFBFBF" w:sz="4"/>
+              <w:bottom w:val="single" w:color="BFBFBF" w:sz="4"/>
+              <w:right w:val="single" w:color="BFBFBF" w:sz="4"/>
+            </w:tcBorders>
+          </w:tcPr>
+          <w:p>
+            <w:pPr>
+              <w:spacing w:after="40"/>
+            </w:pPr>
+            <w:r>
+              <w:rPr>
+                <w:rFonts w:ascii="Malgun Gothic" w:hAnsi="Malgun Gothic" w:cs="Malgun Gothic" w:eastAsia="Malgun Gothic"/>
+                <w:b w:val="0"/>
+                <w:i w:val="0"/>
+                <w:sz w:val="20"/>
+              </w:rPr>
+              <w:t>Meinen Namen können Sie gern nennen에서 목적어가 문두에 와 도치되었습니다. nichts zu verbergen은 zu 부정형 구문입니다.</w:t>
+            </w:r>
+          </w:p>
+        </w:tc>
+      </w:tr>
+      <w:tr>
+        <w:tc>
+          <w:tcPr>
+            <w:tcW w:type="dxa" w:w="1500"/>
+            <w:tcBorders>
+              <w:top w:val="single" w:color="BFBFBF" w:sz="4"/>
+              <w:left w:val="single" w:color="BFBFBF" w:sz="4"/>
+              <w:bottom w:val="single" w:color="BFBFBF" w:sz="4"/>
+              <w:right w:val="single" w:color="BFBFBF" w:sz="4"/>
+            </w:tcBorders>
+            <w:shd w:fill="DEEAF6" w:color="auto" w:val="clear"/>
+          </w:tcPr>
+          <w:p>
+            <w:r>
+              <w:rPr>
+                <w:rFonts w:ascii="Malgun Gothic" w:hAnsi="Malgun Gothic" w:cs="Malgun Gothic" w:eastAsia="Malgun Gothic"/>
+                <w:b/>
+                <w:i w:val="0"/>
+                <w:color w:val="1F3864"/>
+                <w:sz w:val="20"/>
+              </w:rPr>
+              <w:t>표현</w:t>
+            </w:r>
+          </w:p>
+        </w:tc>
+        <w:tc>
+          <w:tcPr>
+            <w:tcW w:type="dxa" w:w="8138"/>
+            <w:tcBorders>
+              <w:top w:val="single" w:color="BFBFBF" w:sz="4"/>
+              <w:left w:val="single" w:color="BFBFBF" w:sz="4"/>
+              <w:bottom w:val="single" w:color="BFBFBF" w:sz="4"/>
+              <w:right w:val="single" w:color="BFBFBF" w:sz="4"/>
+            </w:tcBorders>
+          </w:tcPr>
+          <w:p>
+            <w:pPr>
+              <w:spacing w:after="40"/>
+            </w:pPr>
+            <w:r>
+              <w:rPr>
+                <w:rFonts w:ascii="Malgun Gothic" w:hAnsi="Malgun Gothic" w:cs="Malgun Gothic" w:eastAsia="Malgun Gothic"/>
+                <w:b w:val="0"/>
+                <w:i w:val="0"/>
+                <w:sz w:val="20"/>
+              </w:rPr>
+              <w:t>außer + 3격은 ~를 제외하고입니다.</w:t>
+            </w:r>
+          </w:p>
+        </w:tc>
+      </w:tr>
+      <w:tr>
+        <w:tc>
+          <w:tcPr>
+            <w:tcW w:type="dxa" w:w="1500"/>
+            <w:tcBorders>
+              <w:top w:val="single" w:color="BFBFBF" w:sz="4"/>
+              <w:left w:val="single" w:color="BFBFBF" w:sz="4"/>
+              <w:bottom w:val="single" w:color="BFBFBF" w:sz="4"/>
+              <w:right w:val="single" w:color="BFBFBF" w:sz="4"/>
+            </w:tcBorders>
+            <w:shd w:fill="DEEAF6" w:color="auto" w:val="clear"/>
+          </w:tcPr>
+          <w:p>
+            <w:r>
+              <w:rPr>
+                <w:rFonts w:ascii="Malgun Gothic" w:hAnsi="Malgun Gothic" w:cs="Malgun Gothic" w:eastAsia="Malgun Gothic"/>
+                <w:b/>
+                <w:i w:val="0"/>
+                <w:color w:val="1F3864"/>
+                <w:sz w:val="20"/>
+              </w:rPr>
+              <w:t>시제</w:t>
+            </w:r>
+          </w:p>
+        </w:tc>
+        <w:tc>
+          <w:tcPr>
+            <w:tcW w:type="dxa" w:w="8138"/>
+            <w:tcBorders>
+              <w:top w:val="single" w:color="BFBFBF" w:sz="4"/>
+              <w:left w:val="single" w:color="BFBFBF" w:sz="4"/>
+              <w:bottom w:val="single" w:color="BFBFBF" w:sz="4"/>
+              <w:right w:val="single" w:color="BFBFBF" w:sz="4"/>
+            </w:tcBorders>
+          </w:tcPr>
+          <w:p>
+            <w:pPr>
+              <w:spacing w:after="40"/>
+            </w:pPr>
+            <w:r>
+              <w:rPr>
+                <w:rFonts w:ascii="Malgun Gothic" w:hAnsi="Malgun Gothic" w:cs="Malgun Gothic" w:eastAsia="Malgun Gothic"/>
+                <w:b w:val="0"/>
+                <w:i w:val="0"/>
+                <w:sz w:val="20"/>
+              </w:rPr>
+              <w:t>können, habe는 현재형입니다.</w:t>
+            </w:r>
+          </w:p>
+        </w:tc>
+      </w:tr>
+    </w:tbl>
+    <w:p>
+      <w:pPr>
+        <w:spacing w:after="0"/>
+      </w:pPr>
+    </w:p>
+    <w:p>
+      <w:pPr>
+        <w:keepNext/>
+        <w:spacing w:before="160"/>
+      </w:pPr>
+      <w:r>
+        <w:rPr>
+          <w:rFonts w:ascii="Arial" w:hAnsi="Arial" w:cs="Arial" w:eastAsia="Malgun Gothic"/>
+          <w:b/>
+          <w:i w:val="0"/>
+          <w:sz w:val="22"/>
+        </w:rPr>
+        <w:t>61. Hanna: Das ehrt Sie, Frau Petrova. Aber wir entscheiden das erst, wenn Ihr Arbeitgeber seine Reaktion zeigt. Mut ist gut, Voraussicht ist besser.</w:t>
+      </w:r>
+    </w:p>
+    <w:p>
+      <w:pPr>
+        <w:keepNext/>
+        <w:ind w:left="340"/>
+      </w:pPr>
+      <w:r>
+        <w:rPr>
+          <w:rFonts w:ascii="Malgun Gothic" w:hAnsi="Malgun Gothic" w:cs="Malgun Gothic" w:eastAsia="Malgun Gothic"/>
+          <w:b w:val="0"/>
+          <w:i/>
+          <w:color w:val="404040"/>
+          <w:sz w:val="20"/>
+        </w:rPr>
+        <w:t>존경스럽습니다, 페트로바 씨. 하지만 고용주가 어떻게 반응하는지 본 다음에 결정합시다. 용기는 좋지만 예측이 더 낫습니다.</w:t>
+      </w:r>
+    </w:p>
+    <w:tbl>
+      <w:tblPr>
+        <w:tblW w:type="auto" w:w="0"/>
+        <w:tblLayout w:type="fixed"/>
+        <w:tblLook w:firstColumn="1" w:firstRow="1" w:lastColumn="0" w:lastRow="0" w:noHBand="0" w:noVBand="1" w:val="04A0"/>
+      </w:tblPr>
+      <w:tblGrid>
+        <w:gridCol w:w="4819"/>
+        <w:gridCol w:w="4819"/>
+      </w:tblGrid>
+      <w:tr>
+        <w:tc>
+          <w:tcPr>
+            <w:tcW w:type="dxa" w:w="1500"/>
+            <w:tcBorders>
+              <w:top w:val="single" w:color="BFBFBF" w:sz="4"/>
+              <w:left w:val="single" w:color="BFBFBF" w:sz="4"/>
+              <w:bottom w:val="single" w:color="BFBFBF" w:sz="4"/>
+              <w:right w:val="single" w:color="BFBFBF" w:sz="4"/>
+            </w:tcBorders>
+            <w:shd w:fill="DEEAF6" w:color="auto" w:val="clear"/>
+          </w:tcPr>
+          <w:p>
+            <w:r>
+              <w:rPr>
+                <w:rFonts w:ascii="Malgun Gothic" w:hAnsi="Malgun Gothic" w:cs="Malgun Gothic" w:eastAsia="Malgun Gothic"/>
+                <w:b/>
+                <w:i w:val="0"/>
+                <w:color w:val="1F3864"/>
+                <w:sz w:val="20"/>
+              </w:rPr>
+              <w:t>주요 단어</w:t>
+            </w:r>
+          </w:p>
+        </w:tc>
+        <w:tc>
+          <w:tcPr>
+            <w:tcW w:type="dxa" w:w="8138"/>
+            <w:tcBorders>
+              <w:top w:val="single" w:color="BFBFBF" w:sz="4"/>
+              <w:left w:val="single" w:color="BFBFBF" w:sz="4"/>
+              <w:bottom w:val="single" w:color="BFBFBF" w:sz="4"/>
+              <w:right w:val="single" w:color="BFBFBF" w:sz="4"/>
+            </w:tcBorders>
+          </w:tcPr>
+          <w:p>
+            <w:pPr>
+              <w:spacing w:after="40"/>
+            </w:pPr>
+            <w:r>
+              <w:rPr>
+                <w:rFonts w:ascii="Arial" w:hAnsi="Arial" w:cs="Arial" w:eastAsia="Malgun Gothic"/>
+                <w:b/>
+                <w:i w:val="0"/>
+                <w:sz w:val="20"/>
+              </w:rPr>
+              <w:t>ehren</w:t>
+            </w:r>
+            <w:r>
+              <w:rPr>
+                <w:rFonts w:ascii="Malgun Gothic" w:hAnsi="Malgun Gothic" w:cs="Malgun Gothic" w:eastAsia="Malgun Gothic"/>
+                <w:b w:val="0"/>
+                <w:i w:val="0"/>
+                <w:sz w:val="20"/>
+              </w:rPr>
+              <w:t xml:space="preserve">  —  영예롭게 하다</w:t>
+            </w:r>
+          </w:p>
+          <w:p>
+            <w:pPr>
+              <w:spacing w:after="40"/>
+            </w:pPr>
+            <w:r>
+              <w:rPr>
+                <w:rFonts w:ascii="Arial" w:hAnsi="Arial" w:cs="Arial" w:eastAsia="Malgun Gothic"/>
+                <w:b/>
+                <w:i w:val="0"/>
+                <w:sz w:val="20"/>
+              </w:rPr>
+              <w:t>die Voraussicht (단수)</w:t>
+            </w:r>
+            <w:r>
+              <w:rPr>
+                <w:rFonts w:ascii="Malgun Gothic" w:hAnsi="Malgun Gothic" w:cs="Malgun Gothic" w:eastAsia="Malgun Gothic"/>
+                <w:b w:val="0"/>
+                <w:i w:val="0"/>
+                <w:sz w:val="20"/>
+              </w:rPr>
+              <w:t xml:space="preserve">  —  예측</w:t>
+            </w:r>
+          </w:p>
+          <w:p>
+            <w:pPr>
+              <w:spacing w:after="40"/>
+            </w:pPr>
+            <w:r>
+              <w:rPr>
+                <w:rFonts w:ascii="Arial" w:hAnsi="Arial" w:cs="Arial" w:eastAsia="Malgun Gothic"/>
+                <w:b/>
+                <w:i w:val="0"/>
+                <w:sz w:val="20"/>
+              </w:rPr>
+              <w:t>die Reaktion, -en</w:t>
+            </w:r>
+            <w:r>
+              <w:rPr>
+                <w:rFonts w:ascii="Malgun Gothic" w:hAnsi="Malgun Gothic" w:cs="Malgun Gothic" w:eastAsia="Malgun Gothic"/>
+                <w:b w:val="0"/>
+                <w:i w:val="0"/>
+                <w:sz w:val="20"/>
+              </w:rPr>
+              <w:t xml:space="preserve">  —  반응</w:t>
+            </w:r>
+          </w:p>
+        </w:tc>
+      </w:tr>
+      <w:tr>
+        <w:tc>
+          <w:tcPr>
+            <w:tcW w:type="dxa" w:w="1500"/>
+            <w:tcBorders>
+              <w:top w:val="single" w:color="BFBFBF" w:sz="4"/>
+              <w:left w:val="single" w:color="BFBFBF" w:sz="4"/>
+              <w:bottom w:val="single" w:color="BFBFBF" w:sz="4"/>
+              <w:right w:val="single" w:color="BFBFBF" w:sz="4"/>
+            </w:tcBorders>
+            <w:shd w:fill="DEEAF6" w:color="auto" w:val="clear"/>
+          </w:tcPr>
+          <w:p>
+            <w:r>
+              <w:rPr>
+                <w:rFonts w:ascii="Malgun Gothic" w:hAnsi="Malgun Gothic" w:cs="Malgun Gothic" w:eastAsia="Malgun Gothic"/>
+                <w:b/>
+                <w:i w:val="0"/>
+                <w:color w:val="1F3864"/>
+                <w:sz w:val="20"/>
+              </w:rPr>
+              <w:t>문법</w:t>
+            </w:r>
+          </w:p>
+        </w:tc>
+        <w:tc>
+          <w:tcPr>
+            <w:tcW w:type="dxa" w:w="8138"/>
+            <w:tcBorders>
+              <w:top w:val="single" w:color="BFBFBF" w:sz="4"/>
+              <w:left w:val="single" w:color="BFBFBF" w:sz="4"/>
+              <w:bottom w:val="single" w:color="BFBFBF" w:sz="4"/>
+              <w:right w:val="single" w:color="BFBFBF" w:sz="4"/>
+            </w:tcBorders>
+          </w:tcPr>
+          <w:p>
+            <w:pPr>
+              <w:spacing w:after="40"/>
+            </w:pPr>
+            <w:r>
+              <w:rPr>
+                <w:rFonts w:ascii="Malgun Gothic" w:hAnsi="Malgun Gothic" w:cs="Malgun Gothic" w:eastAsia="Malgun Gothic"/>
+                <w:b w:val="0"/>
+                <w:i w:val="0"/>
+                <w:sz w:val="20"/>
+              </w:rPr>
+              <w:t>Das ehrt Sie에서 ehren은 4격을 취합니다. wenn Ihr Arbeitgeber seine Reaktion zeigt에서 zeigt가 끝에 옵니다.</w:t>
+            </w:r>
+          </w:p>
+        </w:tc>
+      </w:tr>
+      <w:tr>
+        <w:tc>
+          <w:tcPr>
+            <w:tcW w:type="dxa" w:w="1500"/>
+            <w:tcBorders>
+              <w:top w:val="single" w:color="BFBFBF" w:sz="4"/>
+              <w:left w:val="single" w:color="BFBFBF" w:sz="4"/>
+              <w:bottom w:val="single" w:color="BFBFBF" w:sz="4"/>
+              <w:right w:val="single" w:color="BFBFBF" w:sz="4"/>
+            </w:tcBorders>
+            <w:shd w:fill="DEEAF6" w:color="auto" w:val="clear"/>
+          </w:tcPr>
+          <w:p>
+            <w:r>
+              <w:rPr>
+                <w:rFonts w:ascii="Malgun Gothic" w:hAnsi="Malgun Gothic" w:cs="Malgun Gothic" w:eastAsia="Malgun Gothic"/>
+                <w:b/>
+                <w:i w:val="0"/>
+                <w:color w:val="1F3864"/>
+                <w:sz w:val="20"/>
+              </w:rPr>
+              <w:t>표현</w:t>
+            </w:r>
+          </w:p>
+        </w:tc>
+        <w:tc>
+          <w:tcPr>
+            <w:tcW w:type="dxa" w:w="8138"/>
+            <w:tcBorders>
+              <w:top w:val="single" w:color="BFBFBF" w:sz="4"/>
+              <w:left w:val="single" w:color="BFBFBF" w:sz="4"/>
+              <w:bottom w:val="single" w:color="BFBFBF" w:sz="4"/>
+              <w:right w:val="single" w:color="BFBFBF" w:sz="4"/>
+            </w:tcBorders>
+          </w:tcPr>
+          <w:p>
+            <w:pPr>
+              <w:spacing w:after="40"/>
+            </w:pPr>
+            <w:r>
+              <w:rPr>
+                <w:rFonts w:ascii="Malgun Gothic" w:hAnsi="Malgun Gothic" w:cs="Malgun Gothic" w:eastAsia="Malgun Gothic"/>
+                <w:b w:val="0"/>
+                <w:i w:val="0"/>
+                <w:sz w:val="20"/>
+              </w:rPr>
+              <w:t>Mut ist gut, Voraussicht ist besser는 대구 구조입니다.</w:t>
+            </w:r>
+          </w:p>
+        </w:tc>
+      </w:tr>
+      <w:tr>
+        <w:tc>
+          <w:tcPr>
+            <w:tcW w:type="dxa" w:w="1500"/>
+            <w:tcBorders>
+              <w:top w:val="single" w:color="BFBFBF" w:sz="4"/>
+              <w:left w:val="single" w:color="BFBFBF" w:sz="4"/>
+              <w:bottom w:val="single" w:color="BFBFBF" w:sz="4"/>
+              <w:right w:val="single" w:color="BFBFBF" w:sz="4"/>
+            </w:tcBorders>
+            <w:shd w:fill="DEEAF6" w:color="auto" w:val="clear"/>
+          </w:tcPr>
+          <w:p>
+            <w:r>
+              <w:rPr>
+                <w:rFonts w:ascii="Malgun Gothic" w:hAnsi="Malgun Gothic" w:cs="Malgun Gothic" w:eastAsia="Malgun Gothic"/>
+                <w:b/>
+                <w:i w:val="0"/>
+                <w:color w:val="1F3864"/>
+                <w:sz w:val="20"/>
+              </w:rPr>
+              <w:t>시제</w:t>
+            </w:r>
+          </w:p>
+        </w:tc>
+        <w:tc>
+          <w:tcPr>
+            <w:tcW w:type="dxa" w:w="8138"/>
+            <w:tcBorders>
+              <w:top w:val="single" w:color="BFBFBF" w:sz="4"/>
+              <w:left w:val="single" w:color="BFBFBF" w:sz="4"/>
+              <w:bottom w:val="single" w:color="BFBFBF" w:sz="4"/>
+              <w:right w:val="single" w:color="BFBFBF" w:sz="4"/>
+            </w:tcBorders>
+          </w:tcPr>
+          <w:p>
+            <w:pPr>
+              <w:spacing w:after="40"/>
+            </w:pPr>
+            <w:r>
+              <w:rPr>
+                <w:rFonts w:ascii="Malgun Gothic" w:hAnsi="Malgun Gothic" w:cs="Malgun Gothic" w:eastAsia="Malgun Gothic"/>
+                <w:b w:val="0"/>
+                <w:i w:val="0"/>
+                <w:sz w:val="20"/>
+              </w:rPr>
+              <w:t>ehrt, entscheiden, zeigt, ist는 현재형입니다.</w:t>
+            </w:r>
+          </w:p>
+        </w:tc>
+      </w:tr>
+    </w:tbl>
+    <w:p>
+      <w:pPr>
+        <w:spacing w:after="0"/>
+      </w:pPr>
+    </w:p>
+    <w:p>
+      <w:pPr>
+        <w:keepNext/>
+        <w:spacing w:before="160"/>
+      </w:pPr>
+      <w:r>
+        <w:rPr>
+          <w:rFonts w:ascii="Arial" w:hAnsi="Arial" w:cs="Arial" w:eastAsia="Malgun Gothic"/>
+          <w:b/>
+          <w:i w:val="0"/>
+          <w:sz w:val="22"/>
+        </w:rPr>
+        <w:t>62. Jonas: Am späten Nachmittag sind die Teller leer. Fünfunddreißig Gespräche hat Hanna heute geführt.</w:t>
       </w:r>
     </w:p>
     <w:p>
@@ -14423,7 +19013,7 @@
           <w:i w:val="0"/>
           <w:sz w:val="22"/>
         </w:rPr>
-        <w:t>48. Jonas: Zwölf Akten sind angelegt worden, und der Pierogi-Teig ist restlos aufgegessen.</w:t>
+        <w:t>63. Jonas: Zwölf Akten sind angelegt worden, und der Pierogi-Teig ist restlos aufgegessen.</w:t>
       </w:r>
     </w:p>
     <w:p>
@@ -14729,7 +19319,7 @@
           <w:i w:val="0"/>
           <w:sz w:val="22"/>
         </w:rPr>
-        <w:t>49. Jonas: Wir sitzen zu acht zwischen leeren Tellern und Papierstapeln. Niemand will gehen.</w:t>
+        <w:t>64. Jonas: Wir sitzen zu acht zwischen leeren Tellern und Papierstapeln. Niemand will gehen.</w:t>
       </w:r>
     </w:p>
     <w:p>
@@ -15035,7 +19625,7 @@
           <w:i w:val="0"/>
           <w:sz w:val="22"/>
         </w:rPr>
-        <w:t>50. Hanna: Wenn ich auf die letzten Monate zurückblicke, stelle ich fest: Keiner von uns hätte allein etwas bewirken können.</w:t>
+        <w:t>65. Hanna: Wenn ich auf die letzten Monate zurückblicke, stelle ich fest: Keiner von uns hätte allein etwas bewirken können.</w:t>
       </w:r>
     </w:p>
     <w:p>
@@ -15341,7 +19931,7 @@
           <w:i w:val="0"/>
           <w:sz w:val="22"/>
         </w:rPr>
-        <w:t>51. Hanna: Es brauchte den Kurier, die Mietrechtlerin, den Hinweisgeber, die Zeugin und den Reuigen.</w:t>
+        <w:t>66. Hanna: Es brauchte den Kurier, die Mietrechtlerin, den Hinweisgeber, die Zeugin und den Reuigen.</w:t>
       </w:r>
     </w:p>
     <w:p>
@@ -15647,7 +20237,7 @@
           <w:i w:val="0"/>
           <w:sz w:val="22"/>
         </w:rPr>
-        <w:t>52. Milan: Und den Bruder, der euch alle zum ersten Mal zusammengebracht hat, obwohl er eigentlich nur Pizza liefern wollte.</w:t>
+        <w:t>67. Milan: Und den Bruder, der euch alle zum ersten Mal zusammengebracht hat, obwohl er eigentlich nur Pizza liefern wollte.</w:t>
       </w:r>
     </w:p>
     <w:p>
@@ -15953,7 +20543,7 @@
           <w:i w:val="0"/>
           <w:sz w:val="22"/>
         </w:rPr>
-        <w:t>53. Milan: Prost, Jonas. Auf den Kurier, der zu viel wissen wollte.</w:t>
+        <w:t>68. Milan: Prost, Jonas. Auf den Kurier, der zu viel wissen wollte.</w:t>
       </w:r>
     </w:p>
     <w:p>
@@ -16259,7 +20849,7 @@
           <w:i w:val="0"/>
           <w:sz w:val="22"/>
         </w:rPr>
-        <w:t>54. Jonas: Wir stoßen an, mit Kaffee und Leitungswasser, weil niemand mehr Kraft für etwas anderes hat.</w:t>
+        <w:t>69. Jonas: Wir stoßen an, mit Kaffee und Leitungswasser, weil niemand mehr Kraft für etwas anderes hat.</w:t>
       </w:r>
     </w:p>
     <w:p>
@@ -16565,7 +21155,7 @@
           <w:i w:val="0"/>
           <w:sz w:val="22"/>
         </w:rPr>
-        <w:t>55. Jonas: Aber ich habe noch nie so gut angestoßen. Ich schaue in die Gesichter um mich herum.</w:t>
+        <w:t>70. Jonas: Aber ich habe noch nie so gut angestoßen. Ich schaue in die Gesichter um mich herum.</w:t>
       </w:r>
     </w:p>
     <w:p>
@@ -16871,7 +21461,7 @@
           <w:i w:val="0"/>
           <w:sz w:val="22"/>
         </w:rPr>
-        <w:t>56. Jonas: Sophie, Milan, Elif, Hanna, Piotr, Nina, Matthias. Sieben Menschen, die es vor einem halben Jahr noch nicht in meinem Leben gab.</w:t>
+        <w:t>71. Jonas: Sophie, Milan, Elif, Hanna, Piotr, Nina, Matthias. Sieben Menschen, die es vor einem halben Jahr noch nicht in meinem Leben gab.</w:t>
       </w:r>
     </w:p>
     <w:p>
@@ -17177,7 +21767,7 @@
           <w:i w:val="0"/>
           <w:sz w:val="22"/>
         </w:rPr>
-        <w:t>57. Mama: Jonas? Ich weiß, du bist beschäftigt. Aber ich wollte nur hören, ob du gut nach Hause kommst.</w:t>
+        <w:t>72. Mama: Jonas? Ich weiß, du bist beschäftigt. Aber ich wollte nur hören, ob du gut nach Hause kommst.</w:t>
       </w:r>
     </w:p>
     <w:p>
@@ -17483,7 +22073,7 @@
           <w:i w:val="0"/>
           <w:sz w:val="22"/>
         </w:rPr>
-        <w:t>58. Jonas: Mama, ich bin noch im Raum. Aber ich rufe dich an, sobald ich zu Hause bin. Versprochen.</w:t>
+        <w:t>73. Jonas: Mama, ich bin noch im Raum. Aber ich rufe dich an, sobald ich zu Hause bin. Versprochen.</w:t>
       </w:r>
     </w:p>
     <w:p>
@@ -17789,7 +22379,7 @@
           <w:i w:val="0"/>
           <w:sz w:val="22"/>
         </w:rPr>
-        <w:t>59. Mama: Und bring beim nächsten Mal diese Hanna und diese Elif mit. Ich möchte die Frauen kennenlernen, die meinen Sohn in einen Anwalt verwandelt haben.</w:t>
+        <w:t>74. Mama: Und bring beim nächsten Mal diese Hanna und diese Elif mit. Ich möchte die Frauen kennenlernen, die meinen Sohn in einen Anwalt verwandelt haben.</w:t>
       </w:r>
     </w:p>
     <w:p>
@@ -18095,7 +22685,7 @@
           <w:i w:val="0"/>
           <w:sz w:val="22"/>
         </w:rPr>
-        <w:t>60. Jonas: Ich lache, weil Mama – aus dem Handy, das ich auf Lautsprecher gestellt habe – genau das sagt, was ich seit Wochen denke.</w:t>
+        <w:t>75. Jonas: Ich lache, weil Mama – aus dem Handy, das ich auf Lautsprecher gestellt habe – genau das sagt, was ich seit Wochen denke.</w:t>
       </w:r>
     </w:p>
     <w:p>
@@ -18401,7 +22991,7 @@
           <w:i w:val="0"/>
           <w:sz w:val="22"/>
         </w:rPr>
-        <w:t>61. Jonas: Ich bin nicht Anwalt geworden. Aber ich habe etwas anderes gefunden, das mir wichtiger ist als ein Titel.</w:t>
+        <w:t>76. Jonas: Ich bin nicht Anwalt geworden. Aber ich habe etwas anderes gefunden, das mir wichtiger ist als ein Titel.</w:t>
       </w:r>
     </w:p>
     <w:p>
@@ -18707,7 +23297,7 @@
           <w:i w:val="0"/>
           <w:sz w:val="22"/>
         </w:rPr>
-        <w:t>62. Jonas: Gegen sechs verlassen wir den Raum. Elif schließt ab, Milan dreht das Schild um: „Nächste Sprechstunde: kommenden Samstag".</w:t>
+        <w:t>77. Jonas: Gegen sechs verlassen wir den Raum. Elif schließt ab, Milan dreht das Schild um: „Nächste Sprechstunde: kommenden Samstag".</w:t>
       </w:r>
     </w:p>
     <w:p>
@@ -19013,7 +23603,7 @@
           <w:i w:val="0"/>
           <w:sz w:val="22"/>
         </w:rPr>
-        <w:t>63. Jonas: Draußen hat es aufgehört zu schneien. Die Stadt glitzert.</w:t>
+        <w:t>78. Jonas: Draußen hat es aufgehört zu schneien. Die Stadt glitzert.</w:t>
       </w:r>
     </w:p>
     <w:p>
@@ -19319,7 +23909,7 @@
           <w:i w:val="0"/>
           <w:sz w:val="22"/>
         </w:rPr>
-        <w:t>64. Jonas: Ich schiebe mein Rad die Straße hinauf. Hinter mir geht das Licht im Fenster an.</w:t>
+        <w:t>79. Jonas: Ich schiebe mein Rad die Straße hinauf. Hinter mir geht das Licht im Fenster an.</w:t>
       </w:r>
     </w:p>
     <w:p>
@@ -19625,7 +24215,7 @@
           <w:i w:val="0"/>
           <w:sz w:val="22"/>
         </w:rPr>
-        <w:t>65. Jonas: Dort drüben stellt jemand schon die Stühle für die nächste Woche zurecht. Die Arbeit hört nicht auf, sie wechselt nur die Hände.</w:t>
+        <w:t>80. Jonas: Dort drüben stellt jemand schon die Stühle für die nächste Woche zurecht. Die Arbeit hört nicht auf, sie wechselt nur die Hände.</w:t>
       </w:r>
     </w:p>
     <w:p>
@@ -19931,7 +24521,7 @@
           <w:i w:val="0"/>
           <w:sz w:val="22"/>
         </w:rPr>
-        <w:t>66. Jonas: Ein Fahrrad durch Berlin. Am Anfang war es nur ein Weg von A nach B.</w:t>
+        <w:t>81. Jonas: Ein Fahrrad durch Berlin. Am Anfang war es nur ein Weg von A nach B.</w:t>
       </w:r>
     </w:p>
     <w:p>
@@ -20237,7 +24827,7 @@
           <w:i w:val="0"/>
           <w:sz w:val="22"/>
         </w:rPr>
-        <w:t>67. Jonas: Jetzt ist es ein Weg zu den Menschen, die ihn mit mir gehen.</w:t>
+        <w:t>82. Jonas: Jetzt ist es ein Weg zu den Menschen, die ihn mit mir gehen.</w:t>
       </w:r>
     </w:p>
     <w:p>
@@ -20543,7 +25133,7 @@
           <w:i w:val="0"/>
           <w:sz w:val="22"/>
         </w:rPr>
-        <w:t>68. Jonas: Ich steige auf, trete in die Pedale, und die Stadt macht mir Platz.</w:t>
+        <w:t>83. Jonas: Ich steige auf, trete in die Pedale, und die Stadt macht mir Platz.</w:t>
       </w:r>
     </w:p>
     <w:p>

</xml_diff>